<commit_message>
Finalizing diploma and presentation. ToDo write new presentation script
</commit_message>
<xml_diff>
--- a/Shemyakin_AVb-21-12.docx
+++ b/Shemyakin_AVb-21-12.docx
@@ -2210,7 +2210,14 @@
           <w:color w:val="000000"/>
           <w:sz w:val="24"/>
         </w:rPr>
-        <w:t>Схема взаимодействия с эмбоссером</w:t>
+        <w:t xml:space="preserve">Схема взаимодействия с </w:t>
+      </w:r>
+      <w:r>
+        <w:rPr>
+          <w:color w:val="000000"/>
+          <w:sz w:val="24"/>
+        </w:rPr>
+        <w:t>модулем</w:t>
       </w:r>
     </w:p>
     <w:p>
@@ -2258,7 +2265,14 @@
           <w:color w:val="000000"/>
           <w:sz w:val="24"/>
         </w:rPr>
-        <w:t>Проектное решение взаимодействия с ридерами</w:t>
+        <w:t xml:space="preserve">Проектное решение </w:t>
+      </w:r>
+      <w:r>
+        <w:rPr>
+          <w:color w:val="000000"/>
+          <w:sz w:val="24"/>
+        </w:rPr>
+        <w:t>драйвера</w:t>
       </w:r>
     </w:p>
     <w:p>
@@ -2282,7 +2296,45 @@
           <w:color w:val="000000"/>
           <w:sz w:val="24"/>
         </w:rPr>
-        <w:t>Полученные результаты</w:t>
+        <w:t>Полученны</w:t>
+      </w:r>
+      <w:r>
+        <w:rPr>
+          <w:color w:val="000000"/>
+          <w:sz w:val="24"/>
+        </w:rPr>
+        <w:t>й</w:t>
+      </w:r>
+      <w:r>
+        <w:rPr>
+          <w:color w:val="000000"/>
+          <w:sz w:val="24"/>
+        </w:rPr>
+        <w:t xml:space="preserve"> результат</w:t>
+      </w:r>
+    </w:p>
+    <w:p>
+      <w:pPr>
+        <w:numPr>
+          <w:ilvl w:val="0"/>
+          <w:numId w:val="34"/>
+        </w:numPr>
+        <w:shd w:val="clear" w:color="auto" w:fill="FFFFFF"/>
+        <w:spacing w:line="240" w:lineRule="auto"/>
+        <w:ind w:left="0" w:firstLine="709"/>
+        <w:jc w:val="left"/>
+        <w:rPr>
+          <w:color w:val="000000"/>
+          <w:sz w:val="23"/>
+          <w:szCs w:val="23"/>
+        </w:rPr>
+      </w:pPr>
+      <w:r>
+        <w:rPr>
+          <w:color w:val="000000"/>
+          <w:sz w:val="24"/>
+        </w:rPr>
+        <w:t>Преимущества программного решения</w:t>
       </w:r>
     </w:p>
     <w:p>
@@ -3049,7 +3101,7 @@
           <w:szCs w:val="28"/>
         </w:rPr>
         <w:tab/>
-        <w:t xml:space="preserve">__________________  /А.Н. Калитаев/ </w:t>
+        <w:t xml:space="preserve">_________________  /А.Н. Калитаев/ </w:t>
       </w:r>
     </w:p>
     <w:p>
@@ -6907,7 +6959,13 @@
     </w:p>
     <w:p>
       <w:r>
-        <w:t>Современный финансовый сектор, характеризующийся динамичным развитием и непрерывной гонкой за лидерство, требует от банков постоянного совершенствования операционной деятельности и оптимизации бизнес-процессов. В условиях жесткой конкуренции, где качество обслуживания и скорость предоставления услуг становятся ключевыми факторами успеха, банки стремятся минимизировать издержки, повысить производительность и, что самое главное, удовлетворить растущие потребности клиентов. Одним из важнейших элементов в цепочке оказания банковских услуг является процесс выпуска пластиковых карт, который включает в себя множество этапов, от разработки дизайна до персонализации и выдачи готового продукта клиенту.</w:t>
+        <w:t>Современный финансовый сектор, характеризующийся динамичным развитием и непрерывной гонкой за лидерство, требует от банков постоянного совершенствования операционной деятельности и оптимизации бизнес-процессов. В условиях жесткой конкуренции, где качество обслуживания и скорость предоставления услуг становятся ключевыми факторами успеха, банки стремятся минимизировать издержки, повысить производительность и, что самое главное, удовлетворить растущие потребности клиентов. Одним из важнейших элементов в цепочке оказания банковских услуг является процесс выпуска пластиковых карт, который включает в себя множество этапов, от разработки дизайна до персонализации и выдачи готового продукта клиенту</w:t>
+      </w:r>
+      <w:r>
+        <w:t xml:space="preserve"> [9]</w:t>
+      </w:r>
+      <w:r>
+        <w:t>.</w:t>
       </w:r>
     </w:p>
     <w:p>
@@ -6917,11 +6975,8 @@
     </w:p>
     <w:p>
       <w:r>
-        <w:t xml:space="preserve">Однако, на практике, работа эмбоссеров не всегда соответствует требуемым стандартам эффективности. Низкая производительность, частые </w:t>
-      </w:r>
-      <w:r>
         <w:lastRenderedPageBreak/>
-        <w:t>сбои в работе, необходимость проведения регулярного технического обслуживания и замены расходных материалов являются серьезными препятствиями, препятствующими эффективному процессу персонализации. Кроме того, недостаточное внимание к технологическим аспектам работы эмбоссеров, а также устаревшие методы их эксплуатации могут приводить к увеличению времени обработки карт, повышению затрат и снижению качества готовой продукции. Учитывая все вышесказанное, исследование путей повышения эффективности работы эмбоссеров для банковских карт является актуальной и практически значимой задачей, решение которой позволит банкам оптимизировать свои операционные процессы, повысить качество предоставляемых услуг и укрепить свои позиции на рынке.</w:t>
+        <w:t>Однако, на практике, работа эмбоссеров не всегда соответствует требуемым стандартам эффективности. Низкая производительность, частые сбои в работе, необходимость проведения регулярного технического обслуживания и замены расходных материалов являются серьезными препятствиями, препятствующими эффективному процессу персонализации. Кроме того, недостаточное внимание к технологическим аспектам работы эмбоссеров, а также устаревшие методы их эксплуатации могут приводить к увеличению времени обработки карт, повышению затрат и снижению качества готовой продукции. Учитывая все вышесказанное, исследование путей повышения эффективности работы эмбоссеров для банковских карт является актуальной и практически значимой задачей, решение которой позволит банкам оптимизировать свои операционные процессы, повысить качество предоставляемых услуг и укрепить свои позиции на рынке.</w:t>
       </w:r>
     </w:p>
     <w:p>
@@ -7065,6 +7120,7 @@
         <w:rPr>
           <w:lang w:val="en-US"/>
         </w:rPr>
+        <w:lastRenderedPageBreak/>
         <w:t>CardFactory</w:t>
       </w:r>
       <w:proofErr w:type="spellEnd"/>
@@ -7118,7 +7174,6 @@
         <w:ind w:left="567"/>
       </w:pPr>
       <w:r>
-        <w:lastRenderedPageBreak/>
         <w:t xml:space="preserve">Выявить структуру кардридерного модуля эмбоссера </w:t>
       </w:r>
       <w:r>
@@ -7746,7 +7801,13 @@
         <w:t xml:space="preserve"> В то же время, в эпоху компьютеризации, ближе к середине 1980-х годов, был разработан автоматический эмбоссер, который производил полноценную персонализацию карты, от эмбоссирования до записи информации на магнитную ленту. </w:t>
       </w:r>
       <w:r>
-        <w:t>Данная разработка была вызвана большим расширением карточной клиентуры, так как американские банки расширялись в европе, китае и японии, где их кредитные карты стали очень популярными среди населения. Такой эмбоссер позже модифицировался после выпуска карт со встроенным чипом, а также под влиянием разработок в области техники и компьютеризации.</w:t>
+        <w:t>Данная разработка была вызвана большим расширением карточной клиентуры, так как американские банки расширялись в европе, китае и японии, где их кредитные карты стали очень популярными среди населения. Такой эмбоссер позже модифицировался после выпуска карт со встроенным чипом, а также под влиянием разработок в области техники и компьютеризации</w:t>
+      </w:r>
+      <w:r>
+        <w:t xml:space="preserve"> [1]</w:t>
+      </w:r>
+      <w:r>
+        <w:t>.</w:t>
       </w:r>
     </w:p>
     <w:p>
@@ -7929,7 +7990,7 @@
     </w:p>
     <w:p>
       <w:r>
-        <w:t>Предоставленный для разработки и тестирования кардридерный модуль представляет из себя электронную плату на микроконтроллерной основе с подключенными к ней необходимыми периферийными устройствами. Всего в модуль входит три основных компонента: блок питания, управляющая плата и кардридеры. Все компоненты соединены между собой необходимыми кабелями и проводами</w:t>
+        <w:t>Предоставленный для разработки и тестирования кардридерный модуль представляет из себя электронную плату на микроконтроллерной основе с подключенными к ней необходимыми периферийными устройствами. Всего в модуль входит три основных компонента: блок питания, управляющая плата и кардридеры. Все компоненты соединены между собой кабелями и проводами</w:t>
       </w:r>
       <w:r>
         <w:t>. Блок питания подключается к управляющей плате тремя проводами для питания, а кардридеры подключены к управляющей плате через специальную дополнительную плату, которая устанавливается поверх управляющей платы, с несколькими коннекторами, к которым собственно и подключаются ридеры.</w:t>
@@ -8131,16 +8192,22 @@
         <w:t>В</w:t>
       </w:r>
       <w:r>
-        <w:t xml:space="preserve"> первом</w:t>
-      </w:r>
-      <w:r>
-        <w:t xml:space="preserve"> </w:t>
+        <w:t xml:space="preserve"> </w:t>
+      </w:r>
+      <w:r>
+        <w:t>предыдущем</w:t>
+      </w:r>
+      <w:r>
+        <w:t xml:space="preserve"> </w:t>
+      </w:r>
+      <w:r>
+        <w:t>под</w:t>
       </w:r>
       <w:r>
         <w:t xml:space="preserve">разделе </w:t>
       </w:r>
       <w:r>
-        <w:t xml:space="preserve">данной главы были рассмотрены все теоретические основы работы с эмбоссерами и в частности эмбоссером </w:t>
+        <w:t xml:space="preserve">были рассмотрены все теоретические основы работы с эмбоссерами и в частности эмбоссером </w:t>
       </w:r>
       <w:r>
         <w:rPr>
@@ -8155,11 +8222,17 @@
         <w:t xml:space="preserve">и </w:t>
       </w:r>
       <w:r>
-        <w:t xml:space="preserve">его кардридерным модулем, которые необходимы для понимания контекста работы. В данном же разделе будут рассмотрены элементы, находящиеся по другую сторону процесса эмбоссирования, а именно все программное обеспечение, необходимое для управления эмбоссером и осуществления персонализации пластиковых банковских карт. Так как в процессе </w:t>
+        <w:t xml:space="preserve">его кардридерным модулем, которые необходимы для понимания контекста работы. В данном же </w:t>
+      </w:r>
+      <w:r>
+        <w:t>под</w:t>
+      </w:r>
+      <w:r>
+        <w:t xml:space="preserve">разделе будут рассмотрены элементы, находящиеся по другую сторону процесса эмбоссирования, а именно все программное обеспечение, необходимое для управления эмбоссером и осуществления персонализации пластиковых банковских карт. Так как в процессе персонализации с </w:t>
       </w:r>
       <w:r>
         <w:lastRenderedPageBreak/>
-        <w:t xml:space="preserve">персонализации с использованием эмбоссеров </w:t>
+        <w:t xml:space="preserve">использованием эмбоссеров </w:t>
       </w:r>
       <w:r>
         <w:rPr>
@@ -8250,7 +8323,19 @@
         <w:t xml:space="preserve"> </w:t>
       </w:r>
       <w:r>
-        <w:t xml:space="preserve">будет рассмотрен подробнее в следующем подразделе. В данном же разделе будет подробно рассмотрена структура платформы </w:t>
+        <w:t xml:space="preserve">будет рассмотрен подробнее в следующем </w:t>
+      </w:r>
+      <w:r>
+        <w:t>пункте</w:t>
+      </w:r>
+      <w:r>
+        <w:t xml:space="preserve">. В данном же </w:t>
+      </w:r>
+      <w:r>
+        <w:t>пункте</w:t>
+      </w:r>
+      <w:r>
+        <w:t xml:space="preserve"> будет подробно рассмотрена структура платформы </w:t>
       </w:r>
       <w:proofErr w:type="spellStart"/>
       <w:r>
@@ -8335,7 +8420,7 @@
         <w:t xml:space="preserve">Рассмотрим подробнее </w:t>
       </w:r>
       <w:r>
-        <w:t xml:space="preserve">причины возникновения  такой платформы как </w:t>
+        <w:t xml:space="preserve">причины возникновения такой платформы как </w:t>
       </w:r>
       <w:proofErr w:type="spellStart"/>
       <w:r>
@@ -8379,7 +8464,13 @@
         <w:t xml:space="preserve"> </w:t>
       </w:r>
       <w:r>
-        <w:t>Это можно объяснить несколькими причинами. Технология, меняющая что-то кардинально, требует отбрасывания существующих программных компонентов, созданных по другим технологиям. Поэтому она обязана предложить весь спектр инструментальных средств, либо как запасной вариант, предоставить инструменты поддержки других технологий, и то и другое требует больших усилий. С другой стороны ОО языки программирования создавались с учетом универсальности объектов и полного контроля над ними со стороны пользовательской программы. Даже если технология предполагает наличие некой виртуальной машины, назвать ее объектной можно только с большой натяжкой, на откуп ей в лучшем случае отдается сборка мусора. Тогда как наибольшие преимущества объектной машины сказываются при максимальном ее контроле над объектами. Попытки заменить текстовое представление алгоритма, в большинстве случаев, сводятся к генерации текста части программы на основе ее графического представления с последующей трансляцией, интересным же является полное исключение теста программы. Избавиться от перечисленных недостатков можно, отказавшись от архитектуры машины с потоком команд и линейной памятью, и перейдя к архитектуре с древовидной объектной памятью, с управлением объектами собственно объектной машиной.</w:t>
+        <w:t>Это можно объяснить несколькими причинами. Технология, меняющая что-то кардинально, требует отбрасывания существующих программных компонентов, созданных по другим технологиям. Поэтому она обязана предложить весь спектр инструментальных средств, либо как запасной вариант, предоставить инструменты поддержки других технологий, и то и другое требует больших усилий. С другой стороны ОО языки программирования создавались с учетом универсальности объектов и полного контроля над ними со стороны пользовательской программы. Даже если технология предполагает наличие некой виртуальной машины, назвать ее объектной можно только с большой натяжкой, на откуп ей в лучшем случае отдается сборка мусора. Тогда как наибольшие преимущества объектной машины сказываются при максимальном ее контроле над объектами. Попытки заменить текстовое представление алгоритма, в большинстве случаев, сводятся к генерации текста части программы на основе ее графического представления с последующей трансляцией, интересным же является полное исключение теста программы. Избавиться от перечисленных недостатков можно, отказавшись от архитектуры машины с потоком команд и линейной памятью, и перейдя к архитектуре с древовидной объектной памятью, с управлением объектами собственно объектной машиной</w:t>
+      </w:r>
+      <w:r>
+        <w:t xml:space="preserve"> [2,3]</w:t>
+      </w:r>
+      <w:r>
+        <w:t>.</w:t>
       </w:r>
     </w:p>
     <w:p>
@@ -9047,7 +9138,13 @@
         <w:t xml:space="preserve">процесс обработки банковских карт. </w:t>
       </w:r>
       <w:r>
-        <w:t xml:space="preserve">В данном подразделе будет рассмотрена общая структура программного комплекса </w:t>
+        <w:t xml:space="preserve">В данном </w:t>
+      </w:r>
+      <w:r>
+        <w:t>пункте</w:t>
+      </w:r>
+      <w:r>
+        <w:t xml:space="preserve"> будет рассмотрена общая структура программного комплекса </w:t>
       </w:r>
       <w:proofErr w:type="spellStart"/>
       <w:r>
@@ -9058,14 +9155,14 @@
       </w:r>
       <w:proofErr w:type="spellEnd"/>
       <w:r>
-        <w:t xml:space="preserve">, а также методы осуществления настройки и обработки банковских карт его средствами. Кроме того будут вкратце описаны основные </w:t>
+        <w:t>, а также методы осуществления настройки и обработки банковских карт его средствами. Кроме того будут вкратце описаны основные этапы обработки</w:t>
+      </w:r>
+      <w:r>
+        <w:t xml:space="preserve"> </w:t>
       </w:r>
       <w:r>
         <w:lastRenderedPageBreak/>
-        <w:t>этапы обработки</w:t>
-      </w:r>
-      <w:r>
-        <w:t xml:space="preserve"> карты</w:t>
+        <w:t>карты</w:t>
       </w:r>
       <w:r>
         <w:t>, с заострением внимания на том этапе, во время которого необходимо выполнять взаимодействие с кардридерным модулем эмбоссера.</w:t>
@@ -9190,34 +9287,37 @@
         <w:t xml:space="preserve"> не будем. </w:t>
       </w:r>
       <w:r>
+        <w:t xml:space="preserve">Всего таких модулей </w:t>
+      </w:r>
+      <w:r>
+        <w:t xml:space="preserve">внутри </w:t>
+      </w:r>
+      <w:proofErr w:type="spellStart"/>
+      <w:r>
+        <w:rPr>
+          <w:lang w:val="en-US"/>
+        </w:rPr>
+        <w:t>CardFactory</w:t>
+      </w:r>
+      <w:proofErr w:type="spellEnd"/>
+      <w:r>
+        <w:t xml:space="preserve"> </w:t>
+      </w:r>
+      <w:r>
+        <w:t xml:space="preserve">имеется </w:t>
+      </w:r>
+      <w:r>
+        <w:t>24</w:t>
+      </w:r>
+      <w:r>
+        <w:t>, из них для пол</w:t>
+      </w:r>
+      <w:r>
+        <w:t xml:space="preserve">ноценной </w:t>
+      </w:r>
+      <w:r>
         <w:lastRenderedPageBreak/>
-        <w:t xml:space="preserve">Всего таких модулей </w:t>
-      </w:r>
-      <w:r>
-        <w:t xml:space="preserve">внутри </w:t>
-      </w:r>
-      <w:proofErr w:type="spellStart"/>
-      <w:r>
-        <w:rPr>
-          <w:lang w:val="en-US"/>
-        </w:rPr>
-        <w:t>CardFactory</w:t>
-      </w:r>
-      <w:proofErr w:type="spellEnd"/>
-      <w:r>
-        <w:t xml:space="preserve"> </w:t>
-      </w:r>
-      <w:r>
-        <w:t xml:space="preserve">имеется </w:t>
-      </w:r>
-      <w:r>
-        <w:t>24</w:t>
-      </w:r>
-      <w:r>
-        <w:t>, из них для пол</w:t>
-      </w:r>
-      <w:r>
-        <w:t xml:space="preserve">ноценной обработки карты с помощью эмбоссера </w:t>
+        <w:t xml:space="preserve">обработки карты с помощью эмбоссера </w:t>
       </w:r>
       <w:r>
         <w:rPr>
@@ -9785,20 +9885,20 @@
         <w:t xml:space="preserve">. </w:t>
       </w:r>
       <w:r>
-        <w:t xml:space="preserve">Обычно она подгружает все основные компоненты, возможно доподгружает настройки и выполняет необходимые </w:t>
+        <w:t xml:space="preserve">Обычно она подгружает все основные компоненты, возможно доподгружает настройки и выполняет необходимые действия модуля. После завершения функции </w:t>
+      </w:r>
+      <w:r>
+        <w:rPr>
+          <w:lang w:val="en-US"/>
+        </w:rPr>
+        <w:t>Start</w:t>
+      </w:r>
+      <w:r>
+        <w:t xml:space="preserve">, вызывающим </w:t>
       </w:r>
       <w:r>
         <w:lastRenderedPageBreak/>
-        <w:t xml:space="preserve">действия модуля. После завершения функции </w:t>
-      </w:r>
-      <w:r>
-        <w:rPr>
-          <w:lang w:val="en-US"/>
-        </w:rPr>
-        <w:t>Start</w:t>
-      </w:r>
-      <w:r>
-        <w:t xml:space="preserve">, вызывающим приложением инициализируется следующий по списку модуль и цикл повторяется до тех пор, пока не будет </w:t>
+        <w:t xml:space="preserve">приложением инициализируется следующий по списку модуль и цикл повторяется до тех пор, пока не будет </w:t>
       </w:r>
       <w:r>
         <w:t>завершена</w:t>
@@ -9960,29 +10060,136 @@
         <w:t>,</w:t>
       </w:r>
       <w:r>
-        <w:t xml:space="preserve"> что в него изначально вставлена </w:t>
+        <w:t xml:space="preserve"> что в него изначально вставлена карта, иначе </w:t>
+      </w:r>
+      <w:r>
+        <w:t>же драйвер прервется и будет ожидать карту</w:t>
+      </w:r>
+      <w:r>
+        <w:t>.</w:t>
+      </w:r>
+      <w:r>
+        <w:t xml:space="preserve"> В любом драйвере </w:t>
       </w:r>
       <w:r>
         <w:lastRenderedPageBreak/>
-        <w:t xml:space="preserve">карта, иначе </w:t>
-      </w:r>
-      <w:r>
-        <w:t>же драйвер прервется и будет ожидать карту</w:t>
+        <w:t xml:space="preserve">кардридера присутствует несколько функций, которые используются функцией драйвера записи карты </w:t>
+      </w:r>
+      <w:r>
+        <w:t>для подключения к кардридеру, настройки и т.д. Такие функции являются общими для всех таких драйверов и все они будут подробнее рассматриваться в следующем разделе.</w:t>
+      </w:r>
+      <w:r>
+        <w:t xml:space="preserve"> </w:t>
+      </w:r>
+      <w:r>
+        <w:t xml:space="preserve">Основной целью данной работы является разработка еще одного кардридерного драйвера, который будет использоваться для взаимодействия с кардридерным модулем эмбоссера </w:t>
+      </w:r>
+      <w:r>
+        <w:rPr>
+          <w:lang w:val="en-US"/>
+        </w:rPr>
+        <w:t>MATICA</w:t>
       </w:r>
       <w:r>
         <w:t>.</w:t>
       </w:r>
-      <w:r>
-        <w:t xml:space="preserve"> В любом драйвере кардридера присутствует несколько функций, которые используются функцией драйвера записи карты </w:t>
-      </w:r>
-      <w:r>
-        <w:t>для подключения к кардридеру, настройки и т.д. Такие функции являются общими для всех таких драйверов и все они будут подробнее рассматриваться в следующем разделе.</w:t>
-      </w:r>
-      <w:r>
-        <w:t xml:space="preserve"> </w:t>
-      </w:r>
-      <w:r>
-        <w:t xml:space="preserve">Основной целью данной работы является разработка еще одного кардридерного драйвера, который будет использоваться для взаимодействия с кардридерным модулем эмбоссера </w:t>
+    </w:p>
+    <w:p>
+      <w:r>
+        <w:t>Таким образом,</w:t>
+      </w:r>
+      <w:r>
+        <w:t xml:space="preserve"> программный продукт </w:t>
+      </w:r>
+      <w:proofErr w:type="spellStart"/>
+      <w:r>
+        <w:rPr>
+          <w:lang w:val="en-US"/>
+        </w:rPr>
+        <w:t>TranzWare</w:t>
+      </w:r>
+      <w:proofErr w:type="spellEnd"/>
+      <w:r>
+        <w:t xml:space="preserve"> </w:t>
+      </w:r>
+      <w:proofErr w:type="spellStart"/>
+      <w:r>
+        <w:rPr>
+          <w:lang w:val="en-US"/>
+        </w:rPr>
+        <w:t>CardFactory</w:t>
+      </w:r>
+      <w:proofErr w:type="spellEnd"/>
+      <w:r>
+        <w:t xml:space="preserve"> </w:t>
+      </w:r>
+      <w:r>
+        <w:t>является необходимым инструментом при осуществлении обработки пластиковых банковских карт. Он облегчает процессы настройки</w:t>
+      </w:r>
+      <w:r>
+        <w:t xml:space="preserve"> </w:t>
+      </w:r>
+      <w:r>
+        <w:t>и обработки</w:t>
+      </w:r>
+      <w:r>
+        <w:t>, визуально отображает каждый настраиваемый параметр, что дает возможности к внесению более детальных и точных настроек, а также упрощенному их отслеживанию. Он является незаменимым для клиентов компании</w:t>
+      </w:r>
+      <w:r>
+        <w:t xml:space="preserve"> Компас плюс</w:t>
+      </w:r>
+      <w:r>
+        <w:t>, так как подобные по масштабам</w:t>
+      </w:r>
+      <w:r>
+        <w:t xml:space="preserve"> и функциональности</w:t>
+      </w:r>
+      <w:r>
+        <w:t xml:space="preserve"> решения просто напросто отсутствуют на рынке.  </w:t>
+      </w:r>
+    </w:p>
+    <w:p>
+      <w:pPr>
+        <w:pStyle w:val="Heading3"/>
+      </w:pPr>
+      <w:bookmarkStart w:id="20" w:name="_Toc200560471"/>
+      <w:r>
+        <w:t xml:space="preserve">1.2.3 </w:t>
+      </w:r>
+      <w:r>
+        <w:t>Утилита</w:t>
+      </w:r>
+      <w:r>
+        <w:t xml:space="preserve"> </w:t>
+      </w:r>
+      <w:proofErr w:type="spellStart"/>
+      <w:r>
+        <w:rPr>
+          <w:lang w:val="en-US"/>
+        </w:rPr>
+        <w:t>Maticard</w:t>
+      </w:r>
+      <w:proofErr w:type="spellEnd"/>
+      <w:r>
+        <w:t xml:space="preserve"> </w:t>
+      </w:r>
+      <w:r>
+        <w:rPr>
+          <w:lang w:val="en-US"/>
+        </w:rPr>
+        <w:t>PRO</w:t>
+      </w:r>
+      <w:bookmarkEnd w:id="20"/>
+    </w:p>
+    <w:p>
+      <w:r>
+        <w:t>К</w:t>
+      </w:r>
+      <w:r>
+        <w:t xml:space="preserve"> </w:t>
+      </w:r>
+      <w:r>
+        <w:t xml:space="preserve">сожалению, осуществлять взаимодействие со всеми модулями эмбоссера </w:t>
       </w:r>
       <w:r>
         <w:rPr>
@@ -9991,15 +10198,143 @@
         <w:t>MATICA</w:t>
       </w:r>
       <w:r>
+        <w:t xml:space="preserve"> </w:t>
+      </w:r>
+      <w:r>
+        <w:t xml:space="preserve">невозможо без специализированного ПО, а конкретнее утилиты </w:t>
+      </w:r>
+      <w:proofErr w:type="spellStart"/>
+      <w:r>
+        <w:rPr>
+          <w:lang w:val="en-US"/>
+        </w:rPr>
+        <w:t>Maticard</w:t>
+      </w:r>
+      <w:proofErr w:type="spellEnd"/>
+      <w:r>
+        <w:t xml:space="preserve"> </w:t>
+      </w:r>
+      <w:r>
+        <w:rPr>
+          <w:lang w:val="en-US"/>
+        </w:rPr>
+        <w:t>PRO</w:t>
+      </w:r>
+      <w:r>
         <w:t>.</w:t>
       </w:r>
-    </w:p>
-    <w:p>
-      <w:r>
-        <w:t>Таким образом,</w:t>
-      </w:r>
-      <w:r>
-        <w:t xml:space="preserve"> программный продукт </w:t>
+      <w:r>
+        <w:t xml:space="preserve"> Он</w:t>
+      </w:r>
+      <w:r>
+        <w:t>а</w:t>
+      </w:r>
+      <w:r>
+        <w:t xml:space="preserve"> полностью разработан</w:t>
+      </w:r>
+      <w:r>
+        <w:t xml:space="preserve">а компанией </w:t>
+      </w:r>
+      <w:r>
+        <w:rPr>
+          <w:lang w:val="en-US"/>
+        </w:rPr>
+        <w:t>MATICA</w:t>
+      </w:r>
+      <w:r>
+        <w:t xml:space="preserve"> </w:t>
+      </w:r>
+      <w:r>
+        <w:t>в дополнение к своему эмббоссеру и поставляется клиентам вместе с ним.</w:t>
+      </w:r>
+      <w:r>
+        <w:t xml:space="preserve"> Это программное обеспечение служит для</w:t>
+      </w:r>
+      <w:r>
+        <w:t xml:space="preserve"> </w:t>
+      </w:r>
+      <w:r>
+        <w:t xml:space="preserve">взаимодействия с эмбоссером </w:t>
+      </w:r>
+      <w:r>
+        <w:rPr>
+          <w:lang w:val="en-US"/>
+        </w:rPr>
+        <w:t>MATICA</w:t>
+      </w:r>
+      <w:r>
+        <w:t xml:space="preserve"> и настройки этапов обработки карты на нем. По большому счету, оно очень похоже на продукт </w:t>
+      </w:r>
+      <w:proofErr w:type="spellStart"/>
+      <w:r>
+        <w:rPr>
+          <w:lang w:val="en-US"/>
+        </w:rPr>
+        <w:t>CardFactory</w:t>
+      </w:r>
+      <w:proofErr w:type="spellEnd"/>
+      <w:r>
+        <w:t xml:space="preserve">, </w:t>
+      </w:r>
+      <w:r>
+        <w:t xml:space="preserve">но сильно урезанный и осуществляющий работу только с эмбоссерами компании </w:t>
+      </w:r>
+      <w:r>
+        <w:rPr>
+          <w:lang w:val="en-US"/>
+        </w:rPr>
+        <w:t>MATICA</w:t>
+      </w:r>
+      <w:r>
+        <w:t>.</w:t>
+      </w:r>
+      <w:r>
+        <w:t xml:space="preserve"> Внутри него так же, как и в </w:t>
+      </w:r>
+      <w:proofErr w:type="spellStart"/>
+      <w:r>
+        <w:rPr>
+          <w:lang w:val="en-US"/>
+        </w:rPr>
+        <w:t>CardFactory</w:t>
+      </w:r>
+      <w:proofErr w:type="spellEnd"/>
+      <w:r>
+        <w:t xml:space="preserve"> </w:t>
+      </w:r>
+      <w:r>
+        <w:t xml:space="preserve">возможно настраивать процесс персонализации, путем добавления модулей в специально создаваемые разделы настроек. Для тестирования кардридерного модуля пригодится только модуль записи чипа. </w:t>
+      </w:r>
+    </w:p>
+    <w:p>
+      <w:r>
+        <w:t>Так как данное ПО не представляет большой значимости в рамках данной работы, оно будет рассмотрено поверхностно.</w:t>
+      </w:r>
+      <w:r>
+        <w:t xml:space="preserve"> Порядок запуска обработки карты через </w:t>
+      </w:r>
+      <w:proofErr w:type="spellStart"/>
+      <w:r>
+        <w:rPr>
+          <w:lang w:val="en-US"/>
+        </w:rPr>
+        <w:t>Maticard</w:t>
+      </w:r>
+      <w:proofErr w:type="spellEnd"/>
+      <w:r>
+        <w:t xml:space="preserve"> </w:t>
+      </w:r>
+      <w:r>
+        <w:rPr>
+          <w:lang w:val="en-US"/>
+        </w:rPr>
+        <w:t>PRO</w:t>
+      </w:r>
+      <w:r>
+        <w:t xml:space="preserve"> </w:t>
+      </w:r>
+      <w:r>
+        <w:t xml:space="preserve">и </w:t>
       </w:r>
       <w:proofErr w:type="spellStart"/>
       <w:r>
@@ -10024,146 +10359,450 @@
         <w:t xml:space="preserve"> </w:t>
       </w:r>
       <w:r>
-        <w:t>является необходимым инструментом при осуществлении обработки пластиковых банковских карт. Он облегчает процессы настройки</w:t>
-      </w:r>
-      <w:r>
-        <w:t xml:space="preserve"> </w:t>
-      </w:r>
-      <w:r>
-        <w:t>и обработки</w:t>
-      </w:r>
-      <w:r>
-        <w:t>, визуально отображает каждый настраиваемый параметр, что дает возможности к внесению более детальных и точных настроек, а также упрощенному их отслеживанию. Он является незаменимым для клиентов компании</w:t>
-      </w:r>
-      <w:r>
-        <w:t xml:space="preserve"> Компас плюс</w:t>
-      </w:r>
-      <w:r>
-        <w:t>, так как подобные по масштабам</w:t>
-      </w:r>
-      <w:r>
-        <w:t xml:space="preserve"> и функциональности</w:t>
-      </w:r>
-      <w:r>
-        <w:t xml:space="preserve"> решения просто напросто отсутствуют на рынке.  </w:t>
+        <w:t xml:space="preserve">с использованием эмбоссера </w:t>
+      </w:r>
+      <w:r>
+        <w:rPr>
+          <w:lang w:val="en-US"/>
+        </w:rPr>
+        <w:t>MATICA</w:t>
+      </w:r>
+      <w:r>
+        <w:t xml:space="preserve"> </w:t>
+      </w:r>
+      <w:r>
+        <w:t xml:space="preserve">выглядит следующим образом. Сначала </w:t>
+      </w:r>
+      <w:r>
+        <w:lastRenderedPageBreak/>
+        <w:t xml:space="preserve">запускается </w:t>
+      </w:r>
+      <w:proofErr w:type="spellStart"/>
+      <w:r>
+        <w:rPr>
+          <w:lang w:val="en-US"/>
+        </w:rPr>
+        <w:t>CardFactory</w:t>
+      </w:r>
+      <w:proofErr w:type="spellEnd"/>
+      <w:r>
+        <w:t xml:space="preserve">, </w:t>
+      </w:r>
+      <w:r>
+        <w:t xml:space="preserve">внутри которого запускается обработка карточного продукта. На одном из этапов обработки </w:t>
+      </w:r>
+      <w:proofErr w:type="spellStart"/>
+      <w:r>
+        <w:rPr>
+          <w:lang w:val="en-US"/>
+        </w:rPr>
+        <w:t>CardFactory</w:t>
+      </w:r>
+      <w:proofErr w:type="spellEnd"/>
+      <w:r>
+        <w:t xml:space="preserve"> </w:t>
+      </w:r>
+      <w:r>
+        <w:t xml:space="preserve">записывает данные для эмбоссирования карты в специальную базу данных, содержащую таблицу данных карт. После этого запускается ПО </w:t>
+      </w:r>
+      <w:proofErr w:type="spellStart"/>
+      <w:r>
+        <w:rPr>
+          <w:lang w:val="en-US"/>
+        </w:rPr>
+        <w:t>Maticard</w:t>
+      </w:r>
+      <w:proofErr w:type="spellEnd"/>
+      <w:r>
+        <w:t xml:space="preserve"> </w:t>
+      </w:r>
+      <w:r>
+        <w:rPr>
+          <w:lang w:val="en-US"/>
+        </w:rPr>
+        <w:t>PRO</w:t>
+      </w:r>
+      <w:r>
+        <w:t xml:space="preserve">, в котором также запускается обработка карты. </w:t>
+      </w:r>
+      <w:proofErr w:type="spellStart"/>
+      <w:r>
+        <w:rPr>
+          <w:lang w:val="en-US"/>
+        </w:rPr>
+        <w:t>Maticard</w:t>
+      </w:r>
+      <w:proofErr w:type="spellEnd"/>
+      <w:r>
+        <w:t xml:space="preserve"> </w:t>
+      </w:r>
+      <w:r>
+        <w:t xml:space="preserve">подгружает из базы все необходимые данные и производит последовательное эмбоссирование всех карт, содержащихся в базе. Кроме того, </w:t>
+      </w:r>
+      <w:proofErr w:type="spellStart"/>
+      <w:r>
+        <w:rPr>
+          <w:lang w:val="en-US"/>
+        </w:rPr>
+        <w:t>Maticard</w:t>
+      </w:r>
+      <w:proofErr w:type="spellEnd"/>
+      <w:r>
+        <w:t xml:space="preserve"> </w:t>
+      </w:r>
+      <w:r>
+        <w:t xml:space="preserve">произведет остановку обработки на этапе записи чипа для передачи управления </w:t>
+      </w:r>
+      <w:r>
+        <w:t xml:space="preserve">процессом в </w:t>
+      </w:r>
+      <w:proofErr w:type="spellStart"/>
+      <w:r>
+        <w:rPr>
+          <w:lang w:val="en-US"/>
+        </w:rPr>
+        <w:t>CardFactory</w:t>
+      </w:r>
+      <w:proofErr w:type="spellEnd"/>
+      <w:r>
+        <w:t xml:space="preserve">. </w:t>
+      </w:r>
+      <w:r>
+        <w:t xml:space="preserve">Видите ли, внутри утилиты </w:t>
+      </w:r>
+      <w:proofErr w:type="spellStart"/>
+      <w:r>
+        <w:rPr>
+          <w:lang w:val="en-US"/>
+        </w:rPr>
+        <w:t>Maticard</w:t>
+      </w:r>
+      <w:proofErr w:type="spellEnd"/>
+      <w:r>
+        <w:t xml:space="preserve"> </w:t>
+      </w:r>
+      <w:r>
+        <w:rPr>
+          <w:lang w:val="en-US"/>
+        </w:rPr>
+        <w:t>PRO</w:t>
+      </w:r>
+      <w:r>
+        <w:t xml:space="preserve"> </w:t>
+      </w:r>
+      <w:r>
+        <w:t xml:space="preserve">возможно передать управление одим из этапов персонализации функциям внешней библиотеки. Разработчиками компании Компас плюс была разработана такая библиотека </w:t>
+      </w:r>
+      <w:r>
+        <w:rPr>
+          <w:lang w:val="en-US"/>
+        </w:rPr>
+        <w:t>DLL</w:t>
+      </w:r>
+      <w:r>
+        <w:t>.</w:t>
+      </w:r>
+      <w:r>
+        <w:t xml:space="preserve"> </w:t>
+      </w:r>
+      <w:r>
+        <w:t xml:space="preserve">Ее функции отправляют </w:t>
+      </w:r>
+      <w:proofErr w:type="spellStart"/>
+      <w:r>
+        <w:rPr>
+          <w:lang w:val="en-US"/>
+        </w:rPr>
+        <w:t>CardFactory</w:t>
+      </w:r>
+      <w:proofErr w:type="spellEnd"/>
+      <w:r>
+        <w:t xml:space="preserve"> </w:t>
+      </w:r>
+      <w:r>
+        <w:t>сигнал о том, что пришло время запуска этапа записи чипа</w:t>
+      </w:r>
+      <w:r>
+        <w:t xml:space="preserve">. В этот момент в </w:t>
+      </w:r>
+      <w:proofErr w:type="spellStart"/>
+      <w:r>
+        <w:rPr>
+          <w:lang w:val="en-US"/>
+        </w:rPr>
+        <w:t>CardFactory</w:t>
+      </w:r>
+      <w:proofErr w:type="spellEnd"/>
+      <w:r>
+        <w:t xml:space="preserve"> </w:t>
+      </w:r>
+      <w:r>
+        <w:t xml:space="preserve">запускается модуль </w:t>
+      </w:r>
+      <w:r>
+        <w:rPr>
+          <w:lang w:val="en-US"/>
+        </w:rPr>
+        <w:t>Chip</w:t>
+      </w:r>
+      <w:r>
+        <w:t xml:space="preserve"> </w:t>
+      </w:r>
+      <w:r>
+        <w:rPr>
+          <w:lang w:val="en-US"/>
+        </w:rPr>
+        <w:t>Writer</w:t>
+      </w:r>
+      <w:r>
+        <w:t xml:space="preserve"> </w:t>
+      </w:r>
+      <w:r>
+        <w:rPr>
+          <w:lang w:val="en-US"/>
+        </w:rPr>
+        <w:t>Driver</w:t>
+      </w:r>
+      <w:r>
+        <w:t xml:space="preserve">. Он записывает данные на пластиковую карту и подает сигнал обратно о завершении процесса. По принятии сигнала </w:t>
+      </w:r>
+      <w:proofErr w:type="spellStart"/>
+      <w:r>
+        <w:rPr>
+          <w:lang w:val="en-US"/>
+        </w:rPr>
+        <w:t>Maticard</w:t>
+      </w:r>
+      <w:proofErr w:type="spellEnd"/>
+      <w:r>
+        <w:t xml:space="preserve"> </w:t>
+      </w:r>
+      <w:r>
+        <w:t>продолжает свое выполнение.</w:t>
+      </w:r>
+    </w:p>
+    <w:p>
+      <w:r>
+        <w:t xml:space="preserve">В процессе описания процесса запуска было упущено множество деталей. Подробнее полный процесс обработки карты будет рассматриваться в разделе анализа текущих решений. </w:t>
+      </w:r>
+      <w:r>
+        <w:t xml:space="preserve">Конечно, идеальным решением было бы осуществление полноценного управления эмбоссером </w:t>
+      </w:r>
+      <w:r>
+        <w:rPr>
+          <w:lang w:val="en-US"/>
+        </w:rPr>
+        <w:t>MATICA</w:t>
+      </w:r>
+      <w:r>
+        <w:t xml:space="preserve"> </w:t>
+      </w:r>
+      <w:r>
+        <w:t xml:space="preserve">через продукт </w:t>
+      </w:r>
+      <w:proofErr w:type="spellStart"/>
+      <w:r>
+        <w:rPr>
+          <w:lang w:val="en-US"/>
+        </w:rPr>
+        <w:t>TranzWare</w:t>
+      </w:r>
+      <w:proofErr w:type="spellEnd"/>
+      <w:r>
+        <w:t xml:space="preserve"> </w:t>
+      </w:r>
+      <w:proofErr w:type="spellStart"/>
+      <w:r>
+        <w:rPr>
+          <w:lang w:val="en-US"/>
+        </w:rPr>
+        <w:t>CardFactory</w:t>
+      </w:r>
+      <w:proofErr w:type="spellEnd"/>
+      <w:r>
+        <w:t xml:space="preserve">, </w:t>
+      </w:r>
+      <w:r>
+        <w:t xml:space="preserve">в таком случае не пришлось бы прибегать к использованию сторонних решений. К сожалению такой исход не представляется возможным. По итогам консультации с сотрудниками итальянской компании </w:t>
+      </w:r>
+      <w:r>
+        <w:rPr>
+          <w:lang w:val="en-US"/>
+        </w:rPr>
+        <w:t>MATICA</w:t>
+      </w:r>
+      <w:r>
+        <w:t xml:space="preserve"> </w:t>
+      </w:r>
+      <w:r>
+        <w:t xml:space="preserve">по данному вопросу, было определено, что никакой документации компания предоставлять для осуществления таких целей не будет, как и разглашать способы прямого взаимодействия с эмбоссером. Компанией были предоставлены только ПО </w:t>
+      </w:r>
+      <w:proofErr w:type="spellStart"/>
+      <w:r>
+        <w:rPr>
+          <w:lang w:val="en-US"/>
+        </w:rPr>
+        <w:t>Maticard</w:t>
+      </w:r>
+      <w:proofErr w:type="spellEnd"/>
+      <w:r>
+        <w:t xml:space="preserve"> </w:t>
+      </w:r>
+      <w:r>
+        <w:rPr>
+          <w:lang w:val="en-US"/>
+        </w:rPr>
+        <w:t>PRO</w:t>
+      </w:r>
+      <w:r>
+        <w:t xml:space="preserve">, </w:t>
+      </w:r>
+      <w:r>
+        <w:t xml:space="preserve">инструкция по работе с ним, документация </w:t>
+      </w:r>
+      <w:r>
+        <w:t xml:space="preserve">и полное описание способов взаимодействия с кардридерным модулем и примеры внешних библиотек для передачи управление. В такой ситуации не остается ничего другого, кроме как воспользоваться поставляемым компанией </w:t>
+      </w:r>
+      <w:r>
+        <w:rPr>
+          <w:lang w:val="en-US"/>
+        </w:rPr>
+        <w:t>MATICA</w:t>
+      </w:r>
+      <w:r>
+        <w:t xml:space="preserve"> </w:t>
+      </w:r>
+      <w:r>
+        <w:t xml:space="preserve">программным </w:t>
+      </w:r>
+      <w:r>
+        <w:lastRenderedPageBreak/>
+        <w:t>обеспечением, даже если такое использование в рамках разработки будет сведено к абсолютному минимуму.</w:t>
+      </w:r>
+    </w:p>
+    <w:p>
+      <w:pPr>
+        <w:pStyle w:val="Heading2"/>
+      </w:pPr>
+      <w:bookmarkStart w:id="21" w:name="_Toc200560472"/>
+      <w:r>
+        <w:t xml:space="preserve">1.3 Анализ </w:t>
+      </w:r>
+      <w:r>
+        <w:t>текущих решений</w:t>
+      </w:r>
+      <w:bookmarkEnd w:id="21"/>
+    </w:p>
+    <w:p>
+      <w:r>
+        <w:t xml:space="preserve">На сегодняшний день существуют решения для полноценной персонализации пластиковой карты средствами эмбоссеров </w:t>
+      </w:r>
+      <w:r>
+        <w:rPr>
+          <w:lang w:val="en-US"/>
+        </w:rPr>
+        <w:t>MATICA</w:t>
+      </w:r>
+      <w:r>
+        <w:t xml:space="preserve"> </w:t>
+      </w:r>
+      <w:r>
+        <w:t xml:space="preserve">с помощью </w:t>
+      </w:r>
+      <w:proofErr w:type="spellStart"/>
+      <w:r>
+        <w:rPr>
+          <w:lang w:val="en-US"/>
+        </w:rPr>
+        <w:t>TranzWare</w:t>
+      </w:r>
+      <w:proofErr w:type="spellEnd"/>
+      <w:r>
+        <w:t xml:space="preserve"> </w:t>
+      </w:r>
+      <w:proofErr w:type="spellStart"/>
+      <w:r>
+        <w:rPr>
+          <w:lang w:val="en-US"/>
+        </w:rPr>
+        <w:t>CardFactory</w:t>
+      </w:r>
+      <w:proofErr w:type="spellEnd"/>
+      <w:r>
+        <w:t xml:space="preserve">, но ни одно из этих решений не взаимодействует с кардридерным модулем эмбоссера, отчего процесс выпуска получается медленным и неэффективным. В рамках данного </w:t>
+      </w:r>
+      <w:r>
+        <w:t>под</w:t>
+      </w:r>
+      <w:r>
+        <w:t xml:space="preserve">раздела будут рассмотрены текущие решения по персонализации карт средствами </w:t>
+      </w:r>
+      <w:r>
+        <w:t xml:space="preserve">эмбоссеров </w:t>
+      </w:r>
+      <w:r>
+        <w:rPr>
+          <w:lang w:val="en-US"/>
+        </w:rPr>
+        <w:t>MATICA</w:t>
+      </w:r>
+      <w:r>
+        <w:t xml:space="preserve">, </w:t>
+      </w:r>
+      <w:r>
+        <w:t xml:space="preserve">а также схему работы таких решений. Кроме того в данном разделе будет проанализировано объектное дерево других крадридерных драйверов для выяснения общих компонентов, которые должны присутствовать внутри любого кардридерного драйвера внутри </w:t>
+      </w:r>
+      <w:proofErr w:type="spellStart"/>
+      <w:r>
+        <w:rPr>
+          <w:lang w:val="en-US"/>
+        </w:rPr>
+        <w:t>CardFactory</w:t>
+      </w:r>
+      <w:proofErr w:type="spellEnd"/>
+      <w:r>
+        <w:t xml:space="preserve"> </w:t>
+      </w:r>
+      <w:r>
+        <w:t>для его правильной работы. На основании этих данных будет составлен шаблон объектного дерева кардридерного драйвера,</w:t>
+      </w:r>
+      <w:r>
+        <w:t xml:space="preserve"> </w:t>
+      </w:r>
+      <w:r>
+        <w:t>который позже будет использоваться как основа для</w:t>
+      </w:r>
+      <w:r>
+        <w:t xml:space="preserve"> проектирования и</w:t>
+      </w:r>
+      <w:r>
+        <w:t xml:space="preserve"> разработки драйвера</w:t>
+      </w:r>
+      <w:r>
+        <w:t>.</w:t>
       </w:r>
     </w:p>
     <w:p>
       <w:pPr>
         <w:pStyle w:val="Heading3"/>
       </w:pPr>
-      <w:bookmarkStart w:id="20" w:name="_Toc200560471"/>
-      <w:r>
-        <w:t xml:space="preserve">1.2.3 </w:t>
-      </w:r>
-      <w:r>
-        <w:t>Утилита</w:t>
-      </w:r>
-      <w:r>
-        <w:t xml:space="preserve"> </w:t>
-      </w:r>
-      <w:proofErr w:type="spellStart"/>
-      <w:r>
-        <w:rPr>
-          <w:lang w:val="en-US"/>
-        </w:rPr>
-        <w:t>Maticard</w:t>
-      </w:r>
-      <w:proofErr w:type="spellEnd"/>
-      <w:r>
-        <w:t xml:space="preserve"> </w:t>
-      </w:r>
-      <w:r>
-        <w:rPr>
-          <w:lang w:val="en-US"/>
-        </w:rPr>
-        <w:t>PRO</w:t>
-      </w:r>
-      <w:bookmarkEnd w:id="20"/>
-    </w:p>
-    <w:p>
-      <w:r>
-        <w:t>К</w:t>
-      </w:r>
-      <w:r>
-        <w:t xml:space="preserve"> </w:t>
-      </w:r>
-      <w:r>
-        <w:t xml:space="preserve">сожалению, осуществлять взаимодействие со всеми модулями эмбоссера </w:t>
-      </w:r>
-      <w:r>
-        <w:rPr>
-          <w:lang w:val="en-US"/>
-        </w:rPr>
-        <w:t>MATICA</w:t>
-      </w:r>
-      <w:r>
-        <w:t xml:space="preserve"> </w:t>
-      </w:r>
-      <w:r>
-        <w:t xml:space="preserve">невозможо без специализированного ПО, а конкретнее утилиты </w:t>
-      </w:r>
-      <w:proofErr w:type="spellStart"/>
-      <w:r>
-        <w:rPr>
-          <w:lang w:val="en-US"/>
-        </w:rPr>
-        <w:t>Maticard</w:t>
-      </w:r>
-      <w:proofErr w:type="spellEnd"/>
-      <w:r>
-        <w:t xml:space="preserve"> </w:t>
-      </w:r>
-      <w:r>
-        <w:rPr>
-          <w:lang w:val="en-US"/>
-        </w:rPr>
-        <w:t>PRO</w:t>
-      </w:r>
-      <w:r>
-        <w:t>.</w:t>
-      </w:r>
-      <w:r>
-        <w:t xml:space="preserve"> Он</w:t>
-      </w:r>
-      <w:r>
-        <w:t>а</w:t>
-      </w:r>
-      <w:r>
-        <w:t xml:space="preserve"> полностью разработан</w:t>
-      </w:r>
-      <w:r>
-        <w:t xml:space="preserve">а компанией </w:t>
-      </w:r>
-      <w:r>
-        <w:rPr>
-          <w:lang w:val="en-US"/>
-        </w:rPr>
-        <w:t>MATICA</w:t>
-      </w:r>
-      <w:r>
-        <w:t xml:space="preserve"> </w:t>
-      </w:r>
-      <w:r>
-        <w:t>в дополнение к своему эмббоссеру и поставляется клиентам вместе с ним.</w:t>
-      </w:r>
-      <w:r>
-        <w:t xml:space="preserve"> Это программное обеспечение служит для</w:t>
-      </w:r>
-      <w:r>
-        <w:t xml:space="preserve"> </w:t>
-      </w:r>
-      <w:r>
-        <w:t xml:space="preserve">взаимодействия с эмбоссером </w:t>
-      </w:r>
-      <w:r>
-        <w:rPr>
-          <w:lang w:val="en-US"/>
-        </w:rPr>
-        <w:t>MATICA</w:t>
-      </w:r>
-      <w:r>
-        <w:t xml:space="preserve"> и настройки этапов обработки карты на нем. По большому счету, оно очень похоже на продукт </w:t>
+      <w:bookmarkStart w:id="22" w:name="_Toc200560473"/>
+      <w:r>
+        <w:t xml:space="preserve">1.3.1 </w:t>
+      </w:r>
+      <w:r>
+        <w:t xml:space="preserve">Анализ кардридерных драйверов продукта </w:t>
+      </w:r>
+      <w:proofErr w:type="spellStart"/>
+      <w:r>
+        <w:rPr>
+          <w:lang w:val="en-US"/>
+        </w:rPr>
+        <w:t>TranzWare</w:t>
+      </w:r>
+      <w:proofErr w:type="spellEnd"/>
+      <w:r>
+        <w:t xml:space="preserve"> </w:t>
       </w:r>
       <w:proofErr w:type="spellStart"/>
       <w:r>
@@ -10172,24 +10811,23 @@
         </w:rPr>
         <w:t>CardFactory</w:t>
       </w:r>
-      <w:proofErr w:type="spellEnd"/>
-      <w:r>
-        <w:t xml:space="preserve">, </w:t>
-      </w:r>
-      <w:r>
-        <w:t xml:space="preserve">но сильно урезанный и осуществляющий работу только с эмбоссерами компании </w:t>
-      </w:r>
-      <w:r>
-        <w:rPr>
-          <w:lang w:val="en-US"/>
-        </w:rPr>
-        <w:t>MATICA</w:t>
-      </w:r>
-      <w:r>
-        <w:t>.</w:t>
-      </w:r>
-      <w:r>
-        <w:t xml:space="preserve"> Внутри него так же, как и в </w:t>
+      <w:bookmarkEnd w:id="22"/>
+      <w:proofErr w:type="spellEnd"/>
+    </w:p>
+    <w:p>
+      <w:r>
+        <w:t xml:space="preserve">Всего на текущий момент внутри продукта </w:t>
+      </w:r>
+      <w:proofErr w:type="spellStart"/>
+      <w:r>
+        <w:rPr>
+          <w:lang w:val="en-US"/>
+        </w:rPr>
+        <w:t>TranzWare</w:t>
+      </w:r>
+      <w:proofErr w:type="spellEnd"/>
+      <w:r>
+        <w:t xml:space="preserve"> </w:t>
       </w:r>
       <w:proofErr w:type="spellStart"/>
       <w:r>
@@ -10203,49 +10841,41 @@
         <w:t xml:space="preserve"> </w:t>
       </w:r>
       <w:r>
-        <w:t xml:space="preserve">возможно настраивать процесс персонализации, путем добавления модулей в специально создаваемые разделы настроек. Для тестирования кардридерного модуля пригодится только модуль записи чипа. </w:t>
-      </w:r>
-    </w:p>
-    <w:p>
-      <w:r>
-        <w:t>Так как данное ПО не представляет большой значимости в рамках данной работы, оно будет рассмотрено поверхностно.</w:t>
-      </w:r>
-      <w:r>
-        <w:t xml:space="preserve"> Порядок запуска обработки карты через </w:t>
-      </w:r>
-      <w:proofErr w:type="spellStart"/>
-      <w:r>
-        <w:rPr>
-          <w:lang w:val="en-US"/>
-        </w:rPr>
-        <w:t>Maticard</w:t>
-      </w:r>
-      <w:proofErr w:type="spellEnd"/>
-      <w:r>
-        <w:t xml:space="preserve"> </w:t>
-      </w:r>
-      <w:r>
-        <w:rPr>
-          <w:lang w:val="en-US"/>
-        </w:rPr>
-        <w:t>PRO</w:t>
-      </w:r>
-      <w:r>
-        <w:t xml:space="preserve"> </w:t>
-      </w:r>
-      <w:r>
-        <w:t xml:space="preserve">и </w:t>
-      </w:r>
-      <w:proofErr w:type="spellStart"/>
-      <w:r>
-        <w:rPr>
-          <w:lang w:val="en-US"/>
-        </w:rPr>
-        <w:t>TranzWare</w:t>
-      </w:r>
-      <w:proofErr w:type="spellEnd"/>
-      <w:r>
-        <w:t xml:space="preserve"> </w:t>
+        <w:t xml:space="preserve">присутствует </w:t>
+      </w:r>
+      <w:r>
+        <w:t>25</w:t>
+      </w:r>
+      <w:r>
+        <w:t xml:space="preserve"> </w:t>
+      </w:r>
+      <w:r>
+        <w:t xml:space="preserve">кардридерных драверов, каждый из которых позволяет осуществлять </w:t>
+      </w:r>
+      <w:r>
+        <w:t>взаимодействие</w:t>
+      </w:r>
+      <w:r>
+        <w:t xml:space="preserve"> со своим типом кардридера.</w:t>
+      </w:r>
+      <w:r>
+        <w:t xml:space="preserve"> Конечно, каждый кардридер имеет свое собственную, уникальную, структуру, со всеми необходимыми функциями, объектами настроек и т.д., разработанным специально под кардридер. Не смотря на это, каждый кардридерный драйвер имеет общие с другими элементы, которые необходимы для работы драйверов записи карты. Как было упомянуто в прошлом</w:t>
+      </w:r>
+      <w:r>
+        <w:t xml:space="preserve"> подразделе</w:t>
+      </w:r>
+      <w:r>
+        <w:t xml:space="preserve">, все драйвера записи карты используют функции кардридерных драйверов для взаимодействия с картами через кардридеры, поэтому наличие стандартизированного интерфейса взаимодействия между </w:t>
+      </w:r>
+      <w:r>
+        <w:t>двумя представленными</w:t>
+      </w:r>
+      <w:r>
+        <w:t xml:space="preserve"> типами драйверов является обязательным условием для безошибочной обработки карты. Такой интерфейс взаимодействия, </w:t>
+      </w:r>
+      <w:r>
+        <w:lastRenderedPageBreak/>
+        <w:t xml:space="preserve">естественно, присутствует между драйверам, иначе средствами </w:t>
       </w:r>
       <w:proofErr w:type="spellStart"/>
       <w:r>
@@ -10259,513 +10889,13 @@
         <w:t xml:space="preserve"> </w:t>
       </w:r>
       <w:r>
-        <w:t xml:space="preserve">с </w:t>
-      </w:r>
-      <w:r>
-        <w:lastRenderedPageBreak/>
-        <w:t xml:space="preserve">использованием эмбоссера </w:t>
-      </w:r>
-      <w:r>
-        <w:rPr>
-          <w:lang w:val="en-US"/>
-        </w:rPr>
-        <w:t>MATICA</w:t>
-      </w:r>
-      <w:r>
-        <w:t xml:space="preserve"> </w:t>
-      </w:r>
-      <w:r>
-        <w:t xml:space="preserve">выглядит следующим образом. Сначала запускается </w:t>
-      </w:r>
-      <w:proofErr w:type="spellStart"/>
-      <w:r>
-        <w:rPr>
-          <w:lang w:val="en-US"/>
-        </w:rPr>
-        <w:t>CardFactory</w:t>
-      </w:r>
-      <w:proofErr w:type="spellEnd"/>
-      <w:r>
-        <w:t xml:space="preserve">, </w:t>
-      </w:r>
-      <w:r>
-        <w:t xml:space="preserve">внутри которого запускается обработка карточного продукта. На одном из этапов обработки </w:t>
-      </w:r>
-      <w:proofErr w:type="spellStart"/>
-      <w:r>
-        <w:rPr>
-          <w:lang w:val="en-US"/>
-        </w:rPr>
-        <w:t>CardFactory</w:t>
-      </w:r>
-      <w:proofErr w:type="spellEnd"/>
-      <w:r>
-        <w:t xml:space="preserve"> </w:t>
-      </w:r>
-      <w:r>
-        <w:t xml:space="preserve">записывает данные для эмбоссирования карты в специальную базу данных, содержащую таблицу данных карт. После этого запускается ПО </w:t>
-      </w:r>
-      <w:proofErr w:type="spellStart"/>
-      <w:r>
-        <w:rPr>
-          <w:lang w:val="en-US"/>
-        </w:rPr>
-        <w:t>Maticard</w:t>
-      </w:r>
-      <w:proofErr w:type="spellEnd"/>
-      <w:r>
-        <w:t xml:space="preserve"> </w:t>
-      </w:r>
-      <w:r>
-        <w:rPr>
-          <w:lang w:val="en-US"/>
-        </w:rPr>
-        <w:t>PRO</w:t>
-      </w:r>
-      <w:r>
-        <w:t xml:space="preserve">, в котором также запускается обработка карты. </w:t>
-      </w:r>
-      <w:proofErr w:type="spellStart"/>
-      <w:r>
-        <w:rPr>
-          <w:lang w:val="en-US"/>
-        </w:rPr>
-        <w:t>Maticard</w:t>
-      </w:r>
-      <w:proofErr w:type="spellEnd"/>
-      <w:r>
-        <w:t xml:space="preserve"> </w:t>
-      </w:r>
-      <w:r>
-        <w:t xml:space="preserve">подгружает из базы все необходимые данные и производит последовательное эмбоссирование всех карт, содержащихся в базе. Кроме того, </w:t>
-      </w:r>
-      <w:proofErr w:type="spellStart"/>
-      <w:r>
-        <w:rPr>
-          <w:lang w:val="en-US"/>
-        </w:rPr>
-        <w:t>Maticard</w:t>
-      </w:r>
-      <w:proofErr w:type="spellEnd"/>
-      <w:r>
-        <w:t xml:space="preserve"> </w:t>
-      </w:r>
-      <w:r>
-        <w:t xml:space="preserve">произведет остановку обработки на этапе записи чипа для передачи управления </w:t>
-      </w:r>
-      <w:r>
-        <w:t xml:space="preserve">процессом в </w:t>
-      </w:r>
-      <w:proofErr w:type="spellStart"/>
-      <w:r>
-        <w:rPr>
-          <w:lang w:val="en-US"/>
-        </w:rPr>
-        <w:t>CardFactory</w:t>
-      </w:r>
-      <w:proofErr w:type="spellEnd"/>
-      <w:r>
-        <w:t xml:space="preserve">. </w:t>
-      </w:r>
-      <w:r>
-        <w:t xml:space="preserve">Видите ли, внутри утилиты </w:t>
-      </w:r>
-      <w:proofErr w:type="spellStart"/>
-      <w:r>
-        <w:rPr>
-          <w:lang w:val="en-US"/>
-        </w:rPr>
-        <w:t>Maticard</w:t>
-      </w:r>
-      <w:proofErr w:type="spellEnd"/>
-      <w:r>
-        <w:t xml:space="preserve"> </w:t>
-      </w:r>
-      <w:r>
-        <w:rPr>
-          <w:lang w:val="en-US"/>
-        </w:rPr>
-        <w:t>PRO</w:t>
-      </w:r>
-      <w:r>
-        <w:t xml:space="preserve"> </w:t>
-      </w:r>
-      <w:r>
-        <w:t xml:space="preserve">возможно передать управление одим из этапов персонализации функциям внешней библиотеки. Разработчиками компании Компас плюс была разработана такая библиотека </w:t>
-      </w:r>
-      <w:r>
-        <w:rPr>
-          <w:lang w:val="en-US"/>
-        </w:rPr>
-        <w:t>DLL</w:t>
-      </w:r>
-      <w:r>
-        <w:t>.</w:t>
-      </w:r>
-      <w:r>
-        <w:t xml:space="preserve"> </w:t>
-      </w:r>
-      <w:r>
-        <w:t xml:space="preserve">Ее функции отправляют </w:t>
-      </w:r>
-      <w:proofErr w:type="spellStart"/>
-      <w:r>
-        <w:rPr>
-          <w:lang w:val="en-US"/>
-        </w:rPr>
-        <w:t>CardFactory</w:t>
-      </w:r>
-      <w:proofErr w:type="spellEnd"/>
-      <w:r>
-        <w:t xml:space="preserve"> </w:t>
-      </w:r>
-      <w:r>
-        <w:t>сигнал о том, что пришло время запуска этапа записи чипа</w:t>
-      </w:r>
-      <w:r>
-        <w:t xml:space="preserve">. В этот момент в </w:t>
-      </w:r>
-      <w:proofErr w:type="spellStart"/>
-      <w:r>
-        <w:rPr>
-          <w:lang w:val="en-US"/>
-        </w:rPr>
-        <w:t>CardFactory</w:t>
-      </w:r>
-      <w:proofErr w:type="spellEnd"/>
-      <w:r>
-        <w:t xml:space="preserve"> </w:t>
-      </w:r>
-      <w:r>
-        <w:t xml:space="preserve">запускается модуль </w:t>
-      </w:r>
-      <w:r>
-        <w:rPr>
-          <w:lang w:val="en-US"/>
-        </w:rPr>
-        <w:t>Chip</w:t>
-      </w:r>
-      <w:r>
-        <w:t xml:space="preserve"> </w:t>
-      </w:r>
-      <w:r>
-        <w:rPr>
-          <w:lang w:val="en-US"/>
-        </w:rPr>
-        <w:t>Writer</w:t>
-      </w:r>
-      <w:r>
-        <w:t xml:space="preserve"> </w:t>
-      </w:r>
-      <w:r>
-        <w:rPr>
-          <w:lang w:val="en-US"/>
-        </w:rPr>
-        <w:t>Driver</w:t>
-      </w:r>
-      <w:r>
-        <w:t xml:space="preserve">. Он записывает данные на пластиковую карту и подает сигнал обратно о завершении процесса. По принятии сигнала </w:t>
-      </w:r>
-      <w:proofErr w:type="spellStart"/>
-      <w:r>
-        <w:rPr>
-          <w:lang w:val="en-US"/>
-        </w:rPr>
-        <w:t>Maticard</w:t>
-      </w:r>
-      <w:proofErr w:type="spellEnd"/>
-      <w:r>
-        <w:t xml:space="preserve"> </w:t>
-      </w:r>
-      <w:r>
-        <w:t>продолжает свое выполнение.</w:t>
-      </w:r>
-    </w:p>
-    <w:p>
-      <w:r>
-        <w:t xml:space="preserve">В процессе описания процесса запуска было упущено множество деталей. Подробнее полный процесс обработки карты будет рассматриваться в разделе анализа текущих решений. </w:t>
-      </w:r>
-      <w:r>
-        <w:t xml:space="preserve">Конечно, идеальным решением было бы осуществление полноценного управления эмбоссером </w:t>
-      </w:r>
-      <w:r>
-        <w:rPr>
-          <w:lang w:val="en-US"/>
-        </w:rPr>
-        <w:t>MATICA</w:t>
-      </w:r>
-      <w:r>
-        <w:t xml:space="preserve"> </w:t>
-      </w:r>
-      <w:r>
-        <w:t xml:space="preserve">через продукт </w:t>
-      </w:r>
-      <w:proofErr w:type="spellStart"/>
-      <w:r>
-        <w:rPr>
-          <w:lang w:val="en-US"/>
-        </w:rPr>
-        <w:t>TranzWare</w:t>
-      </w:r>
-      <w:proofErr w:type="spellEnd"/>
-      <w:r>
-        <w:t xml:space="preserve"> </w:t>
-      </w:r>
-      <w:proofErr w:type="spellStart"/>
-      <w:r>
-        <w:rPr>
-          <w:lang w:val="en-US"/>
-        </w:rPr>
-        <w:t>CardFactory</w:t>
-      </w:r>
-      <w:proofErr w:type="spellEnd"/>
-      <w:r>
-        <w:t xml:space="preserve">, </w:t>
-      </w:r>
-      <w:r>
-        <w:t xml:space="preserve">в таком случае не пришлось бы прибегать к использованию сторонних решений. К сожалению такой исход не представляется возможным. По итогам консультации с сотрудниками итальянской компании </w:t>
-      </w:r>
-      <w:r>
-        <w:rPr>
-          <w:lang w:val="en-US"/>
-        </w:rPr>
-        <w:t>MATICA</w:t>
-      </w:r>
-      <w:r>
-        <w:t xml:space="preserve"> </w:t>
-      </w:r>
-      <w:r>
-        <w:t xml:space="preserve">по данному вопросу, было определено, что никакой документации компания предоставлять для осуществления таких целей не будет, как и разглашать способы прямого взаимодействия с эмбоссером. Компанией были предоставлены только ПО </w:t>
-      </w:r>
-      <w:proofErr w:type="spellStart"/>
-      <w:r>
-        <w:rPr>
-          <w:lang w:val="en-US"/>
-        </w:rPr>
-        <w:t>Maticard</w:t>
-      </w:r>
-      <w:proofErr w:type="spellEnd"/>
-      <w:r>
-        <w:t xml:space="preserve"> </w:t>
-      </w:r>
-      <w:r>
-        <w:rPr>
-          <w:lang w:val="en-US"/>
-        </w:rPr>
-        <w:t>PRO</w:t>
-      </w:r>
-      <w:r>
-        <w:t xml:space="preserve">, </w:t>
-      </w:r>
-      <w:r>
-        <w:t xml:space="preserve">инструкция по работе с ним, документация </w:t>
-      </w:r>
-      <w:r>
-        <w:t xml:space="preserve">и полное описание способов взаимодействия с кардридерным модулем и примеры внешних библиотек для передачи управление. В такой ситуации не остается ничего другого, кроме как </w:t>
-      </w:r>
-      <w:r>
-        <w:lastRenderedPageBreak/>
-        <w:t xml:space="preserve">воспользоваться поставляемым компанией </w:t>
-      </w:r>
-      <w:r>
-        <w:rPr>
-          <w:lang w:val="en-US"/>
-        </w:rPr>
-        <w:t>MATICA</w:t>
-      </w:r>
-      <w:r>
-        <w:t xml:space="preserve"> </w:t>
-      </w:r>
-      <w:r>
-        <w:t>программным обеспечением, даже если такое использование в рамках разработки будет сведено к абсолютному минимуму.</w:t>
-      </w:r>
-    </w:p>
-    <w:p>
-      <w:pPr>
-        <w:pStyle w:val="Heading2"/>
-      </w:pPr>
-      <w:bookmarkStart w:id="21" w:name="_Toc200560472"/>
-      <w:r>
-        <w:t xml:space="preserve">1.3 Анализ </w:t>
-      </w:r>
-      <w:r>
-        <w:t>текущих решений</w:t>
-      </w:r>
-      <w:bookmarkEnd w:id="21"/>
-    </w:p>
-    <w:p>
-      <w:r>
-        <w:t xml:space="preserve">На сегодняшний день существуют решения для полноценной персонализации пластиковой карты средствами эмбоссеров </w:t>
-      </w:r>
-      <w:r>
-        <w:rPr>
-          <w:lang w:val="en-US"/>
-        </w:rPr>
-        <w:t>MATICA</w:t>
-      </w:r>
-      <w:r>
-        <w:t xml:space="preserve"> </w:t>
-      </w:r>
-      <w:r>
-        <w:t xml:space="preserve">с помощью </w:t>
-      </w:r>
-      <w:proofErr w:type="spellStart"/>
-      <w:r>
-        <w:rPr>
-          <w:lang w:val="en-US"/>
-        </w:rPr>
-        <w:t>TranzWare</w:t>
-      </w:r>
-      <w:proofErr w:type="spellEnd"/>
-      <w:r>
-        <w:t xml:space="preserve"> </w:t>
-      </w:r>
-      <w:proofErr w:type="spellStart"/>
-      <w:r>
-        <w:rPr>
-          <w:lang w:val="en-US"/>
-        </w:rPr>
-        <w:t>CardFactory</w:t>
-      </w:r>
-      <w:proofErr w:type="spellEnd"/>
-      <w:r>
-        <w:t xml:space="preserve">, но ни одно из этих решений не взаимодействует с кардридерным модулем эмбоссера, отчего процесс выпуска получается медленным и неэффективным. В рамках данного раздела будут рассмотрены текущие решения по персонализации карт средствами </w:t>
-      </w:r>
-      <w:r>
-        <w:t xml:space="preserve">эмбоссеров </w:t>
-      </w:r>
-      <w:r>
-        <w:rPr>
-          <w:lang w:val="en-US"/>
-        </w:rPr>
-        <w:t>MATICA</w:t>
-      </w:r>
-      <w:r>
-        <w:t xml:space="preserve">, </w:t>
-      </w:r>
-      <w:r>
-        <w:t xml:space="preserve">а также схему работы таких решений. Кроме того в данном разделе будет проанализировано объектное дерево других крадридерных драйверов для выяснения общих компонентов, которые должны присутствовать внутри любого кардридерного драйвера внутри </w:t>
-      </w:r>
-      <w:proofErr w:type="spellStart"/>
-      <w:r>
-        <w:rPr>
-          <w:lang w:val="en-US"/>
-        </w:rPr>
-        <w:t>CardFactory</w:t>
-      </w:r>
-      <w:proofErr w:type="spellEnd"/>
-      <w:r>
-        <w:t xml:space="preserve"> </w:t>
-      </w:r>
-      <w:r>
-        <w:t>для его правильной работы. На основании этих данных будет составлен шаблон объектного дерева кардридерного драйвера,</w:t>
-      </w:r>
-      <w:r>
-        <w:t xml:space="preserve"> </w:t>
-      </w:r>
-      <w:r>
-        <w:t>который позже будет использоваться как основа для разработки драйвера</w:t>
-      </w:r>
-      <w:r>
-        <w:t>.</w:t>
-      </w:r>
-    </w:p>
-    <w:p>
-      <w:pPr>
-        <w:pStyle w:val="Heading3"/>
-      </w:pPr>
-      <w:bookmarkStart w:id="22" w:name="_Toc200560473"/>
-      <w:r>
-        <w:t xml:space="preserve">1.3.1 </w:t>
-      </w:r>
-      <w:r>
-        <w:t xml:space="preserve">Анализ кардридерных драйверов продукта </w:t>
-      </w:r>
-      <w:proofErr w:type="spellStart"/>
-      <w:r>
-        <w:rPr>
-          <w:lang w:val="en-US"/>
-        </w:rPr>
-        <w:t>TranzWare</w:t>
-      </w:r>
-      <w:proofErr w:type="spellEnd"/>
-      <w:r>
-        <w:t xml:space="preserve"> </w:t>
-      </w:r>
-      <w:proofErr w:type="spellStart"/>
-      <w:r>
-        <w:rPr>
-          <w:lang w:val="en-US"/>
-        </w:rPr>
-        <w:t>CardFactory</w:t>
-      </w:r>
-      <w:bookmarkEnd w:id="22"/>
-      <w:proofErr w:type="spellEnd"/>
-    </w:p>
-    <w:p>
-      <w:r>
-        <w:t xml:space="preserve">Всего на текущий момент внутри продукта </w:t>
-      </w:r>
-      <w:proofErr w:type="spellStart"/>
-      <w:r>
-        <w:rPr>
-          <w:lang w:val="en-US"/>
-        </w:rPr>
-        <w:t>TranzWare</w:t>
-      </w:r>
-      <w:proofErr w:type="spellEnd"/>
-      <w:r>
-        <w:t xml:space="preserve"> </w:t>
-      </w:r>
-      <w:proofErr w:type="spellStart"/>
-      <w:r>
-        <w:rPr>
-          <w:lang w:val="en-US"/>
-        </w:rPr>
-        <w:t>CardFactory</w:t>
-      </w:r>
-      <w:proofErr w:type="spellEnd"/>
-      <w:r>
-        <w:t xml:space="preserve"> </w:t>
-      </w:r>
-      <w:r>
-        <w:t xml:space="preserve">присутствует </w:t>
-      </w:r>
-      <w:r>
-        <w:t>25</w:t>
-      </w:r>
-      <w:r>
-        <w:t xml:space="preserve"> </w:t>
-      </w:r>
-      <w:r>
-        <w:t xml:space="preserve">кардридерных драверов, каждый из которых позволяет осуществлять </w:t>
-      </w:r>
-      <w:r>
-        <w:t>взаимодействие</w:t>
-      </w:r>
-      <w:r>
-        <w:t xml:space="preserve"> со своим типом кардридера.</w:t>
-      </w:r>
-      <w:r>
-        <w:t xml:space="preserve"> Конечно, каждый кардридер имеет свое собственную, уникальную, структуру, со всеми необходимыми функциями, объектами настроек и т.д., разработанным специально под кардридер. Не смотря на это, каждый кардридерный драйвер имеет общие с другими элементы, которые необходимы для работы драйверов записи карты. Как было упомянуто в прошлом разделе, все драйвера записи карты используют функции кардридерных драйверов для взаимодействия с картами через кардридеры, поэтому наличие стандартизированного интерфейса взаимодействия между обоими типами драйверов является обязательным условием для безошибочной обработки карты. Такой интерфейс </w:t>
-      </w:r>
-      <w:r>
-        <w:lastRenderedPageBreak/>
-        <w:t xml:space="preserve">взаимодействия, естественно, присутствует между драйверам, иначе средствами </w:t>
-      </w:r>
-      <w:proofErr w:type="spellStart"/>
-      <w:r>
-        <w:rPr>
-          <w:lang w:val="en-US"/>
-        </w:rPr>
-        <w:t>CardFactory</w:t>
-      </w:r>
-      <w:proofErr w:type="spellEnd"/>
-      <w:r>
-        <w:t xml:space="preserve"> </w:t>
-      </w:r>
-      <w:r>
-        <w:t xml:space="preserve">невозможно было бы без наличия программных ошибок осуществить обработку карт. В данном подразделе будет описан такой интерфейс </w:t>
+        <w:t xml:space="preserve">невозможно было бы без наличия программных ошибок осуществить обработку карт. В данном </w:t>
+      </w:r>
+      <w:r>
+        <w:t>пункте</w:t>
+      </w:r>
+      <w:r>
+        <w:t xml:space="preserve"> будет описан такой интерфейс </w:t>
       </w:r>
       <w:r>
         <w:t>взаимодействия и на основании этого будет выявлен «шаблонный» кардридерный драйвер, структура которого впоследствии будет использоваться на этапах проектирования и разработки драйвера. Стоит упомянуть, что для такого интерфейса взаимодействия между драйверами нету никакой документации в базах компании Компас плюс, поэтому</w:t>
@@ -10957,7 +11087,13 @@
     </w:p>
     <w:p>
       <w:r>
-        <w:t xml:space="preserve">По итогу, цель данного подраздела была достигнута. Были проанализированы структуры кардридерных драйверов в совокупности с кодами функций драйверов записи карты. </w:t>
+        <w:t xml:space="preserve">По итогу, цель данного </w:t>
+      </w:r>
+      <w:r>
+        <w:t>пункта</w:t>
+      </w:r>
+      <w:r>
+        <w:t xml:space="preserve"> была достигнута. Были проанализированы структуры кардридерных драйверов в совокупности с кодами функций драйверов записи карты. </w:t>
       </w:r>
       <w:r>
         <w:t>В результате были выявлены общие элементы кардридерных драйверов, которые необходимы для их безошибочного взаимодействия с драйверами записи карт. Полученный список функций будет использоваться на этапах проектирования и разработки, как основа для будущего драйвера.</w:t>
@@ -11090,7 +11226,13 @@
         <w:t xml:space="preserve"> </w:t>
       </w:r>
       <w:r>
-        <w:t xml:space="preserve">не предоставила средств и информации для поддержки такого функционала внутри продукта. В данном подразделе будет рассмотрен актуальный на сегодняшний день процесс персонализации пластиковой банковской карты средствами </w:t>
+        <w:t xml:space="preserve">не предоставила средств и информации для поддержки такого функционала внутри продукта. В данном </w:t>
+      </w:r>
+      <w:r>
+        <w:t>пункте</w:t>
+      </w:r>
+      <w:r>
+        <w:t xml:space="preserve"> будет рассмотрен актуальный на сегодняшний день процесс персонализации пластиковой банковской карты средствами </w:t>
       </w:r>
       <w:proofErr w:type="spellStart"/>
       <w:r>
@@ -11763,7 +11905,13 @@
       </w:r>
       <w:r>
         <w:lastRenderedPageBreak/>
-        <w:t>необходимо решить для полного выполнения поставленных целей. Без определения таких ключевых элементов невозможно адекватно начинать любые процессы, связанные с разработкой драйвера. В связи с этим, на основании материала первой главы возможно составить полные списки задач работы</w:t>
+        <w:t>необходимо решить для полного выполнения поставленных целей. Без определения таких ключевых элементов невозможно адекватно начинать любые процессы, связанные с разработкой драйвера. В связи с этим, на основании материала перво</w:t>
+      </w:r>
+      <w:r>
+        <w:t xml:space="preserve">го раздела </w:t>
+      </w:r>
+      <w:r>
+        <w:t>возможно составить полные списки задач работы</w:t>
       </w:r>
       <w:r>
         <w:t xml:space="preserve">, которые необходимо выполнить для </w:t>
@@ -12017,7 +12165,23 @@
         <w:t xml:space="preserve">. </w:t>
       </w:r>
       <w:r>
-        <w:t>После этого его можно будет включить в новую версию продукта, которая впоследствии уйдет клиентам. Конечно, вполне возможно, что разработка драйвера не будет на этом закончена и в будущем потребуются различные доработки в соответствии с запросами клиентов. Не стоит забывать, что разработка любого программного продукта представляет из себя замкнутый цикл и, рано или поздно, придется вернуться обратно на этап разработки. Конечно, не стоит заострять внимание на возможных будущих доработках драйвера, а сфокусироваться на текущих требованиях, выполнение которых явлется приоритетным.</w:t>
+        <w:t xml:space="preserve">После этого его можно будет включить в новую версию продукта, которая впоследствии уйдет клиентам. Конечно, вполне возможно, что разработка драйвера не будет на этом закончена и в будущем потребуются различные доработки в соответствии с запросами клиентов. Не стоит забывать, что разработка любого программного продукта представляет из себя замкнутый цикл и, рано или поздно, придется вернуться обратно на этап разработки. </w:t>
+      </w:r>
+      <w:r>
+        <w:t>Но все же, не смотря на это</w:t>
+      </w:r>
+      <w:r>
+        <w:t xml:space="preserve">, не стоит заострять внимание на </w:t>
+      </w:r>
+      <w:r>
+        <w:lastRenderedPageBreak/>
+        <w:t>возможных будущих доработках драйвера, а</w:t>
+      </w:r>
+      <w:r>
+        <w:t xml:space="preserve"> следует</w:t>
+      </w:r>
+      <w:r>
+        <w:t xml:space="preserve"> сфокусироваться на текущих требованиях, выполнение которых явлется приоритетным.</w:t>
       </w:r>
     </w:p>
     <w:p>
@@ -12026,14 +12190,19 @@
       </w:pPr>
       <w:bookmarkStart w:id="25" w:name="_Toc200560476"/>
       <w:r>
-        <w:lastRenderedPageBreak/>
         <w:t>1.5 Выводы</w:t>
       </w:r>
       <w:bookmarkEnd w:id="25"/>
     </w:p>
     <w:p>
       <w:r>
-        <w:t>Как было упомянуто в предыдущем разделе, любой процесс разработки представляет из себя долгий и трудоемкий процесс. Он состоит из нескольких этапов, каждый из которых необходимо выполнить для осуществления полноценной разработки программного продукта. Можно сказать, что этап анализа и исследования предметной области является самым важным этапом во всем процессе разработки. Без его выполнения, у разработчиков не будет четкого понимания с чего начинать процесс разработки, с каким программным обеспечением придется иметь дело и т.д. В общем и целом, возникнет множество проблем, которые существенно замедлят процесс и приведут к появлению огромного количества ошибок, неэффективных решений и возможно даже к накоплению технического долга, что естественно не поспособствует снижению</w:t>
+        <w:t xml:space="preserve">Как было упомянуто в предыдущем </w:t>
+      </w:r>
+      <w:r>
+        <w:t>под</w:t>
+      </w:r>
+      <w:r>
+        <w:t>разделе, любой процесс разработки представляет из себя долгий и трудоемкий процесс. Он состоит из нескольких этапов, каждый из которых необходимо выполнить для осуществления полноценной разработки программного продукта. Можно сказать, что этап анализа и исследования предметной области является самым важным этапом во всем процессе разработки. Без его выполнения, у разработчиков не будет четкого понимания с чего начинать процесс разработки, с каким программным обеспечением придется иметь дело и т.д. В общем и целом, возникнет множество проблем, которые существенно замедлят процесс и приведут к появлению огромного количества ошибок, неэффективных решений и возможно даже к накоплению технического долга, что естественно не поспособствует снижению</w:t>
       </w:r>
       <w:r>
         <w:t xml:space="preserve"> трудозатрат на разработку.</w:t>
@@ -12041,7 +12210,13 @@
     </w:p>
     <w:p>
       <w:r>
-        <w:t>В рамках данной главы было проведено доскональное исследование и анализ всех элементов работы, необходимых для понимания ее контекста и средств, которые будут использоваться в процессе разработки драйвера. В целом, можно подвести краткие итоги данной главы в виде списка с небольшим описанием основных элементов, подвергавшихся анализу:</w:t>
+        <w:t>В рамках данно</w:t>
+      </w:r>
+      <w:r>
+        <w:t>го раздела</w:t>
+      </w:r>
+      <w:r>
+        <w:t xml:space="preserve"> было проведено доскональное исследование и анализ всех элементов работы, необходимых для понимания ее контекста и средств, которые будут использоваться в процессе разработки драйвера. В целом, можно подвести краткие итоги данной главы в виде списка с небольшим описанием основных элементов, подвергавшихся анализу:</w:t>
       </w:r>
     </w:p>
     <w:p>
@@ -12121,7 +12296,11 @@
         <w:t xml:space="preserve">который отвечает за запись информации на чип карты. Он состоит из трех элементов: блока питания, управляющей платы и кардридеров. Все взаимодействия осуществляется только через управляющую плату. К плате может быть подключено несколько кардридеров для параллельной записи нескольких карт. </w:t>
       </w:r>
       <w:r>
-        <w:t xml:space="preserve">Взаимодействие с модулем осуществляется по сети, по протоколу </w:t>
+        <w:t xml:space="preserve">Взаимодействие с </w:t>
+      </w:r>
+      <w:r>
+        <w:lastRenderedPageBreak/>
+        <w:t xml:space="preserve">модулем осуществляется по сети, по протоколу </w:t>
       </w:r>
       <w:r>
         <w:rPr>
@@ -12154,11 +12333,7 @@
         <w:t>-</w:t>
       </w:r>
       <w:r>
-        <w:t xml:space="preserve">адрес – адрес управляющей платы. Адреса каждого отдельного </w:t>
-      </w:r>
-      <w:r>
-        <w:lastRenderedPageBreak/>
-        <w:t xml:space="preserve">кардриедра вычисляются добавлением номера ридера к младшему байту базового адреса. Команды модулю отправляются строкой текста с кодом на языке </w:t>
+        <w:t xml:space="preserve">адрес – адрес управляющей платы. Адреса каждого отдельного кардриедра вычисляются добавлением номера ридера к младшему байту базового адреса. Команды модулю отправляются строкой текста с кодом на языке </w:t>
       </w:r>
       <w:proofErr w:type="spellStart"/>
       <w:r>
@@ -12293,7 +12468,11 @@
         <w:t xml:space="preserve"> – </w:t>
       </w:r>
       <w:r>
-        <w:t xml:space="preserve">карточный продукт. Карточный продукт состоит из набора модулей – этапов обработки карты. Каждому модулю соответствуют модуль настройки и модуль обработки. Модули настройки имеют графический интерфейс для настройки параметров обработки. Все параметры могут записываться или в базу данных или в файлы. Модули обработки последовательно запускаются, когда запускается обработка модуле </w:t>
+        <w:t xml:space="preserve">карточный продукт. Карточный продукт состоит из набора модулей – этапов обработки карты. Каждому модулю соответствуют модуль настройки и модуль обработки. Модули настройки имеют графический интерфейс для настройки параметров обработки. Все параметры могут записываться или в базу данных или в файлы. Модули обработки последовательно запускаются, </w:t>
+      </w:r>
+      <w:r>
+        <w:lastRenderedPageBreak/>
+        <w:t xml:space="preserve">когда запускается обработка модуле </w:t>
       </w:r>
       <w:r>
         <w:rPr>
@@ -12305,11 +12484,7 @@
         <w:t xml:space="preserve">. </w:t>
       </w:r>
       <w:r>
-        <w:t xml:space="preserve">Каждый модуль обработки подгружает настройки и выполняет необходимые действия, после этого </w:t>
-      </w:r>
-      <w:r>
-        <w:lastRenderedPageBreak/>
-        <w:t>запускается следующий. Работа всех модулей записывается в специальную трассу.</w:t>
+        <w:t>Каждый модуль обработки подгружает настройки и выполняет необходимые действия, после этого запускается следующий. Работа всех модулей записывается в специальную трассу.</w:t>
       </w:r>
     </w:p>
     <w:p>
@@ -12389,7 +12564,19 @@
     </w:p>
     <w:p>
       <w:r>
-        <w:t xml:space="preserve">Таким образом, все приведенные в данной главе результаты анализа послужат прочной основой для выполнения поставленных целей и задач. Учитывая данные анализа, в следующей главе будет выполнено проектирование проектного решения драйвера </w:t>
+        <w:t>Таким образом, все приведенные в данно</w:t>
+      </w:r>
+      <w:r>
+        <w:t>м разделе</w:t>
+      </w:r>
+      <w:r>
+        <w:t xml:space="preserve"> результаты анализа послужат прочной основой для выполнения поставленных цел</w:t>
+      </w:r>
+      <w:r>
+        <w:t>и</w:t>
+      </w:r>
+      <w:r>
+        <w:t xml:space="preserve"> и задач. Учитывая данные анализа, в следующей главе будет выполнено проектирование проектного решения драйвера </w:t>
       </w:r>
       <w:r>
         <w:t xml:space="preserve">прямого управления кардридерным модулем эмбоссера </w:t>
@@ -12467,7 +12654,13 @@
     </w:p>
     <w:p>
       <w:r>
-        <w:t>В данном разделе описыва</w:t>
+        <w:t xml:space="preserve">В данном </w:t>
+      </w:r>
+      <w:r>
+        <w:t>под</w:t>
+      </w:r>
+      <w:r>
+        <w:t>разделе описыва</w:t>
       </w:r>
       <w:r>
         <w:t>ю</w:t>
@@ -12500,7 +12693,16 @@
         <w:t xml:space="preserve"> </w:t>
       </w:r>
       <w:r>
-        <w:t>Они помогают разработчикам четко понимать, какого результата нужно добиться в конечном итоге, и помогают легче планировать дальнейшую разработку и разбивать весь процесс на отдельные части. Все функциональные требования будут разбиты на категории, в соответствии с частями функционала драйвера, который они описывают.</w:t>
+        <w:t>Они помогают разработчикам четко понимать, какого результата нужно добиться в конечном итоге, и помогают легче планировать дальнейшую разработку и разбивать весь процесс на отдельные части</w:t>
+      </w:r>
+      <w:r>
+        <w:t xml:space="preserve"> </w:t>
+      </w:r>
+      <w:r>
+        <w:t>[5,7]</w:t>
+      </w:r>
+      <w:r>
+        <w:t>. Все функциональные требования будут разбиты на категории, в соответствии с частями функционала драйвера, который они описывают.</w:t>
       </w:r>
       <w:r>
         <w:t xml:space="preserve"> </w:t>
@@ -12924,7 +13126,13 @@
         <w:t xml:space="preserve"> </w:t>
       </w:r>
       <w:r>
-        <w:t>Этот раздел определил</w:t>
+        <w:t xml:space="preserve">Этот </w:t>
+      </w:r>
+      <w:r>
+        <w:t>под</w:t>
+      </w:r>
+      <w:r>
+        <w:t>раздел определил</w:t>
       </w:r>
       <w:r>
         <w:t xml:space="preserve"> полный список</w:t>
@@ -12951,11 +13159,23 @@
         <w:t>.</w:t>
       </w:r>
       <w:r>
-        <w:t xml:space="preserve"> В следующих </w:t>
+        <w:t xml:space="preserve"> В </w:t>
       </w:r>
       <w:r>
         <w:lastRenderedPageBreak/>
-        <w:t>разделах будут рассмотрены нефункциональные требования и ограничения, а также архитектура драйвера.</w:t>
+        <w:t xml:space="preserve">следующих </w:t>
+      </w:r>
+      <w:r>
+        <w:t>под</w:t>
+      </w:r>
+      <w:r>
+        <w:t xml:space="preserve">разделах будут рассмотрены нефункциональные требования и ограничения, а также </w:t>
+      </w:r>
+      <w:r>
+        <w:t xml:space="preserve">функциональная схема </w:t>
+      </w:r>
+      <w:r>
+        <w:t>драйвера.</w:t>
       </w:r>
     </w:p>
     <w:p>
@@ -12973,7 +13193,13 @@
     </w:p>
     <w:p>
       <w:r>
-        <w:t>Этот раздел представляет функциональн</w:t>
+        <w:t xml:space="preserve">Этот </w:t>
+      </w:r>
+      <w:r>
+        <w:t>под</w:t>
+      </w:r>
+      <w:r>
+        <w:t>раздел представляет функциональн</w:t>
       </w:r>
       <w:r>
         <w:t>ые</w:t>
@@ -13176,10 +13402,10 @@
           <w:lang w:val="en-US"/>
         </w:rPr>
         <w:drawing>
-          <wp:inline distT="0" distB="0" distL="0" distR="0" wp14:anchorId="3EC5CE9F" wp14:editId="7AE3E37D">
-            <wp:extent cx="6296711" cy="6903720"/>
-            <wp:effectExtent l="0" t="0" r="8890" b="0"/>
-            <wp:docPr id="189837880" name="Picture 3"/>
+          <wp:inline distT="0" distB="0" distL="0" distR="0" wp14:anchorId="268C7270" wp14:editId="5E793A4C">
+            <wp:extent cx="6498142" cy="7113865"/>
+            <wp:effectExtent l="0" t="0" r="0" b="0"/>
+            <wp:docPr id="1682030211" name="Picture 3"/>
             <wp:cNvGraphicFramePr>
               <a:graphicFrameLocks xmlns:a="http://schemas.openxmlformats.org/drawingml/2006/main" noChangeAspect="1"/>
             </wp:cNvGraphicFramePr>
@@ -13208,7 +13434,7 @@
                   <pic:spPr bwMode="auto">
                     <a:xfrm>
                       <a:off x="0" y="0"/>
-                      <a:ext cx="6304952" cy="6912756"/>
+                      <a:ext cx="6502452" cy="7118583"/>
                     </a:xfrm>
                     <a:prstGeom prst="rect">
                       <a:avLst/>
@@ -13229,6 +13455,9 @@
       <w:pPr>
         <w:ind w:firstLine="0"/>
         <w:jc w:val="center"/>
+        <w:rPr>
+          <w:lang w:val="en-US"/>
+        </w:rPr>
       </w:pPr>
       <w:r>
         <w:t>Рисунок 2.2 Функциональная схема работы</w:t>
@@ -13283,12 +13512,53 @@
       </w:r>
     </w:p>
     <w:p>
-      <w:pPr>
-        <w:ind w:firstLine="0"/>
-        <w:jc w:val="left"/>
-      </w:pPr>
-      <w:r>
-        <w:br w:type="page"/>
+      <w:r>
+        <w:t xml:space="preserve">Данная схема несет ключевую роль в разработке кардридерного драйвера. Она отражает </w:t>
+      </w:r>
+      <w:r>
+        <w:t xml:space="preserve">всю схему работы модуля обработки </w:t>
+      </w:r>
+      <w:r>
+        <w:rPr>
+          <w:lang w:val="en-US"/>
+        </w:rPr>
+        <w:t>Chip</w:t>
+      </w:r>
+      <w:r>
+        <w:t xml:space="preserve"> </w:t>
+      </w:r>
+      <w:r>
+        <w:rPr>
+          <w:lang w:val="en-US"/>
+        </w:rPr>
+        <w:t>Writer</w:t>
+      </w:r>
+      <w:r>
+        <w:t xml:space="preserve"> </w:t>
+      </w:r>
+      <w:r>
+        <w:rPr>
+          <w:lang w:val="en-US"/>
+        </w:rPr>
+        <w:t>Driver</w:t>
+      </w:r>
+      <w:r>
+        <w:t xml:space="preserve"> </w:t>
+      </w:r>
+      <w:r>
+        <w:t xml:space="preserve">с использованием будущего кардридерного драйвера </w:t>
+      </w:r>
+      <w:r>
+        <w:rPr>
+          <w:lang w:val="en-US"/>
+        </w:rPr>
+        <w:t>MATICA</w:t>
+      </w:r>
+      <w:r>
+        <w:t>.</w:t>
+      </w:r>
+      <w:r>
+        <w:t xml:space="preserve"> Полное описание схемы будет представлено в будущих пунктах текущего подраздела.</w:t>
       </w:r>
     </w:p>
     <w:p>
@@ -14087,7 +14357,13 @@
     </w:p>
     <w:p>
       <w:r>
-        <w:t>Для функциональной схемы работы драйвера записи карты рассмотрение потока данных и управления не требуется, так как сама схема достаточно прямолинейна и призвана только показать насколько работа драйвера зависит от функций сопустсвующего ему кардридерного драйвера.</w:t>
+        <w:t>Для функциональной схемы работы драйвера записи карты рассмотрение потока данных и управления не требуется, так как сама схема достаточно прямолинейна и призвана только показать насколько работа драйвера</w:t>
+      </w:r>
+      <w:r>
+        <w:t xml:space="preserve"> сильно</w:t>
+      </w:r>
+      <w:r>
+        <w:t xml:space="preserve"> зависит от функций сопустсвующего ему кардридерного драйвера.</w:t>
       </w:r>
     </w:p>
     <w:p>
@@ -14108,7 +14384,13 @@
     </w:p>
     <w:p>
       <w:r>
-        <w:t xml:space="preserve">В изображаемых функциональных схемах достаточно затруднительно рассмотреть все возможные ситуации и варианты развития событий происходящих процессов. Данный подраздел призван рассмотреть все возможные альтернативные сценарии, которые могут произойти при течении процессов, представленных в рассмотренных функциональных схемах. Все сценарии будут представлены в виде списка с указанием </w:t>
+        <w:t xml:space="preserve">В изображаемых функциональных схемах достаточно затруднительно рассмотреть все возможные ситуации и варианты развития событий происходящих процессов. Данный подраздел призван рассмотреть все возможные альтернативные сценарии, которые могут </w:t>
+      </w:r>
+      <w:r>
+        <w:t>произойти</w:t>
+      </w:r>
+      <w:r>
+        <w:t xml:space="preserve"> при течении процессов, представленных в рассмотренных функциональных схемах. Все сценарии будут представлены в виде списка с указанием </w:t>
       </w:r>
       <w:r>
         <w:t>функциональной схемы, в процессах которой он может возникнуть, при каких условиях он возникает и к чему приводит его появление.</w:t>
@@ -14150,7 +14432,14 @@
     </w:p>
     <w:p>
       <w:r>
-        <w:t xml:space="preserve">Альтернативыне сценарии процессов схемы работы модуля обработки </w:t>
+        <w:lastRenderedPageBreak/>
+        <w:t>Альтернатив</w:t>
+      </w:r>
+      <w:r>
+        <w:t>ные</w:t>
+      </w:r>
+      <w:r>
+        <w:t xml:space="preserve"> сценарии процессов схемы работы модуля обработки </w:t>
       </w:r>
       <w:r>
         <w:rPr>
@@ -14190,7 +14479,6 @@
         <w:ind w:left="450"/>
       </w:pPr>
       <w:r>
-        <w:lastRenderedPageBreak/>
         <w:t xml:space="preserve">Ошибка загрузки драйверов: Драйверы были указаны неверно или же отсустсвуют файлы, содержащие </w:t>
       </w:r>
       <w:r>
@@ -14320,7 +14608,13 @@
         <w:t xml:space="preserve">инструментальных средств разработки </w:t>
       </w:r>
       <w:r>
-        <w:t xml:space="preserve">был продиктован требованиями поставленного технического задания. В данном разделе будет рассмотрен список </w:t>
+        <w:t xml:space="preserve">был продиктован требованиями поставленного технического задания. В данном </w:t>
+      </w:r>
+      <w:r>
+        <w:t>под</w:t>
+      </w:r>
+      <w:r>
+        <w:t xml:space="preserve">разделе будет рассмотрен список </w:t>
       </w:r>
       <w:r>
         <w:t xml:space="preserve">таких </w:t>
@@ -14349,6 +14643,7 @@
     </w:p>
     <w:p>
       <w:r>
+        <w:lastRenderedPageBreak/>
         <w:t xml:space="preserve">В качестве ОС для базирования разработки в соответствии с техническими требованиями </w:t>
       </w:r>
       <w:r>
@@ -14373,11 +14668,7 @@
         <w:t xml:space="preserve">. </w:t>
       </w:r>
       <w:r>
-        <w:t xml:space="preserve">На </w:t>
-      </w:r>
-      <w:r>
-        <w:lastRenderedPageBreak/>
-        <w:t xml:space="preserve">данной системе </w:t>
+        <w:t xml:space="preserve">На данной системе </w:t>
       </w:r>
       <w:r>
         <w:t>разработана</w:t>
@@ -14698,7 +14989,11 @@
         <w:t>инструментов, присутствующих в языке,</w:t>
       </w:r>
       <w:r>
-        <w:t xml:space="preserve"> построен на основе требований к инструментарию для разработки продуктов, разрабатываемых на основе </w:t>
+        <w:t xml:space="preserve"> построен на основе требований к </w:t>
+      </w:r>
+      <w:r>
+        <w:lastRenderedPageBreak/>
+        <w:t xml:space="preserve">инструментарию для разработки продуктов, разрабатываемых на основе </w:t>
       </w:r>
       <w:proofErr w:type="spellStart"/>
       <w:r>
@@ -14723,11 +15018,7 @@
       </w:r>
       <w:proofErr w:type="spellEnd"/>
       <w:r>
-        <w:t xml:space="preserve">. Любой язык программирования напрямую </w:t>
-      </w:r>
-      <w:r>
-        <w:lastRenderedPageBreak/>
-        <w:t xml:space="preserve">влияет на </w:t>
+        <w:t xml:space="preserve">. Любой язык программирования напрямую влияет на </w:t>
       </w:r>
       <w:r>
         <w:t>процесс</w:t>
@@ -15019,6 +15310,7 @@
         <w:rPr>
           <w:lang w:val="en-US"/>
         </w:rPr>
+        <w:lastRenderedPageBreak/>
         <w:t>Designer</w:t>
       </w:r>
       <w:r>
@@ -15040,7 +15332,6 @@
         <w:t xml:space="preserve"> </w:t>
       </w:r>
       <w:r>
-        <w:lastRenderedPageBreak/>
         <w:t xml:space="preserve">разработан с целью служить ключевым средством разработки экосистемы </w:t>
       </w:r>
       <w:proofErr w:type="spellStart"/>
@@ -15260,7 +15551,11 @@
         <w:t>закономерно имеет необходимые встроенные средства отладки и тестирования разработанных продуктов, которые комплементируют имеющиеся средства разработки.</w:t>
       </w:r>
       <w:r>
-        <w:t xml:space="preserve"> Таким средством является приложение </w:t>
+        <w:t xml:space="preserve"> </w:t>
+      </w:r>
+      <w:r>
+        <w:lastRenderedPageBreak/>
+        <w:t xml:space="preserve">Таким средством является приложение </w:t>
       </w:r>
       <w:r>
         <w:rPr>
@@ -15281,11 +15576,7 @@
         <w:t>е</w:t>
       </w:r>
       <w:r>
-        <w:t xml:space="preserve">т облегчить процесс обнаружения </w:t>
-      </w:r>
-      <w:r>
-        <w:lastRenderedPageBreak/>
-        <w:t xml:space="preserve">проблем </w:t>
+        <w:t xml:space="preserve">т облегчить процесс обнаружения проблем </w:t>
       </w:r>
       <w:r>
         <w:t>в работе</w:t>
@@ -15561,6 +15852,7 @@
     </w:p>
     <w:p>
       <w:r>
+        <w:lastRenderedPageBreak/>
         <w:t xml:space="preserve">Кроме инструментов для разработки и тестирования, ни один </w:t>
       </w:r>
       <w:r>
@@ -15585,7 +15877,6 @@
         <w:rPr>
           <w:lang w:val="en-US"/>
         </w:rPr>
-        <w:lastRenderedPageBreak/>
         <w:t>version</w:t>
       </w:r>
       <w:r>
@@ -15846,7 +16137,11 @@
         <w:t>, добавляя собственный функционал в контекстное меню папок с репозиториями, позволяя осуществлять взаимодействие с репозиторием через контекстное меню</w:t>
       </w:r>
       <w:r>
-        <w:t xml:space="preserve"> проводника. Также, утилита изменяет пиктограммы папок и файлов, если они находятся под версионным контролем, добавляя к ним небольшое изображение в зависимости от их статуса: соответствует ревизии – зеленая галочка, файл изменен – красный крест, </w:t>
+        <w:t xml:space="preserve"> проводника. Также, утилита изменяет пиктограммы папок и файлов, если они находятся под версионным контролем, добавляя к ним небольшое изображение в зависимости от их статуса: соответствует ревизии – </w:t>
+      </w:r>
+      <w:r>
+        <w:lastRenderedPageBreak/>
+        <w:t xml:space="preserve">зеленая галочка, файл изменен – красный крест, </w:t>
       </w:r>
       <w:r>
         <w:t>конфликт с ревизией – желтый треугольник с черным восклицательным знаком.</w:t>
@@ -15854,65 +16149,74 @@
     </w:p>
     <w:p>
       <w:r>
+        <w:t>Набор инструментальных средств разработки является основополагающим фактором для разработки</w:t>
+      </w:r>
+      <w:r>
+        <w:t xml:space="preserve"> любого программного продукта</w:t>
+      </w:r>
+      <w:r>
+        <w:t>. Определение такого набора напрямую влияет на скорость разработки, количество допускаемых ошибок и возникаемых багов, масштабируемость проекта, способы распространения проекта и т.д. Инструментальные средства должны быть обязательно определены до начала процесса разработки для того, чтобы четко выбрать самые эффективные для поставленной задачи средства и не останавливать процесс разработки для подбора необходимых инструментов. А иначе возможна такая ситуация, что в процессе разработки проекта будут выявлены недостатки того или иного инструмента и возникнет необходимость перехода на другой. В больших проектах такие переходы могут быть очень трудозатратными, поэтому необходимо по возможности их избегать</w:t>
+      </w:r>
+      <w:r>
+        <w:t xml:space="preserve"> и четко определять набор инструментов, который будет использоваться на протяжении всей жизни проекта, еще на этапе планирования. </w:t>
+      </w:r>
+      <w:r>
+        <w:t xml:space="preserve">Конечно, присутствует возможность оставить уже используемые инструменты, но в таком случае разработчикам придется мириться с их недостатками, что существенно снизит производительность. </w:t>
+      </w:r>
+      <w:r>
+        <w:t xml:space="preserve">Представленный в предыдущем разделе инструментарий удовлетворяет все требованиям для осуществления полноценной разработки и тестирования драйвера прямого управления эмбоссером </w:t>
+      </w:r>
+      <w:r>
+        <w:rPr>
+          <w:lang w:val="en-US"/>
+        </w:rPr>
+        <w:t>MATICA</w:t>
+      </w:r>
+      <w:r>
+        <w:t>.</w:t>
+      </w:r>
+      <w:r>
+        <w:t xml:space="preserve"> Часть представленного инструментария будет использована в следующем разделе для описания процесса проектирования пользовательского интерфейса.</w:t>
+      </w:r>
+    </w:p>
+    <w:p>
+      <w:pPr>
+        <w:pStyle w:val="Heading2"/>
+      </w:pPr>
+      <w:bookmarkStart w:id="33" w:name="_Toc200560484"/>
+      <w:r>
+        <w:t>2.4 Проектирование пользовательского интерфейса</w:t>
+      </w:r>
+      <w:bookmarkEnd w:id="33"/>
+    </w:p>
+    <w:p>
+      <w:r>
+        <w:t xml:space="preserve">В данном </w:t>
+      </w:r>
+      <w:r>
+        <w:t>под</w:t>
+      </w:r>
+      <w:r>
+        <w:t xml:space="preserve">разделе описывается проектирование </w:t>
+      </w:r>
+      <w:r>
+        <w:t xml:space="preserve">доработок </w:t>
+      </w:r>
+      <w:r>
+        <w:t>пользовательского интерфейса (UI) для модуля</w:t>
+      </w:r>
+      <w:r>
+        <w:t xml:space="preserve"> </w:t>
+      </w:r>
+      <w:r>
+        <w:t xml:space="preserve">ChipWriterDriver. UI предназначен для упрощения настройки и управления драйвером, а также для обеспечения удобства взаимодействия с пользователем. В данном случае, мы сосредоточимся на конкретных изменениях, </w:t>
+      </w:r>
+      <w:r>
+        <w:t xml:space="preserve">разработанных для </w:t>
+      </w:r>
+      <w:r>
         <w:lastRenderedPageBreak/>
-        <w:t>Набор инструментальных средств разработки является основополагающим фактором для разработки</w:t>
-      </w:r>
-      <w:r>
-        <w:t xml:space="preserve"> любого программного продукта</w:t>
-      </w:r>
-      <w:r>
-        <w:t>. Определение такого набора напрямую влияет на скорость разработки, количество допускаемых ошибок и возникаемых багов, масштабируемость проекта, способы распространения проекта и т.д. Инструментальные средства должны быть обязательно определены до начала процесса разработки для того, чтобы четко выбрать самые эффективные для поставленной задачи средства и не останавливать процесс разработки для подбора необходимых инструментов. А иначе возможна такая ситуация, что в процессе разработки проекта будут выявлены недостатки того или иного инструмента и возникнет необходимость перехода на другой. В больших проектах такие переходы могут быть очень трудозатратными, поэтому необходимо по возможности их избегать</w:t>
-      </w:r>
-      <w:r>
-        <w:t xml:space="preserve"> и четко определять набор инструментов, который будет использоваться на протяжении всей жизни проекта, еще на этапе планирования. </w:t>
-      </w:r>
-      <w:r>
-        <w:t xml:space="preserve">Конечно, присутствует возможность оставить уже используемые инструменты, но в таком случае разработчикам придется мириться с их недостатками, что существенно снизит производительность. </w:t>
-      </w:r>
-      <w:r>
-        <w:t xml:space="preserve">Представленный в предыдущем разделе инструментарий удовлетворяет все требованиям для осуществления полноценной разработки и тестирования драйвера прямого управления эмбоссером </w:t>
-      </w:r>
-      <w:r>
-        <w:rPr>
-          <w:lang w:val="en-US"/>
-        </w:rPr>
-        <w:t>MATICA</w:t>
-      </w:r>
-      <w:r>
-        <w:t>.</w:t>
-      </w:r>
-      <w:r>
-        <w:t xml:space="preserve"> Часть представленного инструментария будет использована в следующем разделе для описания процесса проектирования пользовательского интерфейса.</w:t>
-      </w:r>
-    </w:p>
-    <w:p>
-      <w:pPr>
-        <w:pStyle w:val="Heading2"/>
-      </w:pPr>
-      <w:bookmarkStart w:id="33" w:name="_Toc200560484"/>
-      <w:r>
-        <w:t>2.4 Проектирование пользовательского интерфейса</w:t>
-      </w:r>
-      <w:bookmarkEnd w:id="33"/>
-    </w:p>
-    <w:p>
-      <w:r>
-        <w:t xml:space="preserve">В данном разделе описывается проектирование </w:t>
-      </w:r>
-      <w:r>
-        <w:t xml:space="preserve">доработок </w:t>
-      </w:r>
-      <w:r>
-        <w:t>пользовательского интерфейса (UI) для модуля</w:t>
-      </w:r>
-      <w:r>
-        <w:t xml:space="preserve"> </w:t>
-      </w:r>
-      <w:r>
-        <w:t xml:space="preserve">ChipWriterDriver. UI предназначен для упрощения настройки и управления драйвером, а также для обеспечения удобства взаимодействия с пользователем. В данном случае, мы сосредоточимся на конкретных изменениях, </w:t>
-      </w:r>
-      <w:r>
-        <w:t>разработанных для осуществления полноценной настройки драйвера управления эмбоссером, которые планируются к внесению</w:t>
+        <w:t>осуществления полноценной настройки драйвера управления эмбоссером, которые планируются к внесению</w:t>
       </w:r>
       <w:r>
         <w:t xml:space="preserve"> в интерфейс.</w:t>
@@ -15924,7 +16228,6 @@
       </w:pPr>
       <w:bookmarkStart w:id="34" w:name="_Toc200560485"/>
       <w:r>
-        <w:lastRenderedPageBreak/>
         <w:t>2.4.1 Общие принципы проектирования интерфейса</w:t>
       </w:r>
       <w:bookmarkEnd w:id="34"/>
@@ -16143,7 +16446,13 @@
         <w:t xml:space="preserve">необходимо определить принципы, которых должен придерживаться готовый интерфейс. </w:t>
       </w:r>
       <w:r>
-        <w:t>Без их определения велик риск получить негативный отзыв от клиентов, которые получат доработки, или же пропустить какой-либо важный компонент.</w:t>
+        <w:t>Без их определения велик риск получить негативный отзыв от клиентов, которые получат доработки, или же пропустить какой-либо важный компонент</w:t>
+      </w:r>
+      <w:r>
+        <w:t xml:space="preserve"> [6]</w:t>
+      </w:r>
+      <w:r>
+        <w:t>.</w:t>
       </w:r>
     </w:p>
     <w:p>
@@ -16175,7 +16484,13 @@
         <w:t xml:space="preserve"> </w:t>
       </w:r>
       <w:r>
-        <w:t xml:space="preserve">для соответствия требованиям к возможности настройки параметров драйвера со стороны пользователя. В данном подразделе будут перечислены </w:t>
+        <w:t xml:space="preserve">для соответствия требованиям к возможности настройки параметров драйвера со стороны пользователя. В данном </w:t>
+      </w:r>
+      <w:r>
+        <w:t>пункте</w:t>
+      </w:r>
+      <w:r>
+        <w:t xml:space="preserve"> будут перечислены </w:t>
       </w:r>
       <w:r>
         <w:t xml:space="preserve">все </w:t>
@@ -16209,6 +16524,7 @@
         <w:rPr>
           <w:lang w:val="en-US"/>
         </w:rPr>
+        <w:lastRenderedPageBreak/>
         <w:t>Smartware</w:t>
       </w:r>
       <w:proofErr w:type="spellEnd"/>
@@ -16259,7 +16575,6 @@
     </w:p>
     <w:p>
       <w:r>
-        <w:lastRenderedPageBreak/>
         <w:t xml:space="preserve">Список спроектированных элементов, планируемых к добавлению в интерфейс модуля </w:t>
       </w:r>
       <w:proofErr w:type="spellStart"/>
@@ -16739,6 +17054,7 @@
         </w:numPr>
       </w:pPr>
       <w:r>
+        <w:lastRenderedPageBreak/>
         <w:t>п</w:t>
       </w:r>
       <w:r>
@@ -16797,7 +17113,6 @@
         </w:numPr>
       </w:pPr>
       <w:r>
-        <w:lastRenderedPageBreak/>
         <w:t>о</w:t>
       </w:r>
       <w:r>
@@ -17014,6 +17329,9 @@
         <w:t>Driver</w:t>
       </w:r>
       <w:r>
+        <w:t xml:space="preserve"> [4]</w:t>
+      </w:r>
+      <w:r>
         <w:t xml:space="preserve">. </w:t>
       </w:r>
       <w:r>
@@ -17041,9 +17359,9 @@
         </w:rPr>
         <w:lastRenderedPageBreak/>
         <w:drawing>
-          <wp:inline distT="0" distB="0" distL="0" distR="0" wp14:anchorId="66FDCDAE" wp14:editId="7EFC1E0D">
-            <wp:extent cx="5054939" cy="8534400"/>
-            <wp:effectExtent l="0" t="0" r="0" b="0"/>
+          <wp:inline distT="0" distB="0" distL="0" distR="0" wp14:anchorId="66FDCDAE" wp14:editId="17C13358">
+            <wp:extent cx="5276880" cy="8909108"/>
+            <wp:effectExtent l="0" t="0" r="0" b="6350"/>
             <wp:docPr id="1917611851" name="Picture 7"/>
             <wp:cNvGraphicFramePr>
               <a:graphicFrameLocks xmlns:a="http://schemas.openxmlformats.org/drawingml/2006/main" noChangeAspect="1"/>
@@ -17073,7 +17391,7 @@
                   <pic:spPr bwMode="auto">
                     <a:xfrm>
                       <a:off x="0" y="0"/>
-                      <a:ext cx="5062997" cy="8548004"/>
+                      <a:ext cx="5292660" cy="8935750"/>
                     </a:xfrm>
                     <a:prstGeom prst="rect">
                       <a:avLst/>
@@ -17137,7 +17455,6 @@
     </w:p>
     <w:p>
       <w:r>
-        <w:lastRenderedPageBreak/>
         <w:t>Как можно заметить, все множество блоков настроек в модели</w:t>
       </w:r>
       <w:r>
@@ -17179,7 +17496,13 @@
     </w:p>
     <w:p>
       <w:r>
-        <w:t>В данной главе были определены основные аспекты разработки драйвера прямого управления эмбоссером, начиная от функциональных требований и заканчивая проектированием пользовательского интерфейса. На основе проведенного анализа можно сделать следующие выводы:</w:t>
+        <w:t xml:space="preserve">В </w:t>
+      </w:r>
+      <w:r>
+        <w:t xml:space="preserve">данном разделе </w:t>
+      </w:r>
+      <w:r>
+        <w:t>были определены основные аспекты разработки драйвера прямого управления эмбоссером, начиная от функциональных требований и заканчивая проектированием пользовательского интерфейса. На основе проведенного анализа можно сделать следующие выводы:</w:t>
       </w:r>
     </w:p>
     <w:p>
@@ -17230,11 +17553,11 @@
         <w:t xml:space="preserve"> </w:t>
       </w:r>
       <w:r>
-        <w:t xml:space="preserve">Разработанная функциональная схема позволила визуализировать архитектуру драйвера и определить взаимодействие между его основными компонентами. Схема наглядно демонстрирует поток данных и управления, что упрощает понимание логики работы </w:t>
+        <w:t xml:space="preserve">Разработанная функциональная схема позволила визуализировать архитектуру драйвера и определить взаимодействие между его основными компонентами. Схема наглядно демонстрирует </w:t>
       </w:r>
       <w:r>
         <w:lastRenderedPageBreak/>
-        <w:t>драйвера и его дальнейшую разработку. Разделение на уровни абстракции (вызывающее приложение, API, ядро драйвера, аппаратный интерфейс, эмбоссер) обеспечивает модульность и гибкость системы.</w:t>
+        <w:t>поток данных и управления, что упрощает понимание логики работы драйвера и его дальнейшую разработку. Разделение на уровни абстракции (вызывающее приложение, API, ядро драйвера, аппаратный интерфейс, эмбоссер) обеспечивает модульность и гибкость системы.</w:t>
       </w:r>
     </w:p>
     <w:p>
@@ -17467,7 +17790,19 @@
     </w:p>
     <w:p>
       <w:r>
-        <w:t>Таким образом, данная глава заложила прочный фундамент для дальнейшей разработки драйвера прямого управления эмбоссером.</w:t>
+        <w:t>Таким образом, данн</w:t>
+      </w:r>
+      <w:r>
+        <w:t>ый</w:t>
+      </w:r>
+      <w:r>
+        <w:t xml:space="preserve"> </w:t>
+      </w:r>
+      <w:r>
+        <w:t>раздел</w:t>
+      </w:r>
+      <w:r>
+        <w:t xml:space="preserve"> заложил прочный фундамент для дальнейшей разработки драйвера прямого управления эмбоссером.</w:t>
       </w:r>
     </w:p>
     <w:p>
@@ -17496,13 +17831,46 @@
     </w:p>
     <w:p>
       <w:r>
-        <w:t>Эта глава посвящена подробному описанию разработанного драйвера прямого управления эмбоссером. В ней будут рассмотрены архитектура драйвера, его компоненты, интерфейс программирования (API), процесс установки и настройки, а также приме</w:t>
+        <w:t>Эт</w:t>
+      </w:r>
+      <w:r>
+        <w:t>от раздел</w:t>
+      </w:r>
+      <w:r>
+        <w:t xml:space="preserve"> посвящен подробному описанию разработанного драйвера прямого управления эмбоссером. В не</w:t>
+      </w:r>
+      <w:r>
+        <w:t>м</w:t>
+      </w:r>
+      <w:r>
+        <w:t xml:space="preserve"> будут рассмотрены архитектура драйвера, его компоненты, а также приме</w:t>
       </w:r>
       <w:r>
         <w:t>ры использования для выполнения записи информации на карту</w:t>
       </w:r>
       <w:r>
-        <w:t>. Целью этой главы является предоставление полного руководства для разработчиков и пользователей, желающих интегрировать и использовать разработанный драйвер в своих приложениях.</w:t>
+        <w:t>. Целью это</w:t>
+      </w:r>
+      <w:r>
+        <w:t>го</w:t>
+      </w:r>
+      <w:r>
+        <w:t xml:space="preserve"> </w:t>
+      </w:r>
+      <w:r>
+        <w:t>раздела</w:t>
+      </w:r>
+      <w:r>
+        <w:t xml:space="preserve"> является предоставление полного руководства для разработчиков и пользователей, желающих </w:t>
+      </w:r>
+      <w:r>
+        <w:t>использовать</w:t>
+      </w:r>
+      <w:r>
+        <w:t xml:space="preserve"> разработанный драйвер в сво</w:t>
+      </w:r>
+      <w:r>
+        <w:t>ей работе. Кроме того, целью раздела является полное описание проектного решения драйвера.</w:t>
       </w:r>
     </w:p>
     <w:p>
@@ -17526,7 +17894,13 @@
     </w:p>
     <w:p>
       <w:r>
-        <w:t>Как было отмечено в прошлых главах, все драйверы для работы с кардридерами имеют одинаковую общую структуру, которой обязательно необходимо придерживаться, чтобы драйвер</w:t>
+        <w:t xml:space="preserve">Как было отмечено в прошлых </w:t>
+      </w:r>
+      <w:r>
+        <w:t>разделах</w:t>
+      </w:r>
+      <w:r>
+        <w:t>, все драйверы для работы с кардридерами имеют одинаковую общую структуру, которой обязательно необходимо придерживаться, чтобы драйвер</w:t>
       </w:r>
       <w:r>
         <w:t>ы</w:t>
@@ -17538,13 +17912,37 @@
         <w:t>ли беспрепятственно использовать его функции.</w:t>
       </w:r>
       <w:r>
-        <w:t xml:space="preserve"> В данном разделе сначала будет рассмотрена общая </w:t>
-      </w:r>
-      <w:r>
-        <w:t>архитектура разработанного драйвера, а потом будет подробно рассмотрено разработанное объектное дерево с описанием всех взаимодействий и связей между объектами. Кроме того, в данной главе будет подробно рассмотрен и описан разработанный код основных объектов-функций драйвера, обеспечивающих его взаимодействие с кардридерным модулем.</w:t>
-      </w:r>
-      <w:r>
-        <w:t xml:space="preserve"> В дополнение к этому будет описаны доработки интерфейса модуля настройки </w:t>
+        <w:t xml:space="preserve"> В данном </w:t>
+      </w:r>
+      <w:r>
+        <w:t>под</w:t>
+      </w:r>
+      <w:r>
+        <w:t xml:space="preserve">разделе сначала будет рассмотрена общая </w:t>
+      </w:r>
+      <w:r>
+        <w:t>архитектура разработанного драйвера, а потом будет подробно рассмотрено разработанное объектное дерево с описанием всех взаимодействий и связей между объектами. Кроме того, в</w:t>
+      </w:r>
+      <w:r>
+        <w:t xml:space="preserve"> одном из пунктов </w:t>
+      </w:r>
+      <w:r>
+        <w:t>данно</w:t>
+      </w:r>
+      <w:r>
+        <w:t>го подраздела</w:t>
+      </w:r>
+      <w:r>
+        <w:t xml:space="preserve"> будет подробно рассмотрен и описан разработанный код основных объектов-функций драйвера, обеспечивающих его взаимодействие с кардридерным модулем.</w:t>
+      </w:r>
+      <w:r>
+        <w:t xml:space="preserve"> В дополнение к этому буд</w:t>
+      </w:r>
+      <w:r>
+        <w:t>у</w:t>
+      </w:r>
+      <w:r>
+        <w:t xml:space="preserve">т описаны доработки интерфейса модуля настройки </w:t>
       </w:r>
       <w:r>
         <w:rPr>
@@ -17589,7 +17987,19 @@
     </w:p>
     <w:p>
       <w:r>
-        <w:t xml:space="preserve">В рамках разработки программных систем, взаимодействующих с аппаратными ресурсами, драйверы выполняют критическую роль посредника между операционной системой и физическими/виртуальными устройствами. Эффективность, надежность и безопасность драйвера напрямую зависят от его архитектурных решений, что обуславливает необходимость разработки надлежащей по требованиям архитектуры. В данном разделе будет </w:t>
+        <w:t>В рамках разработки программных систем, взаимодействующих с аппаратными ресурсами, драйверы выполняют критическую роль посредника между операционной системой и физическими/виртуальными устройствами. Эффективность, надежность и безопасность драйвера напрямую зависят от его архитектурных решений, что обуславливает необходимость разработки надлежащей по требованиям архитектуры</w:t>
+      </w:r>
+      <w:r>
+        <w:t xml:space="preserve"> [8]</w:t>
+      </w:r>
+      <w:r>
+        <w:t xml:space="preserve">. В данном </w:t>
+      </w:r>
+      <w:r>
+        <w:t>пункте</w:t>
+      </w:r>
+      <w:r>
+        <w:t xml:space="preserve"> будет </w:t>
       </w:r>
       <w:r>
         <w:t xml:space="preserve">вкратце </w:t>
@@ -18734,7 +19144,13 @@
         <w:t xml:space="preserve">, </w:t>
       </w:r>
       <w:r>
-        <w:t>описание объектного дерева. В данном подразделе будут в полной мере описаны оба представленных компонента для разработанного драйвера кардридерного модуля, а также для модулей, в которых</w:t>
+        <w:t xml:space="preserve">описание объектного дерева. В данном </w:t>
+      </w:r>
+      <w:r>
+        <w:t>пункте</w:t>
+      </w:r>
+      <w:r>
+        <w:t xml:space="preserve"> будут в полной мере описаны оба представленных компонента для разработанного драйвера кардридерного модуля, а также для модулей, в которых</w:t>
       </w:r>
       <w:r>
         <w:t xml:space="preserve"> в рамках данной работы</w:t>
@@ -21989,10 +22405,22 @@
       </w:r>
       <w:proofErr w:type="spellEnd"/>
       <w:r>
-        <w:t xml:space="preserve">, поэтому данный раздел направлен на освящение </w:t>
-      </w:r>
-      <w:r>
-        <w:t xml:space="preserve">этих моментов для получения полного представления места разработанного драйвера в такой большой программной системе. В данном разделе будет описан процесс настройки и обработки пластиковой банковской карты средствами разработанного кардридерного драйвера с </w:t>
+        <w:t xml:space="preserve">, поэтому данный </w:t>
+      </w:r>
+      <w:r>
+        <w:t>под</w:t>
+      </w:r>
+      <w:r>
+        <w:t xml:space="preserve">раздел направлен на освящение </w:t>
+      </w:r>
+      <w:r>
+        <w:t xml:space="preserve">этих моментов для получения полного представления места разработанного драйвера в такой большой программной системе. В данном </w:t>
+      </w:r>
+      <w:r>
+        <w:t>под</w:t>
+      </w:r>
+      <w:r>
+        <w:t xml:space="preserve">разделе будет описан процесс настройки и обработки пластиковой банковской карты средствами разработанного кардридерного драйвера с </w:t>
       </w:r>
       <w:r>
         <w:lastRenderedPageBreak/>
@@ -22008,7 +22436,13 @@
         <w:t xml:space="preserve"> </w:t>
       </w:r>
       <w:r>
-        <w:t>«с нуля». В каждом подразделе будет подробно описан отдельный этап, необходимый для осуществления обработки.</w:t>
+        <w:t xml:space="preserve">«с нуля». В каждом </w:t>
+      </w:r>
+      <w:r>
+        <w:t>пункте</w:t>
+      </w:r>
+      <w:r>
+        <w:t xml:space="preserve"> будет подробно описан отдельный этап, необходимый для осуществления обработки.</w:t>
       </w:r>
     </w:p>
     <w:p>
@@ -22048,7 +22482,19 @@
         <w:t xml:space="preserve"> </w:t>
       </w:r>
       <w:r>
-        <w:t>всегда начинается с этапа создания и настройки карточного продукта внутри приложения. Как было упомянуто в первой главе, карточный продукт – набор настроек этапов обработки карты, который впоследсвии используется для осуществления непосредственной обработки</w:t>
+        <w:t>всегда начинается с этапа создания и настройки карточного продукта внутри приложения. Как было упомянуто в перво</w:t>
+      </w:r>
+      <w:r>
+        <w:t>м</w:t>
+      </w:r>
+      <w:r>
+        <w:t xml:space="preserve"> </w:t>
+      </w:r>
+      <w:r>
+        <w:t>разделе</w:t>
+      </w:r>
+      <w:r>
+        <w:t>, карточный продукт – набор настроек этапов обработки карты, который впоследсвии используется для осуществления непосредственной обработки</w:t>
       </w:r>
       <w:r>
         <w:t xml:space="preserve"> внутри программной системы</w:t>
@@ -22057,7 +22503,13 @@
         <w:t>.</w:t>
       </w:r>
       <w:r>
-        <w:t xml:space="preserve"> В данном подразделе будет описан процесс создания и настройки нового карточного продукта для обработки пластиковой карты средствами разработанного кардридерного драйвера.</w:t>
+        <w:t xml:space="preserve"> В данном </w:t>
+      </w:r>
+      <w:r>
+        <w:t>пункте</w:t>
+      </w:r>
+      <w:r>
+        <w:t xml:space="preserve"> будет описан процесс создания и настройки нового карточного продукта для обработки пластиковой карты средствами разработанного кардридерного драйвера.</w:t>
       </w:r>
     </w:p>
     <w:p>
@@ -24244,7 +24696,13 @@
         <w:t xml:space="preserve">После успешной настройки карточного продукта можно приступать к подготвке запуска обработки пластиковой карты, а также произвести непосредственный запуск и осуществить обработку карты. Для успешного запуска необходимо подготовить среду и запустить все необходимые средства, которые будут использоваться </w:t>
       </w:r>
       <w:r>
-        <w:t xml:space="preserve">в процессе обработки. В данном подразделе будет описан весь порядок запуска обработки для рассматриваемого тестового сценария с использованием настроенного в прошлом подразделе карточного продукта в среде </w:t>
+        <w:t xml:space="preserve">в процессе обработки. В данном </w:t>
+      </w:r>
+      <w:r>
+        <w:t xml:space="preserve">пункте </w:t>
+      </w:r>
+      <w:r>
+        <w:t xml:space="preserve">будет описан весь порядок запуска обработки для рассматриваемого тестового сценария с использованием настроенного в прошлом подразделе карточного продукта в среде </w:t>
       </w:r>
       <w:proofErr w:type="spellStart"/>
       <w:r>
@@ -24263,7 +24721,44 @@
         <w:t xml:space="preserve">Начнем с подготовки среды для осуществления обработки. </w:t>
       </w:r>
       <w:r>
-        <w:t xml:space="preserve">Единственным средством, которое необходимо для обработки пластиковой карты средствами разработанного кардридерного модуля с использованием кардридерного модуля эмбоссера </w:t>
+        <w:t>Единственным средством</w:t>
+      </w:r>
+      <w:r>
+        <w:t>, кроме</w:t>
+      </w:r>
+      <w:r>
+        <w:t>,</w:t>
+      </w:r>
+      <w:r>
+        <w:t xml:space="preserve"> собственно</w:t>
+      </w:r>
+      <w:r>
+        <w:t>,</w:t>
+      </w:r>
+      <w:r>
+        <w:t xml:space="preserve"> </w:t>
+      </w:r>
+      <w:proofErr w:type="spellStart"/>
+      <w:r>
+        <w:rPr>
+          <w:lang w:val="en-US"/>
+        </w:rPr>
+        <w:t>TranzWare</w:t>
+      </w:r>
+      <w:proofErr w:type="spellEnd"/>
+      <w:r>
+        <w:t xml:space="preserve"> </w:t>
+      </w:r>
+      <w:proofErr w:type="spellStart"/>
+      <w:r>
+        <w:rPr>
+          <w:lang w:val="en-US"/>
+        </w:rPr>
+        <w:t>CardFactory</w:t>
+      </w:r>
+      <w:proofErr w:type="spellEnd"/>
+      <w:r>
+        <w:t xml:space="preserve">, которое необходимо для обработки пластиковой карты средствами разработанного кардридерного модуля с использованием кардридерного модуля эмбоссера </w:t>
       </w:r>
       <w:r>
         <w:rPr>
@@ -24449,8 +24944,11 @@
         <w:t xml:space="preserve">, </w:t>
       </w:r>
       <w:r>
+        <w:t xml:space="preserve">которая будет </w:t>
+      </w:r>
+      <w:r>
         <w:lastRenderedPageBreak/>
-        <w:t xml:space="preserve">которая будет использоваться для передачи управления этапом записи карты на </w:t>
+        <w:t xml:space="preserve">использоваться для передачи управления этапом записи карты на </w:t>
       </w:r>
       <w:proofErr w:type="spellStart"/>
       <w:r>
@@ -25033,7 +25531,19 @@
     </w:p>
     <w:p>
       <w:r>
-        <w:t xml:space="preserve">По итогам данной главы были рассмотрены результаты разработки и внедрения программного решения в продукт </w:t>
+        <w:t>По итогам данно</w:t>
+      </w:r>
+      <w:r>
+        <w:t>го</w:t>
+      </w:r>
+      <w:r>
+        <w:t xml:space="preserve"> </w:t>
+      </w:r>
+      <w:r>
+        <w:t xml:space="preserve">раздела </w:t>
+      </w:r>
+      <w:r>
+        <w:t xml:space="preserve">были рассмотрены результаты разработки и внедрения программного решения в продукт </w:t>
       </w:r>
       <w:proofErr w:type="spellStart"/>
       <w:r>
@@ -25195,10 +25705,34 @@
     </w:p>
     <w:p>
       <w:r>
-        <w:t>Описанные в данной главе элементы помогут лу</w:t>
-      </w:r>
-      <w:r>
-        <w:t xml:space="preserve">чше понять процесс разработки и принятые в этом процессе технические решения. Кроме того данная глава даст понимание неопытным пользователям как проходит процесс настройки и обработки карточного продукта внутри </w:t>
+        <w:t>Описанные в данно</w:t>
+      </w:r>
+      <w:r>
+        <w:t>м</w:t>
+      </w:r>
+      <w:r>
+        <w:t xml:space="preserve"> </w:t>
+      </w:r>
+      <w:r>
+        <w:t>разделе</w:t>
+      </w:r>
+      <w:r>
+        <w:t xml:space="preserve"> элементы помогут лу</w:t>
+      </w:r>
+      <w:r>
+        <w:t>чше понять процесс разработки и принятые в этом процессе технические решения. Кроме того данн</w:t>
+      </w:r>
+      <w:r>
+        <w:t>ый</w:t>
+      </w:r>
+      <w:r>
+        <w:t xml:space="preserve"> </w:t>
+      </w:r>
+      <w:r>
+        <w:t>раздел</w:t>
+      </w:r>
+      <w:r>
+        <w:t xml:space="preserve"> даст понимание неопытным пользователям как проходит процесс настройки и обработки карточного продукта внутри </w:t>
       </w:r>
       <w:proofErr w:type="spellStart"/>
       <w:r>
@@ -26383,11 +26917,29 @@
     <w:p>
       <w:pPr>
         <w:pStyle w:val="Heading1"/>
+        <w:rPr>
+          <w:lang w:val="en-US"/>
+        </w:rPr>
       </w:pPr>
       <w:bookmarkStart w:id="49" w:name="_Toc200560500"/>
       <w:r>
         <w:lastRenderedPageBreak/>
-        <w:t xml:space="preserve">Приложение Б </w:t>
+        <w:t>Приложение</w:t>
+      </w:r>
+      <w:r>
+        <w:rPr>
+          <w:lang w:val="en-US"/>
+        </w:rPr>
+        <w:t xml:space="preserve"> </w:t>
+      </w:r>
+      <w:r>
+        <w:t>Б</w:t>
+      </w:r>
+      <w:r>
+        <w:rPr>
+          <w:lang w:val="en-US"/>
+        </w:rPr>
+        <w:t xml:space="preserve"> </w:t>
       </w:r>
       <w:r>
         <w:t>Листинг</w:t>
@@ -26396,7 +26948,37 @@
         <w:t>и</w:t>
       </w:r>
       <w:r>
-        <w:t xml:space="preserve"> кодов объектов-функций </w:t>
+        <w:rPr>
+          <w:lang w:val="en-US"/>
+        </w:rPr>
+        <w:t xml:space="preserve"> </w:t>
+      </w:r>
+      <w:r>
+        <w:t>кодов</w:t>
+      </w:r>
+      <w:r>
+        <w:rPr>
+          <w:lang w:val="en-US"/>
+        </w:rPr>
+        <w:t xml:space="preserve"> </w:t>
+      </w:r>
+      <w:r>
+        <w:t>объектов</w:t>
+      </w:r>
+      <w:r>
+        <w:rPr>
+          <w:lang w:val="en-US"/>
+        </w:rPr>
+        <w:t>-</w:t>
+      </w:r>
+      <w:r>
+        <w:t>функций</w:t>
+      </w:r>
+      <w:r>
+        <w:rPr>
+          <w:lang w:val="en-US"/>
+        </w:rPr>
+        <w:t xml:space="preserve"> </w:t>
       </w:r>
       <w:r>
         <w:rPr>
@@ -26405,6 +26987,9 @@
         <w:t>WaitCard</w:t>
       </w:r>
       <w:r>
+        <w:rPr>
+          <w:lang w:val="en-US"/>
+        </w:rPr>
         <w:t xml:space="preserve">, </w:t>
       </w:r>
       <w:r>
@@ -26414,10 +26999,19 @@
         <w:t>Restart</w:t>
       </w:r>
       <w:r>
-        <w:t xml:space="preserve"> </w:t>
-      </w:r>
-      <w:r>
-        <w:t xml:space="preserve">и </w:t>
+        <w:rPr>
+          <w:lang w:val="en-US"/>
+        </w:rPr>
+        <w:t xml:space="preserve"> </w:t>
+      </w:r>
+      <w:r>
+        <w:t>и</w:t>
+      </w:r>
+      <w:r>
+        <w:rPr>
+          <w:lang w:val="en-US"/>
+        </w:rPr>
+        <w:t xml:space="preserve"> </w:t>
       </w:r>
       <w:r>
         <w:rPr>

</xml_diff>

<commit_message>
Minor refactoring. Converted doc to pdf for printing.
</commit_message>
<xml_diff>
--- a/Shemyakin_AVb-21-12.docx
+++ b/Shemyakin_AVb-21-12.docx
@@ -414,38 +414,68 @@
           <w:sz w:val="24"/>
           <w:szCs w:val="24"/>
         </w:rPr>
-        <w:t xml:space="preserve">ВКР выполнена на </w:t>
-      </w:r>
-      <w:r>
+        <w:t>ВКР выполнена на</w:t>
+      </w:r>
+      <w:r>
+        <w:rPr>
+          <w:sz w:val="24"/>
+          <w:szCs w:val="24"/>
+        </w:rPr>
+        <w:t xml:space="preserve"> __</w:t>
+      </w:r>
+      <w:r>
+        <w:rPr>
+          <w:sz w:val="24"/>
+          <w:szCs w:val="24"/>
+        </w:rPr>
+        <w:t xml:space="preserve"> страницах</w:t>
+      </w:r>
+    </w:p>
+    <w:p>
+      <w:pPr>
+        <w:spacing w:before="120" w:after="120" w:line="240" w:lineRule="auto"/>
+        <w:rPr>
+          <w:sz w:val="24"/>
+          <w:szCs w:val="24"/>
+        </w:rPr>
+      </w:pPr>
+      <w:r>
+        <w:rPr>
+          <w:sz w:val="24"/>
+          <w:szCs w:val="24"/>
+        </w:rPr>
+        <w:t xml:space="preserve">Графическая часть на </w:t>
+      </w:r>
+      <w:r>
+        <w:rPr>
+          <w:sz w:val="24"/>
+          <w:szCs w:val="24"/>
+        </w:rPr>
+        <w:t xml:space="preserve">__ </w:t>
+      </w:r>
+      <w:r>
+        <w:rPr>
+          <w:sz w:val="24"/>
+          <w:szCs w:val="24"/>
+        </w:rPr>
+        <w:t>листах</w:t>
+      </w:r>
+    </w:p>
+    <w:p>
+      <w:pPr>
+        <w:spacing w:before="120" w:after="120" w:line="240" w:lineRule="auto"/>
         <w:rPr>
           <w:sz w:val="24"/>
           <w:szCs w:val="24"/>
           <w:u w:val="single"/>
         </w:rPr>
-        <w:t>__</w:t>
-      </w:r>
+      </w:pPr>
       <w:r>
         <w:rPr>
           <w:sz w:val="24"/>
           <w:szCs w:val="24"/>
         </w:rPr>
-        <w:t xml:space="preserve"> страницах</w:t>
-      </w:r>
-    </w:p>
-    <w:p>
-      <w:pPr>
-        <w:spacing w:before="120" w:after="120" w:line="240" w:lineRule="auto"/>
-        <w:rPr>
-          <w:sz w:val="24"/>
-          <w:szCs w:val="24"/>
-        </w:rPr>
-      </w:pPr>
-      <w:r>
-        <w:rPr>
-          <w:sz w:val="24"/>
-          <w:szCs w:val="24"/>
-        </w:rPr>
-        <w:t xml:space="preserve">Графическая часть на </w:t>
+        <w:t>Руководитель:</w:t>
       </w:r>
       <w:r>
         <w:rPr>
@@ -453,39 +483,7 @@
           <w:szCs w:val="24"/>
           <w:u w:val="single"/>
         </w:rPr>
-        <w:t>__</w:t>
-      </w:r>
-      <w:r>
-        <w:rPr>
-          <w:sz w:val="24"/>
-          <w:szCs w:val="24"/>
-        </w:rPr>
-        <w:t xml:space="preserve"> листах</w:t>
-      </w:r>
-    </w:p>
-    <w:p>
-      <w:pPr>
-        <w:spacing w:before="120" w:after="120" w:line="240" w:lineRule="auto"/>
-        <w:rPr>
-          <w:sz w:val="24"/>
-          <w:szCs w:val="24"/>
-          <w:u w:val="single"/>
-        </w:rPr>
-      </w:pPr>
-      <w:r>
-        <w:rPr>
-          <w:sz w:val="24"/>
-          <w:szCs w:val="24"/>
-        </w:rPr>
-        <w:t>Руководитель:</w:t>
-      </w:r>
-      <w:r>
-        <w:rPr>
-          <w:sz w:val="24"/>
-          <w:szCs w:val="24"/>
-          <w:u w:val="single"/>
-        </w:rPr>
-        <w:t xml:space="preserve">                                            доцент кафедры ВТ и П, к.т.н. </w:t>
+        <w:t xml:space="preserve">                                          доцент кафедры ВТ и П, к.т.н. </w:t>
       </w:r>
       <w:r>
         <w:rPr>
@@ -1519,6 +1517,38 @@
           <w:color w:val="000000"/>
           <w:sz w:val="24"/>
         </w:rPr>
+        <w:t xml:space="preserve">Техническое задание в системе </w:t>
+      </w:r>
+      <w:r>
+        <w:rPr>
+          <w:color w:val="000000"/>
+          <w:sz w:val="24"/>
+          <w:lang w:val="en-US"/>
+        </w:rPr>
+        <w:t>JIRA</w:t>
+      </w:r>
+    </w:p>
+    <w:p>
+      <w:pPr>
+        <w:pStyle w:val="ListParagraph"/>
+        <w:numPr>
+          <w:ilvl w:val="0"/>
+          <w:numId w:val="35"/>
+        </w:numPr>
+        <w:shd w:val="clear" w:color="auto" w:fill="FFFFFF"/>
+        <w:spacing w:line="240" w:lineRule="auto"/>
+        <w:ind w:left="714" w:hanging="357"/>
+        <w:contextualSpacing w:val="0"/>
+        <w:rPr>
+          <w:color w:val="000000"/>
+          <w:sz w:val="24"/>
+        </w:rPr>
+      </w:pPr>
+      <w:r>
+        <w:rPr>
+          <w:color w:val="000000"/>
+          <w:sz w:val="24"/>
+        </w:rPr>
         <w:t xml:space="preserve">Техническая документация о платформе </w:t>
       </w:r>
       <w:proofErr w:type="spellStart"/>
@@ -2920,7 +2950,7 @@
         <w:sectPr>
           <w:pgSz w:w="11906" w:h="16838"/>
           <w:pgMar w:top="426" w:right="850" w:bottom="1134" w:left="1701" w:header="708" w:footer="708" w:gutter="0"/>
-          <w:pgNumType w:start="3"/>
+          <w:pgNumType w:start="7"/>
           <w:cols w:space="708"/>
           <w:titlePg/>
           <w:docGrid w:linePitch="381"/>
@@ -3725,7 +3755,7 @@
                 <w:noProof/>
                 <w:webHidden/>
               </w:rPr>
-              <w:t>6</w:t>
+              <w:t>10</w:t>
             </w:r>
             <w:r>
               <w:rPr>
@@ -3797,7 +3827,7 @@
                 <w:noProof/>
                 <w:webHidden/>
               </w:rPr>
-              <w:t>9</w:t>
+              <w:t>13</w:t>
             </w:r>
             <w:r>
               <w:rPr>
@@ -3880,7 +3910,7 @@
                 <w:noProof/>
                 <w:webHidden/>
               </w:rPr>
-              <w:t>9</w:t>
+              <w:t>13</w:t>
             </w:r>
             <w:r>
               <w:rPr>
@@ -3955,7 +3985,7 @@
                 <w:noProof/>
                 <w:webHidden/>
               </w:rPr>
-              <w:t>9</w:t>
+              <w:t>13</w:t>
             </w:r>
             <w:r>
               <w:rPr>
@@ -4030,7 +4060,7 @@
                 <w:noProof/>
                 <w:webHidden/>
               </w:rPr>
-              <w:t>12</w:t>
+              <w:t>16</w:t>
             </w:r>
             <w:r>
               <w:rPr>
@@ -4113,7 +4143,7 @@
                 <w:noProof/>
                 <w:webHidden/>
               </w:rPr>
-              <w:t>14</w:t>
+              <w:t>18</w:t>
             </w:r>
             <w:r>
               <w:rPr>
@@ -4196,7 +4226,7 @@
                 <w:noProof/>
                 <w:webHidden/>
               </w:rPr>
-              <w:t>15</w:t>
+              <w:t>19</w:t>
             </w:r>
             <w:r>
               <w:rPr>
@@ -4279,7 +4309,7 @@
                 <w:noProof/>
                 <w:webHidden/>
               </w:rPr>
-              <w:t>16</w:t>
+              <w:t>20</w:t>
             </w:r>
             <w:r>
               <w:rPr>
@@ -4377,7 +4407,7 @@
                 <w:noProof/>
                 <w:webHidden/>
               </w:rPr>
-              <w:t>20</w:t>
+              <w:t>24</w:t>
             </w:r>
             <w:r>
               <w:rPr>
@@ -4475,7 +4505,7 @@
                 <w:noProof/>
                 <w:webHidden/>
               </w:rPr>
-              <w:t>24</w:t>
+              <w:t>28</w:t>
             </w:r>
             <w:r>
               <w:rPr>
@@ -4550,7 +4580,7 @@
                 <w:noProof/>
                 <w:webHidden/>
               </w:rPr>
-              <w:t>26</w:t>
+              <w:t>30</w:t>
             </w:r>
             <w:r>
               <w:rPr>
@@ -4648,7 +4678,7 @@
                 <w:noProof/>
                 <w:webHidden/>
               </w:rPr>
-              <w:t>26</w:t>
+              <w:t>30</w:t>
             </w:r>
             <w:r>
               <w:rPr>
@@ -4731,7 +4761,7 @@
                 <w:noProof/>
                 <w:webHidden/>
               </w:rPr>
-              <w:t>28</w:t>
+              <w:t>32</w:t>
             </w:r>
             <w:r>
               <w:rPr>
@@ -4806,7 +4836,7 @@
                 <w:noProof/>
                 <w:webHidden/>
               </w:rPr>
-              <w:t>30</w:t>
+              <w:t>34</w:t>
             </w:r>
             <w:r>
               <w:rPr>
@@ -4881,7 +4911,7 @@
                 <w:noProof/>
                 <w:webHidden/>
               </w:rPr>
-              <w:t>32</w:t>
+              <w:t>36</w:t>
             </w:r>
             <w:r>
               <w:rPr>
@@ -4976,7 +5006,7 @@
                 <w:noProof/>
                 <w:webHidden/>
               </w:rPr>
-              <w:t>35</w:t>
+              <w:t>39</w:t>
             </w:r>
             <w:r>
               <w:rPr>
@@ -5051,7 +5081,7 @@
                 <w:noProof/>
                 <w:webHidden/>
               </w:rPr>
-              <w:t>35</w:t>
+              <w:t>39</w:t>
             </w:r>
             <w:r>
               <w:rPr>
@@ -5126,7 +5156,7 @@
                 <w:noProof/>
                 <w:webHidden/>
               </w:rPr>
-              <w:t>37</w:t>
+              <w:t>41</w:t>
             </w:r>
             <w:r>
               <w:rPr>
@@ -5201,7 +5231,7 @@
                 <w:noProof/>
                 <w:webHidden/>
               </w:rPr>
-              <w:t>41</w:t>
+              <w:t>45</w:t>
             </w:r>
             <w:r>
               <w:rPr>
@@ -5276,7 +5306,7 @@
                 <w:noProof/>
                 <w:webHidden/>
               </w:rPr>
-              <w:t>42</w:t>
+              <w:t>46</w:t>
             </w:r>
             <w:r>
               <w:rPr>
@@ -5351,7 +5381,7 @@
                 <w:noProof/>
                 <w:webHidden/>
               </w:rPr>
-              <w:t>44</w:t>
+              <w:t>48</w:t>
             </w:r>
             <w:r>
               <w:rPr>
@@ -5426,7 +5456,7 @@
                 <w:noProof/>
                 <w:webHidden/>
               </w:rPr>
-              <w:t>45</w:t>
+              <w:t>49</w:t>
             </w:r>
             <w:r>
               <w:rPr>
@@ -5501,7 +5531,7 @@
                 <w:noProof/>
                 <w:webHidden/>
               </w:rPr>
-              <w:t>51</w:t>
+              <w:t>55</w:t>
             </w:r>
             <w:r>
               <w:rPr>
@@ -5576,7 +5606,7 @@
                 <w:noProof/>
                 <w:webHidden/>
               </w:rPr>
-              <w:t>52</w:t>
+              <w:t>56</w:t>
             </w:r>
             <w:r>
               <w:rPr>
@@ -5651,7 +5681,7 @@
                 <w:noProof/>
                 <w:webHidden/>
               </w:rPr>
-              <w:t>52</w:t>
+              <w:t>56</w:t>
             </w:r>
             <w:r>
               <w:rPr>
@@ -5726,7 +5756,7 @@
                 <w:noProof/>
                 <w:webHidden/>
               </w:rPr>
-              <w:t>54</w:t>
+              <w:t>58</w:t>
             </w:r>
             <w:r>
               <w:rPr>
@@ -5801,7 +5831,7 @@
                 <w:noProof/>
                 <w:webHidden/>
               </w:rPr>
-              <w:t>56</w:t>
+              <w:t>60</w:t>
             </w:r>
             <w:r>
               <w:rPr>
@@ -5873,7 +5903,7 @@
                 <w:noProof/>
                 <w:webHidden/>
               </w:rPr>
-              <w:t>58</w:t>
+              <w:t>62</w:t>
             </w:r>
             <w:r>
               <w:rPr>
@@ -5948,7 +5978,7 @@
                 <w:noProof/>
                 <w:webHidden/>
               </w:rPr>
-              <w:t>58</w:t>
+              <w:t>62</w:t>
             </w:r>
             <w:r>
               <w:rPr>
@@ -6023,7 +6053,7 @@
                 <w:noProof/>
                 <w:webHidden/>
               </w:rPr>
-              <w:t>58</w:t>
+              <w:t>62</w:t>
             </w:r>
             <w:r>
               <w:rPr>
@@ -6098,7 +6128,7 @@
                 <w:noProof/>
                 <w:webHidden/>
               </w:rPr>
-              <w:t>62</w:t>
+              <w:t>66</w:t>
             </w:r>
             <w:r>
               <w:rPr>
@@ -6173,7 +6203,7 @@
                 <w:noProof/>
                 <w:webHidden/>
               </w:rPr>
-              <w:t>71</w:t>
+              <w:t>75</w:t>
             </w:r>
             <w:r>
               <w:rPr>
@@ -6248,7 +6278,7 @@
                 <w:noProof/>
                 <w:webHidden/>
               </w:rPr>
-              <w:t>72</w:t>
+              <w:t>76</w:t>
             </w:r>
             <w:r>
               <w:rPr>
@@ -6323,7 +6353,7 @@
                 <w:noProof/>
                 <w:webHidden/>
               </w:rPr>
-              <w:t>79</w:t>
+              <w:t>83</w:t>
             </w:r>
             <w:r>
               <w:rPr>
@@ -6398,7 +6428,7 @@
                 <w:noProof/>
                 <w:webHidden/>
               </w:rPr>
-              <w:t>82</w:t>
+              <w:t>86</w:t>
             </w:r>
             <w:r>
               <w:rPr>
@@ -6470,7 +6500,7 @@
                 <w:noProof/>
                 <w:webHidden/>
               </w:rPr>
-              <w:t>83</w:t>
+              <w:t>87</w:t>
             </w:r>
             <w:r>
               <w:rPr>
@@ -6542,7 +6572,7 @@
                 <w:noProof/>
                 <w:webHidden/>
               </w:rPr>
-              <w:t>86</w:t>
+              <w:t>90</w:t>
             </w:r>
             <w:r>
               <w:rPr>
@@ -6622,7 +6652,7 @@
                 <w:noProof/>
                 <w:webHidden/>
               </w:rPr>
-              <w:t>87</w:t>
+              <w:t>91</w:t>
             </w:r>
             <w:r>
               <w:rPr>
@@ -6732,7 +6762,7 @@
                 <w:noProof/>
                 <w:webHidden/>
               </w:rPr>
-              <w:t>88</w:t>
+              <w:t>92</w:t>
             </w:r>
             <w:r>
               <w:rPr>
@@ -6827,7 +6857,7 @@
                 <w:noProof/>
                 <w:webHidden/>
               </w:rPr>
-              <w:t>89</w:t>
+              <w:t>93</w:t>
             </w:r>
             <w:r>
               <w:rPr>
@@ -6922,7 +6952,7 @@
                 <w:noProof/>
                 <w:webHidden/>
               </w:rPr>
-              <w:t>91</w:t>
+              <w:t>95</w:t>
             </w:r>
             <w:r>
               <w:rPr>
@@ -13455,9 +13485,6 @@
       <w:pPr>
         <w:ind w:firstLine="0"/>
         <w:jc w:val="center"/>
-        <w:rPr>
-          <w:lang w:val="en-US"/>
-        </w:rPr>
       </w:pPr>
       <w:r>
         <w:t>Рисунок 2.2 Функциональная схема работы</w:t>
@@ -19184,6 +19211,7 @@
         <w:t xml:space="preserve"> </w:t>
       </w:r>
       <w:proofErr w:type="spellStart"/>
+      <w:proofErr w:type="gramStart"/>
       <w:r>
         <w:rPr>
           <w:lang w:val="en-US"/>
@@ -19192,7 +19220,11 @@
       </w:r>
       <w:proofErr w:type="spellEnd"/>
       <w:r>
-        <w:t xml:space="preserve">() – </w:t>
+        <w:t>(</w:t>
+      </w:r>
+      <w:proofErr w:type="gramEnd"/>
+      <w:r>
+        <w:t xml:space="preserve">) – </w:t>
       </w:r>
       <w:r>
         <w:t>объект-функция. Используется для завершения работы с кардридером. Выключает кардридер и очищает настройки</w:t>
@@ -19220,6 +19252,7 @@
         <w:t xml:space="preserve">void </w:t>
       </w:r>
       <w:proofErr w:type="spellStart"/>
+      <w:proofErr w:type="gramStart"/>
       <w:r>
         <w:rPr>
           <w:lang w:val="en-US"/>
@@ -19231,7 +19264,14 @@
         <w:rPr>
           <w:lang w:val="en-US"/>
         </w:rPr>
-        <w:t xml:space="preserve">(str </w:t>
+        <w:t>(</w:t>
+      </w:r>
+      <w:proofErr w:type="gramEnd"/>
+      <w:r>
+        <w:rPr>
+          <w:lang w:val="en-US"/>
+        </w:rPr>
+        <w:t xml:space="preserve">str </w:t>
       </w:r>
       <w:proofErr w:type="spellStart"/>
       <w:r>
@@ -19291,6 +19331,7 @@
         <w:t xml:space="preserve"> </w:t>
       </w:r>
       <w:proofErr w:type="spellStart"/>
+      <w:proofErr w:type="gramStart"/>
       <w:r>
         <w:rPr>
           <w:lang w:val="en-US"/>
@@ -19299,7 +19340,11 @@
       </w:r>
       <w:proofErr w:type="spellEnd"/>
       <w:r>
-        <w:t xml:space="preserve">() – </w:t>
+        <w:t>(</w:t>
+      </w:r>
+      <w:proofErr w:type="gramEnd"/>
+      <w:r>
+        <w:t xml:space="preserve">) – </w:t>
       </w:r>
       <w:r>
         <w:t xml:space="preserve">объект-функция. Часть интерфейса взаимодействия с драйвером записи карты. Используется для завершения работы с кардридером. В случае с разработанным драйвером вызывает функцию </w:t>
@@ -19412,6 +19457,7 @@
         </w:rPr>
         <w:t xml:space="preserve"> </w:t>
       </w:r>
+      <w:proofErr w:type="gramStart"/>
       <w:r>
         <w:rPr>
           <w:lang w:val="en-US"/>
@@ -19425,6 +19471,7 @@
         <w:t>(</w:t>
       </w:r>
       <w:proofErr w:type="spellStart"/>
+      <w:proofErr w:type="gramEnd"/>
       <w:r>
         <w:rPr>
           <w:lang w:val="en-US"/>
@@ -19611,6 +19658,7 @@
       <w:r>
         <w:t xml:space="preserve"> </w:t>
       </w:r>
+      <w:proofErr w:type="gramStart"/>
       <w:r>
         <w:rPr>
           <w:lang w:val="en-US"/>
@@ -19618,7 +19666,11 @@
         <w:t>Restart</w:t>
       </w:r>
       <w:r>
-        <w:t xml:space="preserve">() – </w:t>
+        <w:t>(</w:t>
+      </w:r>
+      <w:proofErr w:type="gramEnd"/>
+      <w:r>
+        <w:t xml:space="preserve">) – </w:t>
       </w:r>
       <w:r>
         <w:t>объект-функция. Часть интерфейса взаимодействия с драйвером записи карты.</w:t>
@@ -19736,6 +19788,7 @@
         <w:t xml:space="preserve"> </w:t>
       </w:r>
       <w:proofErr w:type="spellStart"/>
+      <w:proofErr w:type="gramStart"/>
       <w:r>
         <w:rPr>
           <w:lang w:val="en-US"/>
@@ -19747,6 +19800,7 @@
         <w:t>(</w:t>
       </w:r>
       <w:proofErr w:type="spellStart"/>
+      <w:proofErr w:type="gramEnd"/>
       <w:r>
         <w:rPr>
           <w:lang w:val="en-US"/>
@@ -19822,9 +19876,17 @@
         <w:rPr>
           <w:lang w:val="en-US"/>
         </w:rPr>
-        <w:t>int Transfer(</w:t>
-      </w:r>
-      <w:proofErr w:type="spellStart"/>
+        <w:t xml:space="preserve">int </w:t>
+      </w:r>
+      <w:proofErr w:type="gramStart"/>
+      <w:r>
+        <w:rPr>
+          <w:lang w:val="en-US"/>
+        </w:rPr>
+        <w:t>Transfer(</w:t>
+      </w:r>
+      <w:proofErr w:type="spellStart"/>
+      <w:proofErr w:type="gramEnd"/>
       <w:r>
         <w:rPr>
           <w:lang w:val="en-US"/>
@@ -26342,6 +26404,7 @@
         </w:rPr>
         <w:t xml:space="preserve"> </w:t>
       </w:r>
+      <w:proofErr w:type="gramStart"/>
       <w:r>
         <w:rPr>
           <w:i/>
@@ -26357,6 +26420,7 @@
         <w:t>(</w:t>
       </w:r>
       <w:proofErr w:type="spellStart"/>
+      <w:proofErr w:type="gramEnd"/>
       <w:r>
         <w:rPr>
           <w:i/>
@@ -26472,6 +26536,7 @@
         <w:t xml:space="preserve"> = </w:t>
       </w:r>
       <w:proofErr w:type="spellStart"/>
+      <w:proofErr w:type="gramStart"/>
       <w:r>
         <w:rPr>
           <w:lang w:val="en-US"/>
@@ -26479,6 +26544,7 @@
         <w:t>address.Find</w:t>
       </w:r>
       <w:proofErr w:type="spellEnd"/>
+      <w:proofErr w:type="gramEnd"/>
       <w:r>
         <w:rPr>
           <w:lang w:val="en-US"/>
@@ -26540,6 +26606,7 @@
         <w:t xml:space="preserve">` = </w:t>
       </w:r>
       <w:proofErr w:type="spellStart"/>
+      <w:proofErr w:type="gramStart"/>
       <w:r>
         <w:rPr>
           <w:lang w:val="en-US"/>
@@ -26551,7 +26618,14 @@
         <w:rPr>
           <w:lang w:val="en-US"/>
         </w:rPr>
-        <w:t xml:space="preserve">(address, 1, </w:t>
+        <w:t>(</w:t>
+      </w:r>
+      <w:proofErr w:type="gramEnd"/>
+      <w:r>
+        <w:rPr>
+          <w:lang w:val="en-US"/>
+        </w:rPr>
+        <w:t xml:space="preserve">address, 1, </w:t>
       </w:r>
       <w:proofErr w:type="spellStart"/>
       <w:r>
@@ -26595,6 +26669,7 @@
         <w:t xml:space="preserve">` = </w:t>
       </w:r>
       <w:proofErr w:type="spellStart"/>
+      <w:proofErr w:type="gramStart"/>
       <w:r>
         <w:rPr>
           <w:lang w:val="en-US"/>
@@ -26606,7 +26681,14 @@
         <w:rPr>
           <w:lang w:val="en-US"/>
         </w:rPr>
-        <w:t xml:space="preserve">(address, </w:t>
+        <w:t>(</w:t>
+      </w:r>
+      <w:proofErr w:type="gramEnd"/>
+      <w:r>
+        <w:rPr>
+          <w:lang w:val="en-US"/>
+        </w:rPr>
+        <w:t xml:space="preserve">address, </w:t>
       </w:r>
       <w:proofErr w:type="spellStart"/>
       <w:r>
@@ -26733,7 +26815,14 @@
         <w:rPr>
           <w:lang w:val="en-US"/>
         </w:rPr>
-        <w:t>if (!(</w:t>
+        <w:t xml:space="preserve">if </w:t>
+      </w:r>
+      <w:proofErr w:type="gramStart"/>
+      <w:r>
+        <w:rPr>
+          <w:lang w:val="en-US"/>
+        </w:rPr>
+        <w:t>(!(</w:t>
       </w:r>
       <w:proofErr w:type="spellStart"/>
       <w:r>
@@ -26743,6 +26832,7 @@
         <w:t>port.Connected</w:t>
       </w:r>
       <w:proofErr w:type="spellEnd"/>
+      <w:proofErr w:type="gramEnd"/>
       <w:r>
         <w:rPr>
           <w:lang w:val="en-US"/>
@@ -26763,6 +26853,7 @@
         <w:t xml:space="preserve">   </w:t>
       </w:r>
       <w:proofErr w:type="spellStart"/>
+      <w:proofErr w:type="gramStart"/>
       <w:r>
         <w:rPr>
           <w:lang w:val="en-US"/>
@@ -26770,6 +26861,7 @@
         <w:t>port.Protocol</w:t>
       </w:r>
       <w:proofErr w:type="spellEnd"/>
+      <w:proofErr w:type="gramEnd"/>
       <w:r>
         <w:rPr>
           <w:lang w:val="en-US"/>
@@ -26777,6 +26869,7 @@
         <w:t xml:space="preserve"> = </w:t>
       </w:r>
       <w:proofErr w:type="spellStart"/>
+      <w:proofErr w:type="gramStart"/>
       <w:r>
         <w:rPr>
           <w:lang w:val="en-US"/>
@@ -26788,7 +26881,14 @@
         <w:rPr>
           <w:lang w:val="en-US"/>
         </w:rPr>
-        <w:t>::TCP;</w:t>
+        <w:t>::</w:t>
+      </w:r>
+      <w:proofErr w:type="gramEnd"/>
+      <w:r>
+        <w:rPr>
+          <w:lang w:val="en-US"/>
+        </w:rPr>
+        <w:t>TCP;</w:t>
       </w:r>
     </w:p>
     <w:p>
@@ -26804,6 +26904,7 @@
         <w:t xml:space="preserve">   </w:t>
       </w:r>
       <w:proofErr w:type="spellStart"/>
+      <w:proofErr w:type="gramStart"/>
       <w:r>
         <w:rPr>
           <w:lang w:val="en-US"/>
@@ -26811,6 +26912,7 @@
         <w:t>port.Address</w:t>
       </w:r>
       <w:proofErr w:type="spellEnd"/>
+      <w:proofErr w:type="gramEnd"/>
       <w:r>
         <w:rPr>
           <w:lang w:val="en-US"/>
@@ -26845,6 +26947,7 @@
         <w:t xml:space="preserve">   </w:t>
       </w:r>
       <w:proofErr w:type="spellStart"/>
+      <w:proofErr w:type="gramStart"/>
       <w:r>
         <w:rPr>
           <w:lang w:val="en-US"/>
@@ -26852,6 +26955,7 @@
         <w:t>port.Start</w:t>
       </w:r>
       <w:proofErr w:type="spellEnd"/>
+      <w:proofErr w:type="gramEnd"/>
       <w:r>
         <w:rPr>
           <w:lang w:val="en-US"/>
@@ -26872,6 +26976,7 @@
         <w:t xml:space="preserve">   </w:t>
       </w:r>
       <w:proofErr w:type="spellStart"/>
+      <w:proofErr w:type="gramStart"/>
       <w:r>
         <w:rPr>
           <w:lang w:val="en-US"/>
@@ -26879,6 +26984,7 @@
         <w:t>port.Connect</w:t>
       </w:r>
       <w:proofErr w:type="spellEnd"/>
+      <w:proofErr w:type="gramEnd"/>
       <w:r>
         <w:rPr>
           <w:lang w:val="en-US"/>
@@ -27043,6 +27149,7 @@
         <w:t xml:space="preserve"> </w:t>
       </w:r>
       <w:proofErr w:type="spellStart"/>
+      <w:proofErr w:type="gramStart"/>
       <w:r>
         <w:rPr>
           <w:i/>
@@ -27056,7 +27163,15 @@
           <w:i/>
           <w:lang w:val="en-US"/>
         </w:rPr>
-        <w:t>()</w:t>
+        <w:t>(</w:t>
+      </w:r>
+      <w:proofErr w:type="gramEnd"/>
+      <w:r>
+        <w:rPr>
+          <w:i/>
+          <w:lang w:val="en-US"/>
+        </w:rPr>
+        <w:t>)</w:t>
       </w:r>
     </w:p>
     <w:p>
@@ -27122,6 +27237,7 @@
         </w:rPr>
         <w:t xml:space="preserve"> </w:t>
       </w:r>
+      <w:proofErr w:type="gramStart"/>
       <w:r>
         <w:rPr>
           <w:i/>
@@ -27134,7 +27250,15 @@
           <w:i/>
           <w:lang w:val="en-US"/>
         </w:rPr>
-        <w:t>()</w:t>
+        <w:t>(</w:t>
+      </w:r>
+      <w:proofErr w:type="gramEnd"/>
+      <w:r>
+        <w:rPr>
+          <w:i/>
+          <w:lang w:val="en-US"/>
+        </w:rPr>
+        <w:t>)</w:t>
       </w:r>
     </w:p>
     <w:p>
@@ -27194,6 +27318,7 @@
         <w:t xml:space="preserve">void </w:t>
       </w:r>
       <w:proofErr w:type="spellStart"/>
+      <w:proofErr w:type="gramStart"/>
       <w:r>
         <w:rPr>
           <w:i/>
@@ -27207,14 +27332,22 @@
           <w:i/>
           <w:lang w:val="en-US"/>
         </w:rPr>
-        <w:t xml:space="preserve">(str </w:t>
-      </w:r>
-      <w:proofErr w:type="spellStart"/>
+        <w:t>(</w:t>
+      </w:r>
+      <w:proofErr w:type="gramEnd"/>
       <w:r>
         <w:rPr>
           <w:i/>
           <w:lang w:val="en-US"/>
         </w:rPr>
+        <w:t xml:space="preserve">str </w:t>
+      </w:r>
+      <w:proofErr w:type="spellStart"/>
+      <w:r>
+        <w:rPr>
+          <w:i/>
+          <w:lang w:val="en-US"/>
+        </w:rPr>
         <w:t>interfaceType</w:t>
       </w:r>
       <w:proofErr w:type="spellEnd"/>
@@ -27256,7 +27389,14 @@
         <w:rPr>
           <w:lang w:val="en-US"/>
         </w:rPr>
-        <w:t>req = "\"\".</w:t>
+        <w:t>req = "\"\</w:t>
+      </w:r>
+      <w:proofErr w:type="gramStart"/>
+      <w:r>
+        <w:rPr>
+          <w:lang w:val="en-US"/>
+        </w:rPr>
+        <w:t>".</w:t>
       </w:r>
       <w:proofErr w:type="spellStart"/>
       <w:r>
@@ -27266,11 +27406,26 @@
         <w:t>PrintMode</w:t>
       </w:r>
       <w:proofErr w:type="spellEnd"/>
-      <w:r>
-        <w:rPr>
-          <w:lang w:val="en-US"/>
-        </w:rPr>
-        <w:t>(1);\0";</w:t>
+      <w:proofErr w:type="gramEnd"/>
+      <w:r>
+        <w:rPr>
+          <w:lang w:val="en-US"/>
+        </w:rPr>
+        <w:t>(1</w:t>
+      </w:r>
+      <w:proofErr w:type="gramStart"/>
+      <w:r>
+        <w:rPr>
+          <w:lang w:val="en-US"/>
+        </w:rPr>
+        <w:t>);\</w:t>
+      </w:r>
+      <w:proofErr w:type="gramEnd"/>
+      <w:r>
+        <w:rPr>
+          <w:lang w:val="en-US"/>
+        </w:rPr>
+        <w:t>0";</w:t>
       </w:r>
     </w:p>
     <w:p>
@@ -27412,30 +27567,102 @@
         <w:rPr>
           <w:lang w:val="en-US"/>
         </w:rPr>
-        <w:t xml:space="preserve"> = card(\"SC1\",\"ISO7816-3\", 1);</w:t>
-      </w:r>
-      <w:proofErr w:type="spellStart"/>
-      <w:r>
-        <w:rPr>
-          <w:lang w:val="en-US"/>
-        </w:rPr>
-        <w:t>my_card.VccDef</w:t>
-      </w:r>
-      <w:proofErr w:type="spellEnd"/>
-      <w:r>
-        <w:rPr>
-          <w:lang w:val="en-US"/>
-        </w:rPr>
-        <w:t xml:space="preserve"> (3000);</w:t>
-      </w:r>
-      <w:proofErr w:type="spellStart"/>
-      <w:r>
-        <w:rPr>
-          <w:lang w:val="en-US"/>
-        </w:rPr>
-        <w:t>my_card.FreqXSet</w:t>
-      </w:r>
-      <w:proofErr w:type="spellEnd"/>
+        <w:t xml:space="preserve"> = </w:t>
+      </w:r>
+      <w:proofErr w:type="gramStart"/>
+      <w:r>
+        <w:rPr>
+          <w:lang w:val="en-US"/>
+        </w:rPr>
+        <w:t>card(</w:t>
+      </w:r>
+      <w:proofErr w:type="gramEnd"/>
+      <w:r>
+        <w:rPr>
+          <w:lang w:val="en-US"/>
+        </w:rPr>
+        <w:t>\"SC1\</w:t>
+      </w:r>
+      <w:proofErr w:type="gramStart"/>
+      <w:r>
+        <w:rPr>
+          <w:lang w:val="en-US"/>
+        </w:rPr>
+        <w:t>",\</w:t>
+      </w:r>
+      <w:proofErr w:type="gramEnd"/>
+      <w:r>
+        <w:rPr>
+          <w:lang w:val="en-US"/>
+        </w:rPr>
+        <w:t>"ISO7816-3\", 1</w:t>
+      </w:r>
+      <w:proofErr w:type="gramStart"/>
+      <w:r>
+        <w:rPr>
+          <w:lang w:val="en-US"/>
+        </w:rPr>
+        <w:t>);</w:t>
+      </w:r>
+      <w:proofErr w:type="spellStart"/>
+      <w:r>
+        <w:rPr>
+          <w:lang w:val="en-US"/>
+        </w:rPr>
+        <w:t>my</w:t>
+      </w:r>
+      <w:proofErr w:type="gramEnd"/>
+      <w:r>
+        <w:rPr>
+          <w:lang w:val="en-US"/>
+        </w:rPr>
+        <w:t>_</w:t>
+      </w:r>
+      <w:proofErr w:type="gramStart"/>
+      <w:r>
+        <w:rPr>
+          <w:lang w:val="en-US"/>
+        </w:rPr>
+        <w:t>card.VccDef</w:t>
+      </w:r>
+      <w:proofErr w:type="spellEnd"/>
+      <w:proofErr w:type="gramEnd"/>
+      <w:r>
+        <w:rPr>
+          <w:lang w:val="en-US"/>
+        </w:rPr>
+        <w:t xml:space="preserve"> (3000</w:t>
+      </w:r>
+      <w:proofErr w:type="gramStart"/>
+      <w:r>
+        <w:rPr>
+          <w:lang w:val="en-US"/>
+        </w:rPr>
+        <w:t>);</w:t>
+      </w:r>
+      <w:proofErr w:type="spellStart"/>
+      <w:r>
+        <w:rPr>
+          <w:lang w:val="en-US"/>
+        </w:rPr>
+        <w:t>my</w:t>
+      </w:r>
+      <w:proofErr w:type="gramEnd"/>
+      <w:r>
+        <w:rPr>
+          <w:lang w:val="en-US"/>
+        </w:rPr>
+        <w:t>_</w:t>
+      </w:r>
+      <w:proofErr w:type="gramStart"/>
+      <w:r>
+        <w:rPr>
+          <w:lang w:val="en-US"/>
+        </w:rPr>
+        <w:t>card.FreqXSet</w:t>
+      </w:r>
+      <w:proofErr w:type="spellEnd"/>
+      <w:proofErr w:type="gramEnd"/>
       <w:r>
         <w:rPr>
           <w:lang w:val="en-US"/>
@@ -27479,7 +27706,21 @@
         <w:rPr>
           <w:lang w:val="en-US"/>
         </w:rPr>
-        <w:t xml:space="preserve">      throw Ex::Error, 0, "Contactless personalization (ISO14443-A) not supported now\</w:t>
+        <w:t xml:space="preserve">      throw </w:t>
+      </w:r>
+      <w:proofErr w:type="gramStart"/>
+      <w:r>
+        <w:rPr>
+          <w:lang w:val="en-US"/>
+        </w:rPr>
+        <w:t>Ex::</w:t>
+      </w:r>
+      <w:proofErr w:type="gramEnd"/>
+      <w:r>
+        <w:rPr>
+          <w:lang w:val="en-US"/>
+        </w:rPr>
+        <w:t>Error, 0, "Contactless personalization (ISO14443-A) not supported now\</w:t>
       </w:r>
       <w:proofErr w:type="spellStart"/>
       <w:r>
@@ -27546,7 +27787,21 @@
         <w:rPr>
           <w:lang w:val="en-US"/>
         </w:rPr>
-        <w:t xml:space="preserve">      throw Ex::Error, 0, "Invalid reader int</w:t>
+        <w:t xml:space="preserve">      throw </w:t>
+      </w:r>
+      <w:proofErr w:type="gramStart"/>
+      <w:r>
+        <w:rPr>
+          <w:lang w:val="en-US"/>
+        </w:rPr>
+        <w:t>Ex::</w:t>
+      </w:r>
+      <w:proofErr w:type="gramEnd"/>
+      <w:r>
+        <w:rPr>
+          <w:lang w:val="en-US"/>
+        </w:rPr>
+        <w:t>Error, 0, "Invalid reader int</w:t>
       </w:r>
       <w:r>
         <w:rPr>
@@ -27599,7 +27854,14 @@
         <w:rPr>
           <w:lang w:val="en-US"/>
         </w:rPr>
-        <w:t>my_card</w:t>
+        <w:t>my_</w:t>
+      </w:r>
+      <w:proofErr w:type="gramStart"/>
+      <w:r>
+        <w:rPr>
+          <w:lang w:val="en-US"/>
+        </w:rPr>
+        <w:t>card</w:t>
       </w:r>
       <w:proofErr w:type="spellEnd"/>
       <w:r>
@@ -27616,6 +27878,7 @@
         <w:t>flow.Throw</w:t>
       </w:r>
       <w:proofErr w:type="spellEnd"/>
+      <w:proofErr w:type="gramEnd"/>
       <w:r>
         <w:rPr>
           <w:lang w:val="en-US"/>
@@ -27641,14 +27904,36 @@
         <w:rPr>
           <w:lang w:val="en-US"/>
         </w:rPr>
-        <w:t>my_card.Reset</w:t>
-      </w:r>
-      <w:proofErr w:type="spellEnd"/>
-      <w:r>
-        <w:rPr>
-          <w:lang w:val="en-US"/>
-        </w:rPr>
-        <w:t>().Hex}\0";</w:t>
+        <w:t>my_</w:t>
+      </w:r>
+      <w:proofErr w:type="gramStart"/>
+      <w:r>
+        <w:rPr>
+          <w:lang w:val="en-US"/>
+        </w:rPr>
+        <w:t>card.Reset</w:t>
+      </w:r>
+      <w:proofErr w:type="spellEnd"/>
+      <w:proofErr w:type="gramEnd"/>
+      <w:r>
+        <w:rPr>
+          <w:lang w:val="en-US"/>
+        </w:rPr>
+        <w:t>(</w:t>
+      </w:r>
+      <w:proofErr w:type="gramStart"/>
+      <w:r>
+        <w:rPr>
+          <w:lang w:val="en-US"/>
+        </w:rPr>
+        <w:t>).Hex</w:t>
+      </w:r>
+      <w:proofErr w:type="gramEnd"/>
+      <w:r>
+        <w:rPr>
+          <w:lang w:val="en-US"/>
+        </w:rPr>
+        <w:t>}\0";</w:t>
       </w:r>
     </w:p>
     <w:p>
@@ -27753,6 +28038,7 @@
         <w:t xml:space="preserve">str </w:t>
       </w:r>
       <w:proofErr w:type="spellStart"/>
+      <w:proofErr w:type="gramStart"/>
       <w:r>
         <w:rPr>
           <w:i/>
@@ -27769,6 +28055,7 @@
         <w:t>(</w:t>
       </w:r>
       <w:proofErr w:type="spellStart"/>
+      <w:proofErr w:type="gramEnd"/>
       <w:r>
         <w:rPr>
           <w:i/>
@@ -27876,7 +28163,14 @@
         <w:rPr>
           <w:lang w:val="en-US"/>
         </w:rPr>
-        <w:t>if (!(</w:t>
+        <w:t xml:space="preserve">if </w:t>
+      </w:r>
+      <w:proofErr w:type="gramStart"/>
+      <w:r>
+        <w:rPr>
+          <w:lang w:val="en-US"/>
+        </w:rPr>
+        <w:t>(!(</w:t>
       </w:r>
       <w:proofErr w:type="spellStart"/>
       <w:r>
@@ -27886,6 +28180,7 @@
         <w:t>port.Connected</w:t>
       </w:r>
       <w:proofErr w:type="spellEnd"/>
+      <w:proofErr w:type="gramEnd"/>
       <w:r>
         <w:rPr>
           <w:lang w:val="en-US"/>
@@ -27906,6 +28201,7 @@
         <w:t xml:space="preserve">   </w:t>
       </w:r>
       <w:proofErr w:type="spellStart"/>
+      <w:proofErr w:type="gramStart"/>
       <w:r>
         <w:rPr>
           <w:lang w:val="en-US"/>
@@ -27913,6 +28209,7 @@
         <w:t>port.Protocol</w:t>
       </w:r>
       <w:proofErr w:type="spellEnd"/>
+      <w:proofErr w:type="gramEnd"/>
       <w:r>
         <w:rPr>
           <w:lang w:val="en-US"/>
@@ -27920,6 +28217,7 @@
         <w:t xml:space="preserve"> = </w:t>
       </w:r>
       <w:proofErr w:type="spellStart"/>
+      <w:proofErr w:type="gramStart"/>
       <w:r>
         <w:rPr>
           <w:lang w:val="en-US"/>
@@ -27931,7 +28229,14 @@
         <w:rPr>
           <w:lang w:val="en-US"/>
         </w:rPr>
-        <w:t>::TCP;</w:t>
+        <w:t>::</w:t>
+      </w:r>
+      <w:proofErr w:type="gramEnd"/>
+      <w:r>
+        <w:rPr>
+          <w:lang w:val="en-US"/>
+        </w:rPr>
+        <w:t>TCP;</w:t>
       </w:r>
     </w:p>
     <w:p>
@@ -27947,6 +28252,7 @@
         <w:t xml:space="preserve">   </w:t>
       </w:r>
       <w:proofErr w:type="spellStart"/>
+      <w:proofErr w:type="gramStart"/>
       <w:r>
         <w:rPr>
           <w:lang w:val="en-US"/>
@@ -27954,6 +28260,7 @@
         <w:t>port.Address</w:t>
       </w:r>
       <w:proofErr w:type="spellEnd"/>
+      <w:proofErr w:type="gramEnd"/>
       <w:r>
         <w:rPr>
           <w:lang w:val="en-US"/>
@@ -27988,6 +28295,7 @@
         <w:t xml:space="preserve">   </w:t>
       </w:r>
       <w:proofErr w:type="spellStart"/>
+      <w:proofErr w:type="gramStart"/>
       <w:r>
         <w:rPr>
           <w:lang w:val="en-US"/>
@@ -27995,6 +28303,7 @@
         <w:t>port.Start</w:t>
       </w:r>
       <w:proofErr w:type="spellEnd"/>
+      <w:proofErr w:type="gramEnd"/>
       <w:r>
         <w:rPr>
           <w:lang w:val="en-US"/>
@@ -28015,6 +28324,7 @@
         <w:t xml:space="preserve">   </w:t>
       </w:r>
       <w:proofErr w:type="spellStart"/>
+      <w:proofErr w:type="gramStart"/>
       <w:r>
         <w:rPr>
           <w:lang w:val="en-US"/>
@@ -28022,6 +28332,7 @@
         <w:t>port.Connect</w:t>
       </w:r>
       <w:proofErr w:type="spellEnd"/>
+      <w:proofErr w:type="gramEnd"/>
       <w:r>
         <w:rPr>
           <w:lang w:val="en-US"/>
@@ -28070,6 +28381,7 @@
         </w:rPr>
       </w:pPr>
       <w:proofErr w:type="spellStart"/>
+      <w:proofErr w:type="gramStart"/>
       <w:r>
         <w:rPr>
           <w:lang w:val="en-US"/>
@@ -28077,6 +28389,7 @@
         <w:t>port.Send</w:t>
       </w:r>
       <w:proofErr w:type="spellEnd"/>
+      <w:proofErr w:type="gramEnd"/>
       <w:r>
         <w:rPr>
           <w:lang w:val="en-US"/>
@@ -28115,14 +28428,28 @@
         <w:rPr>
           <w:lang w:val="en-US"/>
         </w:rPr>
-        <w:t>while (!</w:t>
-      </w:r>
-      <w:proofErr w:type="spellStart"/>
-      <w:r>
-        <w:rPr>
-          <w:lang w:val="en-US"/>
-        </w:rPr>
-        <w:t>port.RxReady</w:t>
+        <w:t xml:space="preserve">while </w:t>
+      </w:r>
+      <w:proofErr w:type="gramStart"/>
+      <w:r>
+        <w:rPr>
+          <w:lang w:val="en-US"/>
+        </w:rPr>
+        <w:t>(!</w:t>
+      </w:r>
+      <w:proofErr w:type="spellStart"/>
+      <w:r>
+        <w:rPr>
+          <w:lang w:val="en-US"/>
+        </w:rPr>
+        <w:t>port</w:t>
+      </w:r>
+      <w:proofErr w:type="gramEnd"/>
+      <w:r>
+        <w:rPr>
+          <w:lang w:val="en-US"/>
+        </w:rPr>
+        <w:t>.RxReady</w:t>
       </w:r>
       <w:proofErr w:type="spellEnd"/>
       <w:r>
@@ -28233,6 +28560,7 @@
         </w:rPr>
       </w:pPr>
       <w:proofErr w:type="spellStart"/>
+      <w:proofErr w:type="gramStart"/>
       <w:r>
         <w:rPr>
           <w:lang w:val="en-US"/>
@@ -28240,6 +28568,7 @@
         <w:t>port.Recv</w:t>
       </w:r>
       <w:proofErr w:type="spellEnd"/>
+      <w:proofErr w:type="gramEnd"/>
       <w:r>
         <w:rPr>
           <w:lang w:val="en-US"/>
@@ -28267,6 +28596,7 @@
         <w:t>if (</w:t>
       </w:r>
       <w:proofErr w:type="spellStart"/>
+      <w:proofErr w:type="gramStart"/>
       <w:r>
         <w:rPr>
           <w:lang w:val="en-US"/>
@@ -28274,6 +28604,7 @@
         <w:t>res.Find</w:t>
       </w:r>
       <w:proofErr w:type="spellEnd"/>
+      <w:proofErr w:type="gramEnd"/>
       <w:r>
         <w:rPr>
           <w:lang w:val="en-US"/>
@@ -28297,7 +28628,21 @@
         <w:rPr>
           <w:lang w:val="en-US"/>
         </w:rPr>
-        <w:t>throw Ex::Error, 0, res;</w:t>
+        <w:t xml:space="preserve">throw </w:t>
+      </w:r>
+      <w:proofErr w:type="gramStart"/>
+      <w:r>
+        <w:rPr>
+          <w:lang w:val="en-US"/>
+        </w:rPr>
+        <w:t>Ex::</w:t>
+      </w:r>
+      <w:proofErr w:type="gramEnd"/>
+      <w:r>
+        <w:rPr>
+          <w:lang w:val="en-US"/>
+        </w:rPr>
+        <w:t>Error, 0, res;</w:t>
       </w:r>
     </w:p>
     <w:p>
@@ -28339,14 +28684,23 @@
           <w:i/>
           <w:lang w:val="en-US"/>
         </w:rPr>
-        <w:t>int Transfer(</w:t>
-      </w:r>
-      <w:proofErr w:type="spellStart"/>
+        <w:t xml:space="preserve">int </w:t>
+      </w:r>
+      <w:proofErr w:type="gramStart"/>
       <w:r>
         <w:rPr>
           <w:i/>
           <w:lang w:val="en-US"/>
         </w:rPr>
+        <w:t>Transfer(</w:t>
+      </w:r>
+      <w:proofErr w:type="spellStart"/>
+      <w:proofErr w:type="gramEnd"/>
+      <w:r>
+        <w:rPr>
+          <w:i/>
+          <w:lang w:val="en-US"/>
+        </w:rPr>
         <w:t>RStr</w:t>
       </w:r>
       <w:proofErr w:type="spellEnd"/>
@@ -28417,16 +28771,66 @@
           <w:lang w:val="en-US"/>
         </w:rPr>
         <w:lastRenderedPageBreak/>
-        <w:t xml:space="preserve">str req = "where(){   res := \"\";res = </w:t>
-      </w:r>
-      <w:proofErr w:type="spellStart"/>
-      <w:r>
-        <w:rPr>
-          <w:lang w:val="en-US"/>
-        </w:rPr>
-        <w:t>my_card.Apdu</w:t>
-      </w:r>
-      <w:proofErr w:type="spellEnd"/>
+        <w:t>str req = "</w:t>
+      </w:r>
+      <w:proofErr w:type="gramStart"/>
+      <w:r>
+        <w:rPr>
+          <w:lang w:val="en-US"/>
+        </w:rPr>
+        <w:t xml:space="preserve">where(){  </w:t>
+      </w:r>
+      <w:proofErr w:type="gramEnd"/>
+      <w:r>
+        <w:rPr>
+          <w:lang w:val="en-US"/>
+        </w:rPr>
+        <w:t xml:space="preserve"> </w:t>
+      </w:r>
+      <w:proofErr w:type="gramStart"/>
+      <w:r>
+        <w:rPr>
+          <w:lang w:val="en-US"/>
+        </w:rPr>
+        <w:t>res :</w:t>
+      </w:r>
+      <w:proofErr w:type="gramEnd"/>
+      <w:r>
+        <w:rPr>
+          <w:lang w:val="en-US"/>
+        </w:rPr>
+        <w:t>= \"\</w:t>
+      </w:r>
+      <w:proofErr w:type="gramStart"/>
+      <w:r>
+        <w:rPr>
+          <w:lang w:val="en-US"/>
+        </w:rPr>
+        <w:t>";res</w:t>
+      </w:r>
+      <w:proofErr w:type="gramEnd"/>
+      <w:r>
+        <w:rPr>
+          <w:lang w:val="en-US"/>
+        </w:rPr>
+        <w:t xml:space="preserve"> = </w:t>
+      </w:r>
+      <w:proofErr w:type="spellStart"/>
+      <w:r>
+        <w:rPr>
+          <w:lang w:val="en-US"/>
+        </w:rPr>
+        <w:t>my_</w:t>
+      </w:r>
+      <w:proofErr w:type="gramStart"/>
+      <w:r>
+        <w:rPr>
+          <w:lang w:val="en-US"/>
+        </w:rPr>
+        <w:t>card.Apdu</w:t>
+      </w:r>
+      <w:proofErr w:type="spellEnd"/>
+      <w:proofErr w:type="gramEnd"/>
       <w:r>
         <w:rPr>
           <w:lang w:val="en-US"/>
@@ -28434,6 +28838,7 @@
         <w:t xml:space="preserve">(\"" + </w:t>
       </w:r>
       <w:proofErr w:type="spellStart"/>
+      <w:proofErr w:type="gramStart"/>
       <w:r>
         <w:rPr>
           <w:lang w:val="en-US"/>
@@ -28448,6 +28853,7 @@
         <w:t>(</w:t>
       </w:r>
       <w:proofErr w:type="spellStart"/>
+      <w:proofErr w:type="gramEnd"/>
       <w:r>
         <w:rPr>
           <w:lang w:val="en-US"/>
@@ -28459,7 +28865,21 @@
         <w:rPr>
           <w:lang w:val="en-US"/>
         </w:rPr>
-        <w:t>, false, true) + "\").Hex}\0";</w:t>
+        <w:t>, false, true) + "\"</w:t>
+      </w:r>
+      <w:proofErr w:type="gramStart"/>
+      <w:r>
+        <w:rPr>
+          <w:lang w:val="en-US"/>
+        </w:rPr>
+        <w:t>).Hex</w:t>
+      </w:r>
+      <w:proofErr w:type="gramEnd"/>
+      <w:r>
+        <w:rPr>
+          <w:lang w:val="en-US"/>
+        </w:rPr>
+        <w:t>}\0";</w:t>
       </w:r>
     </w:p>
     <w:p>
@@ -28533,16 +28953,32 @@
         <w:rPr>
           <w:lang w:val="en-US"/>
         </w:rPr>
-        <w:t>where(){</w:t>
-      </w:r>
-      <w:proofErr w:type="spellStart"/>
-      <w:r>
-        <w:rPr>
-          <w:lang w:val="en-US"/>
-        </w:rPr>
-        <w:t>my_card.Sw.Hex</w:t>
-      </w:r>
-      <w:proofErr w:type="spellEnd"/>
+        <w:t>where</w:t>
+      </w:r>
+      <w:proofErr w:type="gramStart"/>
+      <w:r>
+        <w:rPr>
+          <w:lang w:val="en-US"/>
+        </w:rPr>
+        <w:t>(){</w:t>
+      </w:r>
+      <w:proofErr w:type="spellStart"/>
+      <w:proofErr w:type="gramEnd"/>
+      <w:r>
+        <w:rPr>
+          <w:lang w:val="en-US"/>
+        </w:rPr>
+        <w:t>my_card.</w:t>
+      </w:r>
+      <w:proofErr w:type="gramStart"/>
+      <w:r>
+        <w:rPr>
+          <w:lang w:val="en-US"/>
+        </w:rPr>
+        <w:t>Sw.Hex</w:t>
+      </w:r>
+      <w:proofErr w:type="spellEnd"/>
+      <w:proofErr w:type="gramEnd"/>
       <w:r>
         <w:rPr>
           <w:lang w:val="en-US"/>
@@ -28631,6 +29067,7 @@
         </w:rPr>
       </w:pPr>
       <w:proofErr w:type="spellStart"/>
+      <w:proofErr w:type="gramStart"/>
       <w:r>
         <w:rPr>
           <w:lang w:val="en-US"/>
@@ -28644,6 +29081,7 @@
         </w:rPr>
         <w:t>(</w:t>
       </w:r>
+      <w:proofErr w:type="gramEnd"/>
       <w:r>
         <w:rPr>
           <w:lang w:val="en-US"/>
@@ -28779,6 +29217,7 @@
         <w:t xml:space="preserve">void </w:t>
       </w:r>
       <w:proofErr w:type="spellStart"/>
+      <w:proofErr w:type="gramStart"/>
       <w:r>
         <w:rPr>
           <w:i/>
@@ -28792,192 +29231,291 @@
           <w:i/>
           <w:lang w:val="en-US"/>
         </w:rPr>
+        <w:t>(</w:t>
+      </w:r>
+      <w:proofErr w:type="gramEnd"/>
+      <w:r>
+        <w:rPr>
+          <w:i/>
+          <w:lang w:val="en-US"/>
+        </w:rPr>
+        <w:t>)</w:t>
+      </w:r>
+    </w:p>
+    <w:p>
+      <w:pPr>
+        <w:rPr>
+          <w:lang w:val="en-US"/>
+        </w:rPr>
+      </w:pPr>
+      <w:r>
+        <w:rPr>
+          <w:lang w:val="en-US"/>
+        </w:rPr>
+        <w:t>try {</w:t>
+      </w:r>
+    </w:p>
+    <w:p>
+      <w:pPr>
+        <w:rPr>
+          <w:lang w:val="en-US"/>
+        </w:rPr>
+      </w:pPr>
+      <w:r>
+        <w:rPr>
+          <w:lang w:val="en-US"/>
+        </w:rPr>
+        <w:t xml:space="preserve">   </w:t>
+      </w:r>
+      <w:proofErr w:type="spellStart"/>
+      <w:proofErr w:type="gramStart"/>
+      <w:r>
+        <w:rPr>
+          <w:lang w:val="en-US"/>
+        </w:rPr>
+        <w:t>CardClose</w:t>
+      </w:r>
+      <w:proofErr w:type="spellEnd"/>
+      <w:r>
+        <w:rPr>
+          <w:lang w:val="en-US"/>
+        </w:rPr>
+        <w:t>(</w:t>
+      </w:r>
+      <w:proofErr w:type="gramEnd"/>
+      <w:r>
+        <w:rPr>
+          <w:lang w:val="en-US"/>
+        </w:rPr>
+        <w:t>);</w:t>
+      </w:r>
+    </w:p>
+    <w:p>
+      <w:pPr>
+        <w:rPr>
+          <w:lang w:val="en-US"/>
+        </w:rPr>
+      </w:pPr>
+      <w:r>
+        <w:rPr>
+          <w:lang w:val="en-US"/>
+        </w:rPr>
+        <w:t>}</w:t>
+      </w:r>
+    </w:p>
+    <w:p>
+      <w:pPr>
+        <w:rPr>
+          <w:lang w:val="en-US"/>
+        </w:rPr>
+      </w:pPr>
+      <w:r>
+        <w:rPr>
+          <w:lang w:val="en-US"/>
+        </w:rPr>
+        <w:t>catch (...) {</w:t>
+      </w:r>
+    </w:p>
+    <w:p>
+      <w:pPr>
+        <w:rPr>
+          <w:lang w:val="en-US"/>
+        </w:rPr>
+      </w:pPr>
+      <w:r>
+        <w:rPr>
+          <w:lang w:val="en-US"/>
+        </w:rPr>
+        <w:t xml:space="preserve">   </w:t>
+      </w:r>
+      <w:proofErr w:type="gramStart"/>
+      <w:r>
+        <w:rPr>
+          <w:lang w:val="en-US"/>
+        </w:rPr>
+        <w:t>Trace(Severity::</w:t>
+      </w:r>
+      <w:proofErr w:type="gramEnd"/>
+      <w:r>
+        <w:rPr>
+          <w:lang w:val="en-US"/>
+        </w:rPr>
+        <w:t xml:space="preserve">Warning, "Card close executed with error: " + </w:t>
+      </w:r>
+      <w:proofErr w:type="spellStart"/>
+      <w:proofErr w:type="gramStart"/>
+      <w:r>
+        <w:rPr>
+          <w:lang w:val="en-US"/>
+        </w:rPr>
+        <w:t>ExceptionMess</w:t>
+      </w:r>
+      <w:proofErr w:type="spellEnd"/>
+      <w:r>
+        <w:rPr>
+          <w:lang w:val="en-US"/>
+        </w:rPr>
+        <w:t>(</w:t>
+      </w:r>
+      <w:proofErr w:type="gramEnd"/>
+      <w:r>
+        <w:rPr>
+          <w:lang w:val="en-US"/>
+        </w:rPr>
+        <w:t>));</w:t>
+      </w:r>
+    </w:p>
+    <w:p>
+      <w:pPr>
+        <w:rPr>
+          <w:lang w:val="en-US"/>
+        </w:rPr>
+      </w:pPr>
+      <w:r>
+        <w:rPr>
+          <w:lang w:val="en-US"/>
+        </w:rPr>
+        <w:t>}</w:t>
+      </w:r>
+    </w:p>
+    <w:p>
+      <w:pPr>
+        <w:rPr>
+          <w:lang w:val="en-US"/>
+        </w:rPr>
+      </w:pPr>
+    </w:p>
+    <w:p>
+      <w:pPr>
+        <w:rPr>
+          <w:i/>
+          <w:lang w:val="en-US"/>
+        </w:rPr>
+      </w:pPr>
+      <w:r>
+        <w:rPr>
+          <w:i/>
+          <w:lang w:val="en-US"/>
+        </w:rPr>
+        <w:t xml:space="preserve">void </w:t>
+      </w:r>
+      <w:proofErr w:type="spellStart"/>
+      <w:proofErr w:type="gramStart"/>
+      <w:r>
+        <w:rPr>
+          <w:i/>
+          <w:lang w:val="en-US"/>
+        </w:rPr>
+        <w:t>CardClose</w:t>
+      </w:r>
+      <w:proofErr w:type="spellEnd"/>
+      <w:r>
+        <w:rPr>
+          <w:i/>
+          <w:lang w:val="en-US"/>
+        </w:rPr>
+        <w:t>(</w:t>
+      </w:r>
+      <w:proofErr w:type="gramEnd"/>
+      <w:r>
+        <w:rPr>
+          <w:i/>
+          <w:lang w:val="en-US"/>
+        </w:rPr>
+        <w:t>)</w:t>
+      </w:r>
+    </w:p>
+    <w:p>
+      <w:pPr>
+        <w:rPr>
+          <w:lang w:val="en-US"/>
+        </w:rPr>
+      </w:pPr>
+      <w:r>
+        <w:rPr>
+          <w:lang w:val="en-US"/>
+        </w:rPr>
+        <w:t>str req = "where</w:t>
+      </w:r>
+      <w:proofErr w:type="gramStart"/>
+      <w:r>
+        <w:rPr>
+          <w:lang w:val="en-US"/>
+        </w:rPr>
+        <w:t>(){</w:t>
+      </w:r>
+      <w:proofErr w:type="spellStart"/>
+      <w:proofErr w:type="gramEnd"/>
+      <w:r>
+        <w:rPr>
+          <w:lang w:val="en-US"/>
+        </w:rPr>
+        <w:t>my_</w:t>
+      </w:r>
+      <w:proofErr w:type="gramStart"/>
+      <w:r>
+        <w:rPr>
+          <w:lang w:val="en-US"/>
+        </w:rPr>
+        <w:t>card.Off</w:t>
+      </w:r>
+      <w:proofErr w:type="spellEnd"/>
+      <w:proofErr w:type="gramEnd"/>
+      <w:r>
+        <w:rPr>
+          <w:lang w:val="en-US"/>
+        </w:rPr>
+        <w:t>(</w:t>
+      </w:r>
+      <w:proofErr w:type="gramStart"/>
+      <w:r>
+        <w:rPr>
+          <w:lang w:val="en-US"/>
+        </w:rPr>
+        <w:t>);</w:t>
+      </w:r>
+      <w:proofErr w:type="spellStart"/>
+      <w:r>
+        <w:rPr>
+          <w:lang w:val="en-US"/>
+        </w:rPr>
+        <w:t>my</w:t>
+      </w:r>
+      <w:proofErr w:type="gramEnd"/>
+      <w:r>
+        <w:rPr>
+          <w:lang w:val="en-US"/>
+        </w:rPr>
+        <w:t>_</w:t>
+      </w:r>
+      <w:proofErr w:type="gramStart"/>
+      <w:r>
+        <w:rPr>
+          <w:lang w:val="en-US"/>
+        </w:rPr>
+        <w:t>card.Close</w:t>
+      </w:r>
+      <w:proofErr w:type="spellEnd"/>
+      <w:proofErr w:type="gramEnd"/>
+      <w:r>
+        <w:rPr>
+          <w:lang w:val="en-US"/>
+        </w:rPr>
         <w:t>()</w:t>
       </w:r>
-    </w:p>
-    <w:p>
-      <w:pPr>
-        <w:rPr>
-          <w:lang w:val="en-US"/>
-        </w:rPr>
-      </w:pPr>
-      <w:r>
-        <w:rPr>
-          <w:lang w:val="en-US"/>
-        </w:rPr>
-        <w:t>try {</w:t>
-      </w:r>
-    </w:p>
-    <w:p>
-      <w:pPr>
-        <w:rPr>
-          <w:lang w:val="en-US"/>
-        </w:rPr>
-      </w:pPr>
-      <w:r>
-        <w:rPr>
-          <w:lang w:val="en-US"/>
-        </w:rPr>
-        <w:t xml:space="preserve">   </w:t>
-      </w:r>
-      <w:proofErr w:type="spellStart"/>
-      <w:r>
-        <w:rPr>
-          <w:lang w:val="en-US"/>
-        </w:rPr>
-        <w:t>CardClose</w:t>
-      </w:r>
-      <w:proofErr w:type="spellEnd"/>
-      <w:r>
-        <w:rPr>
-          <w:lang w:val="en-US"/>
-        </w:rPr>
-        <w:t>();</w:t>
-      </w:r>
-    </w:p>
-    <w:p>
-      <w:pPr>
-        <w:rPr>
-          <w:lang w:val="en-US"/>
-        </w:rPr>
-      </w:pPr>
-      <w:r>
-        <w:rPr>
-          <w:lang w:val="en-US"/>
-        </w:rPr>
-        <w:t>}</w:t>
-      </w:r>
-    </w:p>
-    <w:p>
-      <w:pPr>
-        <w:rPr>
-          <w:lang w:val="en-US"/>
-        </w:rPr>
-      </w:pPr>
-      <w:r>
-        <w:rPr>
-          <w:lang w:val="en-US"/>
-        </w:rPr>
-        <w:t>catch (...) {</w:t>
-      </w:r>
-    </w:p>
-    <w:p>
-      <w:pPr>
-        <w:rPr>
-          <w:lang w:val="en-US"/>
-        </w:rPr>
-      </w:pPr>
-      <w:r>
-        <w:rPr>
-          <w:lang w:val="en-US"/>
-        </w:rPr>
-        <w:t xml:space="preserve">   Trace(Severity::Warning, "Card close executed with error: " + </w:t>
-      </w:r>
-      <w:proofErr w:type="spellStart"/>
-      <w:r>
-        <w:rPr>
-          <w:lang w:val="en-US"/>
-        </w:rPr>
-        <w:t>ExceptionMess</w:t>
-      </w:r>
-      <w:proofErr w:type="spellEnd"/>
-      <w:r>
-        <w:rPr>
-          <w:lang w:val="en-US"/>
-        </w:rPr>
-        <w:t>());</w:t>
-      </w:r>
-    </w:p>
-    <w:p>
-      <w:pPr>
-        <w:rPr>
-          <w:lang w:val="en-US"/>
-        </w:rPr>
-      </w:pPr>
-      <w:r>
-        <w:rPr>
-          <w:lang w:val="en-US"/>
-        </w:rPr>
-        <w:t>}</w:t>
-      </w:r>
-    </w:p>
-    <w:p>
-      <w:pPr>
-        <w:rPr>
-          <w:lang w:val="en-US"/>
-        </w:rPr>
-      </w:pPr>
-    </w:p>
-    <w:p>
-      <w:pPr>
-        <w:rPr>
-          <w:i/>
-          <w:lang w:val="en-US"/>
-        </w:rPr>
-      </w:pPr>
-      <w:r>
-        <w:rPr>
-          <w:i/>
-          <w:lang w:val="en-US"/>
-        </w:rPr>
-        <w:t xml:space="preserve">void </w:t>
-      </w:r>
-      <w:proofErr w:type="spellStart"/>
-      <w:r>
-        <w:rPr>
-          <w:i/>
-          <w:lang w:val="en-US"/>
-        </w:rPr>
-        <w:t>CardClose</w:t>
-      </w:r>
-      <w:proofErr w:type="spellEnd"/>
-      <w:r>
-        <w:rPr>
-          <w:i/>
-          <w:lang w:val="en-US"/>
-        </w:rPr>
-        <w:t>()</w:t>
-      </w:r>
-    </w:p>
-    <w:p>
-      <w:pPr>
-        <w:rPr>
-          <w:lang w:val="en-US"/>
-        </w:rPr>
-      </w:pPr>
-      <w:r>
-        <w:rPr>
-          <w:lang w:val="en-US"/>
-        </w:rPr>
-        <w:t>str req = "where(){</w:t>
-      </w:r>
-      <w:proofErr w:type="spellStart"/>
-      <w:r>
-        <w:rPr>
-          <w:lang w:val="en-US"/>
-        </w:rPr>
-        <w:t>my_card.Off</w:t>
-      </w:r>
-      <w:proofErr w:type="spellEnd"/>
-      <w:r>
-        <w:rPr>
-          <w:lang w:val="en-US"/>
-        </w:rPr>
-        <w:t>();</w:t>
-      </w:r>
-      <w:proofErr w:type="spellStart"/>
-      <w:r>
-        <w:rPr>
-          <w:lang w:val="en-US"/>
-        </w:rPr>
-        <w:t>my_card.Close</w:t>
-      </w:r>
-      <w:proofErr w:type="spellEnd"/>
-      <w:r>
-        <w:rPr>
-          <w:lang w:val="en-US"/>
-        </w:rPr>
-        <w:t>();}\0";</w:t>
+      <w:proofErr w:type="gramStart"/>
+      <w:r>
+        <w:rPr>
+          <w:lang w:val="en-US"/>
+        </w:rPr>
+        <w:t>;}\</w:t>
+      </w:r>
+      <w:proofErr w:type="gramEnd"/>
+      <w:r>
+        <w:rPr>
+          <w:lang w:val="en-US"/>
+        </w:rPr>
+        <w:t>0";</w:t>
       </w:r>
     </w:p>
     <w:p>
@@ -29015,7 +29553,7 @@
     <w:sectPr>
       <w:pgSz w:w="11906" w:h="16838"/>
       <w:pgMar w:top="426" w:right="850" w:bottom="1134" w:left="1701" w:header="708" w:footer="708" w:gutter="0"/>
-      <w:pgNumType w:start="3"/>
+      <w:pgNumType w:start="7"/>
       <w:cols w:space="708"/>
       <w:titlePg/>
       <w:docGrid w:linePitch="381"/>

</xml_diff>

<commit_message>
Refactored bibliographical links to meet standarts. Minor refactoring in presentation.
</commit_message>
<xml_diff>
--- a/Shemyakin_AVb-21-12.docx
+++ b/Shemyakin_AVb-21-12.docx
@@ -6992,7 +6992,13 @@
         <w:t>Современный финансовый сектор, характеризующийся динамичным развитием и непрерывной гонкой за лидерство, требует от банков постоянного совершенствования операционной деятельности и оптимизации бизнес-процессов. В условиях жесткой конкуренции, где качество обслуживания и скорость предоставления услуг становятся ключевыми факторами успеха, банки стремятся минимизировать издержки, повысить производительность и, что самое главное, удовлетворить растущие потребности клиентов. Одним из важнейших элементов в цепочке оказания банковских услуг является процесс выпуска пластиковых карт, который включает в себя множество этапов, от разработки дизайна до персонализации и выдачи готового продукта клиенту</w:t>
       </w:r>
       <w:r>
-        <w:t xml:space="preserve"> [9]</w:t>
+        <w:t xml:space="preserve"> [</w:t>
+      </w:r>
+      <w:r>
+        <w:t>1</w:t>
+      </w:r>
+      <w:r>
+        <w:t>]</w:t>
       </w:r>
       <w:r>
         <w:t>.</w:t>
@@ -7834,7 +7840,13 @@
         <w:t>Данная разработка была вызвана большим расширением карточной клиентуры, так как американские банки расширялись в европе, китае и японии, где их кредитные карты стали очень популярными среди населения. Такой эмбоссер позже модифицировался после выпуска карт со встроенным чипом, а также под влиянием разработок в области техники и компьютеризации</w:t>
       </w:r>
       <w:r>
-        <w:t xml:space="preserve"> [1]</w:t>
+        <w:t xml:space="preserve"> [</w:t>
+      </w:r>
+      <w:r>
+        <w:t>2</w:t>
+      </w:r>
+      <w:r>
+        <w:t>]</w:t>
       </w:r>
       <w:r>
         <w:t>.</w:t>
@@ -8497,7 +8509,19 @@
         <w:t>Это можно объяснить несколькими причинами. Технология, меняющая что-то кардинально, требует отбрасывания существующих программных компонентов, созданных по другим технологиям. Поэтому она обязана предложить весь спектр инструментальных средств, либо как запасной вариант, предоставить инструменты поддержки других технологий, и то и другое требует больших усилий. С другой стороны ОО языки программирования создавались с учетом универсальности объектов и полного контроля над ними со стороны пользовательской программы. Даже если технология предполагает наличие некой виртуальной машины, назвать ее объектной можно только с большой натяжкой, на откуп ей в лучшем случае отдается сборка мусора. Тогда как наибольшие преимущества объектной машины сказываются при максимальном ее контроле над объектами. Попытки заменить текстовое представление алгоритма, в большинстве случаев, сводятся к генерации текста части программы на основе ее графического представления с последующей трансляцией, интересным же является полное исключение теста программы. Избавиться от перечисленных недостатков можно, отказавшись от архитектуры машины с потоком команд и линейной памятью, и перейдя к архитектуре с древовидной объектной памятью, с управлением объектами собственно объектной машиной</w:t>
       </w:r>
       <w:r>
-        <w:t xml:space="preserve"> [2,3]</w:t>
+        <w:t xml:space="preserve"> [</w:t>
+      </w:r>
+      <w:r>
+        <w:t>3</w:t>
+      </w:r>
+      <w:r>
+        <w:t>,</w:t>
+      </w:r>
+      <w:r>
+        <w:t>4</w:t>
+      </w:r>
+      <w:r>
+        <w:t>]</w:t>
       </w:r>
       <w:r>
         <w:t>.</w:t>
@@ -12729,7 +12753,13 @@
         <w:t xml:space="preserve"> </w:t>
       </w:r>
       <w:r>
-        <w:t>[5,7]</w:t>
+        <w:t>[5,</w:t>
+      </w:r>
+      <w:r>
+        <w:t>6</w:t>
+      </w:r>
+      <w:r>
+        <w:t>]</w:t>
       </w:r>
       <w:r>
         <w:t>. Все функциональные требования будут разбиты на категории, в соответствии с частями функционала драйвера, который они описывают.</w:t>
@@ -16476,7 +16506,13 @@
         <w:t>Без их определения велик риск получить негативный отзыв от клиентов, которые получат доработки, или же пропустить какой-либо важный компонент</w:t>
       </w:r>
       <w:r>
-        <w:t xml:space="preserve"> [6]</w:t>
+        <w:t xml:space="preserve"> [</w:t>
+      </w:r>
+      <w:r>
+        <w:t>7</w:t>
+      </w:r>
+      <w:r>
+        <w:t>]</w:t>
       </w:r>
       <w:r>
         <w:t>.</w:t>
@@ -17356,7 +17392,13 @@
         <w:t>Driver</w:t>
       </w:r>
       <w:r>
-        <w:t xml:space="preserve"> [4]</w:t>
+        <w:t xml:space="preserve"> [</w:t>
+      </w:r>
+      <w:r>
+        <w:t>8</w:t>
+      </w:r>
+      <w:r>
+        <w:t>]</w:t>
       </w:r>
       <w:r>
         <w:t xml:space="preserve">. </w:t>
@@ -18017,7 +18059,13 @@
         <w:t>В рамках разработки программных систем, взаимодействующих с аппаратными ресурсами, драйверы выполняют критическую роль посредника между операционной системой и физическими/виртуальными устройствами. Эффективность, надежность и безопасность драйвера напрямую зависят от его архитектурных решений, что обуславливает необходимость разработки надлежащей по требованиям архитектуры</w:t>
       </w:r>
       <w:r>
-        <w:t xml:space="preserve"> [8]</w:t>
+        <w:t xml:space="preserve"> [</w:t>
+      </w:r>
+      <w:r>
+        <w:t>9</w:t>
+      </w:r>
+      <w:r>
+        <w:t>]</w:t>
       </w:r>
       <w:r>
         <w:t xml:space="preserve">. В данном </w:t>
@@ -26211,64 +26259,6 @@
         <w:t>использованных источников</w:t>
       </w:r>
       <w:bookmarkEnd w:id="47"/>
-    </w:p>
-    <w:p>
-      <w:pPr>
-        <w:pStyle w:val="ListParagraph"/>
-        <w:numPr>
-          <w:ilvl w:val="0"/>
-          <w:numId w:val="43"/>
-        </w:numPr>
-        <w:ind w:left="0" w:firstLine="0"/>
-      </w:pPr>
-      <w:r>
-        <w:t>Платежные карты. Энциклопедия 1870–2006 / Павел Юржик; Пер. с чешск. — М.: Альпина Бизнес Букс, 2007. — 304 с.</w:t>
-      </w:r>
-      <w:r>
-        <w:t xml:space="preserve"> — </w:t>
-      </w:r>
-      <w:r>
-        <w:t>ISBN 5-9614-0436-6</w:t>
-      </w:r>
-    </w:p>
-    <w:p>
-      <w:pPr>
-        <w:pStyle w:val="ListParagraph"/>
-        <w:numPr>
-          <w:ilvl w:val="0"/>
-          <w:numId w:val="43"/>
-        </w:numPr>
-        <w:ind w:left="0" w:firstLine="0"/>
-      </w:pPr>
-      <w:r>
-        <w:t>Объектно-ориентированный анализ и проектирование с примерами приложений на C++ / Гради Буч; Пер. с англ. под ред. И. Романовского и Ф. Андреева. - 2-е изд. - Москва : Binom ; СПб. : Нев. диалект, 1998. - 558 с. : ил., табл.; 24 см.; ISBN 5-7989-0067-3</w:t>
-      </w:r>
-    </w:p>
-    <w:p>
-      <w:pPr>
-        <w:pStyle w:val="ListParagraph"/>
-        <w:numPr>
-          <w:ilvl w:val="0"/>
-          <w:numId w:val="43"/>
-        </w:numPr>
-        <w:ind w:left="0" w:firstLine="0"/>
-      </w:pPr>
-      <w:r>
-        <w:t>Унгер, А. Ю. Объектно-ориентированное программирование : учебник / А. Ю. Унгер. — Москва : РТУ МИРЭА, 2023. — ISBN 978-5-7339-2051-1.</w:t>
-      </w:r>
-    </w:p>
-    <w:p>
-      <w:pPr>
-        <w:pStyle w:val="ListParagraph"/>
-        <w:numPr>
-          <w:ilvl w:val="0"/>
-          <w:numId w:val="43"/>
-        </w:numPr>
-        <w:ind w:left="0" w:firstLine="0"/>
-      </w:pPr>
-      <w:r>
-        <w:t>Стаяно, Ф. Figma проектирование и прототипирование интерфейсов : руководство / Ф. Стаяно ; перевод с английского В. С. Яценкова. — Москва : ДМК Пресс, 2024. — 370 с. — ISBN 978-5-93700-302-7.</w:t>
-      </w:r>
     </w:p>
     <w:p>
       <w:pPr>
@@ -26281,10 +26271,52 @@
         <w:jc w:val="left"/>
       </w:pPr>
       <w:r>
-        <w:t>Остроух, А. В. Проектирование информационных систем : монография / А. В. Остроух, Н. Е. Суркова. — 2-е изд., стер. — Санкт-Петербург : Лань, 2021. — ISBN 978-5-8114-8377-8</w:t>
-      </w:r>
-      <w:r>
-        <w:t>.</w:t>
+        <w:t>Малышенко, Ю. В. Платежные карты, электронные платежные системы и их использование в торговле и таможенном деле : учебное пособие / Ю. В. Малышенко. — Санкт-Петербург : Интермедия, 2017. — 228 с. — ISBN 978-5-4383-0110-3.</w:t>
+      </w:r>
+    </w:p>
+    <w:p>
+      <w:pPr>
+        <w:pStyle w:val="ListParagraph"/>
+        <w:numPr>
+          <w:ilvl w:val="0"/>
+          <w:numId w:val="43"/>
+        </w:numPr>
+        <w:ind w:left="0" w:firstLine="0"/>
+      </w:pPr>
+      <w:r>
+        <w:t>Платежные карты. Энциклопедия 1870–2006 / Павел Юржик; Пер. с чешск. — М.: Альпина Бизнес Букс, 2007. — 304 с.</w:t>
+      </w:r>
+      <w:r>
+        <w:t xml:space="preserve"> — </w:t>
+      </w:r>
+      <w:r>
+        <w:t>ISBN 5-9614-0436-6</w:t>
+      </w:r>
+    </w:p>
+    <w:p>
+      <w:pPr>
+        <w:pStyle w:val="ListParagraph"/>
+        <w:numPr>
+          <w:ilvl w:val="0"/>
+          <w:numId w:val="43"/>
+        </w:numPr>
+        <w:ind w:left="0" w:firstLine="0"/>
+      </w:pPr>
+      <w:r>
+        <w:t>Объектно-ориентированный анализ и проектирование с примерами приложений на C++ / Гради Буч; Пер. с англ. под ред. И. Романовского и Ф. Андреева. - 2-е изд. - Москва : Binom ; СПб. : Нев. диалект, 1998. - 558 с. : ил., табл.; 24 см.; ISBN 5-7989-0067-3</w:t>
+      </w:r>
+    </w:p>
+    <w:p>
+      <w:pPr>
+        <w:pStyle w:val="ListParagraph"/>
+        <w:numPr>
+          <w:ilvl w:val="0"/>
+          <w:numId w:val="43"/>
+        </w:numPr>
+        <w:ind w:left="0" w:firstLine="0"/>
+      </w:pPr>
+      <w:r>
+        <w:t>Унгер, А. Ю. Объектно-ориентированное программирование : учебник / А. Ю. Унгер. — Москва : РТУ МИРЭА, 2023. — ISBN 978-5-7339-2051-1.</w:t>
       </w:r>
     </w:p>
     <w:p>
@@ -26298,7 +26330,10 @@
         <w:jc w:val="left"/>
       </w:pPr>
       <w:r>
-        <w:t>Компаниец, В. С. Проектирование и юзабилити-исследование пользовательских интерфейсов : учебное пособие / В. С. Компаниец. — Ростов-на-Дону : ЮФУ, 2020. — 107 с. — ISBN 978-5-9275-3637-5.</w:t>
+        <w:t>Остроух, А. В. Проектирование информационных систем : монография / А. В. Остроух, Н. Е. Суркова. — 2-е изд., стер. — Санкт-Петербург : Лань, 2021. — ISBN 978-5-8114-8377-8</w:t>
+      </w:r>
+      <w:r>
+        <w:t>.</w:t>
       </w:r>
     </w:p>
     <w:p>
@@ -26326,7 +26361,20 @@
         <w:jc w:val="left"/>
       </w:pPr>
       <w:r>
-        <w:t>Туманова, М. Б. Проектирование программных систем : учебное пособие / М. Б. Туманова, Е. К. Михайлова, Е. А. Муравьева. — Москва : РТУ МИРЭА, 2023. — ISBN 978-5-7339-2050-4.</w:t>
+        <w:t>Компаниец, В. С. Проектирование и юзабилити-исследование пользовательских интерфейсов : учебное пособие / В. С. Компаниец. — Ростов-на-Дону : ЮФУ, 2020. — 107 с. — ISBN 978-5-9275-3637-5.</w:t>
+      </w:r>
+    </w:p>
+    <w:p>
+      <w:pPr>
+        <w:pStyle w:val="ListParagraph"/>
+        <w:numPr>
+          <w:ilvl w:val="0"/>
+          <w:numId w:val="43"/>
+        </w:numPr>
+        <w:ind w:left="0" w:firstLine="0"/>
+      </w:pPr>
+      <w:r>
+        <w:t>Стаяно, Ф. Figma проектирование и прототипирование интерфейсов : руководство / Ф. Стаяно ; перевод с английского В. С. Яценкова. — Москва : ДМК Пресс, 2024. — 370 с. — ISBN 978-5-93700-302-7.</w:t>
       </w:r>
     </w:p>
     <w:p>
@@ -26340,7 +26388,7 @@
         <w:jc w:val="left"/>
       </w:pPr>
       <w:r>
-        <w:t>Малышенко, Ю. В. Платежные карты, электронные платежные системы и их использование в торговле и таможенном деле : учебное пособие / Ю. В. Малышенко. — Санкт-Петербург : Интермедия, 2017. — 228 с. — ISBN 978-5-4383-0110-3.</w:t>
+        <w:t>Туманова, М. Б. Проектирование программных систем : учебное пособие / М. Б. Туманова, Е. К. Михайлова, Е. А. Муравьева. — Москва : РТУ МИРЭА, 2023. — ISBN 978-5-7339-2050-4.</w:t>
       </w:r>
     </w:p>
     <w:p>

</xml_diff>